<commit_message>
aggiunta funzionalità Bootstrap da implementare per una migliore visualizzazione della mia webapp
</commit_message>
<xml_diff>
--- a/INTERFACCIA UTENTE.docx
+++ b/INTERFACCIA UTENTE.docx
@@ -4,8 +4,9 @@
   <w:body>
     <w:p>
       <w:pPr>
-        <w:rPr>
-          <w:rFonts w:eastAsia="Times New Roman" w:cs="Times New Roman"/>
+        <w:spacing w:line="256" w:lineRule="auto"/>
+        <w:rPr>
+          <w:rFonts w:ascii="Aptos" w:eastAsia="Times New Roman" w:hAnsi="Aptos" w:cs="Times New Roman"/>
           <w:b/>
           <w:bCs/>
           <w:color w:val="FF0000"/>
@@ -16,7 +17,7 @@
       </w:pPr>
       <w:r>
         <w:rPr>
-          <w:rFonts w:eastAsia="Times New Roman" w:cs="Times New Roman"/>
+          <w:rFonts w:ascii="Aptos" w:eastAsia="Times New Roman" w:hAnsi="Aptos" w:cs="Times New Roman"/>
           <w:b/>
           <w:bCs/>
           <w:color w:val="FF0000"/>
@@ -29,8 +30,9 @@
     </w:p>
     <w:p>
       <w:pPr>
-        <w:rPr>
-          <w:rFonts w:eastAsia="Times New Roman" w:cs="Times New Roman"/>
+        <w:spacing w:line="256" w:lineRule="auto"/>
+        <w:rPr>
+          <w:rFonts w:ascii="Aptos" w:eastAsia="Times New Roman" w:hAnsi="Aptos" w:cs="Times New Roman"/>
           <w:b/>
           <w:bCs/>
           <w:lang w:eastAsia="it-IT"/>
@@ -38,68 +40,52 @@
       </w:pPr>
       <w:r>
         <w:rPr>
-          <w:rFonts w:eastAsia="Times New Roman" w:cs="Times New Roman"/>
+          <w:rFonts w:ascii="Aptos" w:eastAsia="Times New Roman" w:hAnsi="Aptos" w:cs="Times New Roman"/>
           <w:b/>
           <w:bCs/>
           <w:lang w:eastAsia="it-IT"/>
         </w:rPr>
-        <w:t>Accesso</w:t>
-      </w:r>
-      <w:r>
-        <w:rPr>
-          <w:rFonts w:eastAsia="Times New Roman" w:cs="Times New Roman"/>
-          <w:b/>
-          <w:bCs/>
-          <w:lang w:eastAsia="it-IT"/>
-        </w:rPr>
-        <w:t xml:space="preserve"> all’App</w:t>
+        <w:t>Accesso all’App</w:t>
       </w:r>
     </w:p>
     <w:p>
       <w:pPr>
-        <w:pStyle w:val="Paragrafoelenco"/>
         <w:numPr>
           <w:ilvl w:val="0"/>
-          <w:numId w:val="1"/>
+          <w:numId w:val="12"/>
         </w:numPr>
         <w:spacing w:before="100" w:beforeAutospacing="1" w:after="100" w:afterAutospacing="1" w:line="240" w:lineRule="auto"/>
-        <w:rPr>
-          <w:rFonts w:eastAsia="Times New Roman" w:cs="Times New Roman"/>
-          <w:lang w:eastAsia="it-IT"/>
-        </w:rPr>
-      </w:pPr>
-      <w:r>
-        <w:rPr>
-          <w:rFonts w:eastAsia="Times New Roman" w:cs="Times New Roman"/>
-          <w:lang w:eastAsia="it-IT"/>
-        </w:rPr>
-        <w:t>Registrazione all’app con nome utente e password come primo accesso</w:t>
-      </w:r>
-      <w:r>
-        <w:rPr>
-          <w:rFonts w:eastAsia="Times New Roman" w:cs="Times New Roman"/>
-          <w:lang w:eastAsia="it-IT"/>
-        </w:rPr>
-        <w:t xml:space="preserve"> e assegnazione di un bonus punti di benvenuto</w:t>
+        <w:contextualSpacing/>
+        <w:rPr>
+          <w:rFonts w:ascii="Aptos" w:eastAsia="Times New Roman" w:hAnsi="Aptos" w:cs="Times New Roman"/>
+          <w:lang w:eastAsia="it-IT"/>
+        </w:rPr>
+      </w:pPr>
+      <w:r>
+        <w:rPr>
+          <w:rFonts w:ascii="Aptos" w:eastAsia="Times New Roman" w:hAnsi="Aptos" w:cs="Times New Roman"/>
+          <w:lang w:eastAsia="it-IT"/>
+        </w:rPr>
+        <w:t>Registrazione all’app con indirizzo email e password come primo accesso (tramite form), scelta del nome utente e assegnazione di un bonus punti di benvenuto</w:t>
       </w:r>
     </w:p>
     <w:p>
       <w:pPr>
-        <w:pStyle w:val="Paragrafoelenco"/>
         <w:numPr>
           <w:ilvl w:val="0"/>
-          <w:numId w:val="1"/>
+          <w:numId w:val="12"/>
         </w:numPr>
         <w:spacing w:before="100" w:beforeAutospacing="1" w:after="100" w:afterAutospacing="1" w:line="240" w:lineRule="auto"/>
-        <w:rPr>
-          <w:rFonts w:eastAsia="Times New Roman" w:cs="Times New Roman"/>
+        <w:contextualSpacing/>
+        <w:rPr>
+          <w:rFonts w:ascii="Aptos" w:eastAsia="Times New Roman" w:hAnsi="Aptos" w:cs="Times New Roman"/>
           <w:u w:val="single"/>
           <w:lang w:eastAsia="it-IT"/>
         </w:rPr>
       </w:pPr>
       <w:r>
         <w:rPr>
-          <w:rFonts w:eastAsia="Times New Roman" w:cs="Times New Roman"/>
+          <w:rFonts w:ascii="Aptos" w:eastAsia="Times New Roman" w:hAnsi="Aptos" w:cs="Times New Roman"/>
           <w:lang w:eastAsia="it-IT"/>
         </w:rPr>
         <w:t>Saluto all’utente (es. Ciao Simone !</w:t>
@@ -107,7 +93,9 @@
       <w:r>
         <w:rPr>
           <mc:AlternateContent>
-            <mc:Choice Requires="w16se"/>
+            <mc:Choice Requires="w16se">
+              <w:rFonts w:ascii="Aptos" w:eastAsia="Aptos" w:hAnsi="Aptos" w:cs="Times New Roman"/>
+            </mc:Choice>
             <mc:Fallback>
               <w:rFonts w:ascii="Segoe UI Emoji" w:eastAsia="Segoe UI Emoji" w:hAnsi="Segoe UI Emoji" w:cs="Segoe UI Emoji"/>
             </mc:Fallback>
@@ -125,45 +113,17 @@
       </w:r>
       <w:r>
         <w:rPr>
-          <w:lang w:eastAsia="it-IT"/>
-        </w:rPr>
-        <w:t>)</w:t>
-      </w:r>
-      <w:r>
-        <w:rPr>
-          <w:lang w:eastAsia="it-IT"/>
-        </w:rPr>
-        <w:t xml:space="preserve"> </w:t>
-      </w:r>
-      <w:r>
-        <w:rPr>
-          <w:lang w:eastAsia="it-IT"/>
-        </w:rPr>
-        <w:t>al caricamento</w:t>
-      </w:r>
-      <w:r>
-        <w:rPr>
-          <w:lang w:eastAsia="it-IT"/>
-        </w:rPr>
-        <w:t xml:space="preserve"> la pagina</w:t>
-      </w:r>
-      <w:r>
-        <w:rPr>
-          <w:lang w:eastAsia="it-IT"/>
-        </w:rPr>
-        <w:t xml:space="preserve"> (inserisco rotellina che gira da Bootstrap)</w:t>
-      </w:r>
-      <w:r>
-        <w:rPr>
-          <w:lang w:eastAsia="it-IT"/>
-        </w:rPr>
-        <w:t>, quindi ogni volta che si entra nell’app</w:t>
+          <w:rFonts w:ascii="Aptos" w:eastAsia="Aptos" w:hAnsi="Aptos" w:cs="Times New Roman"/>
+          <w:lang w:eastAsia="it-IT"/>
+        </w:rPr>
+        <w:t>) al caricamento la pagina (inserisco rotellina che gira da Bootstrap), quindi ogni volta che si entra nell’app</w:t>
       </w:r>
     </w:p>
     <w:p>
       <w:pPr>
-        <w:rPr>
-          <w:rFonts w:eastAsia="Times New Roman" w:cs="Times New Roman"/>
+        <w:spacing w:line="256" w:lineRule="auto"/>
+        <w:rPr>
+          <w:rFonts w:ascii="Aptos" w:eastAsia="Times New Roman" w:hAnsi="Aptos" w:cs="Times New Roman"/>
           <w:b/>
           <w:bCs/>
           <w:lang w:eastAsia="it-IT"/>
@@ -171,846 +131,691 @@
       </w:pPr>
       <w:r>
         <w:rPr>
-          <w:rFonts w:eastAsia="Times New Roman" w:cs="Times New Roman"/>
+          <w:rFonts w:ascii="Aptos" w:eastAsia="Times New Roman" w:hAnsi="Aptos" w:cs="Times New Roman"/>
           <w:b/>
           <w:bCs/>
           <w:lang w:eastAsia="it-IT"/>
         </w:rPr>
-        <w:t xml:space="preserve">Stile e </w:t>
-      </w:r>
-      <w:r>
-        <w:rPr>
-          <w:rFonts w:eastAsia="Times New Roman" w:cs="Times New Roman"/>
+        <w:t>Stile e Design</w:t>
+      </w:r>
+    </w:p>
+    <w:p>
+      <w:pPr>
+        <w:numPr>
+          <w:ilvl w:val="0"/>
+          <w:numId w:val="12"/>
+        </w:numPr>
+        <w:spacing w:before="100" w:beforeAutospacing="1" w:after="100" w:afterAutospacing="1" w:line="240" w:lineRule="auto"/>
+        <w:contextualSpacing/>
+        <w:rPr>
+          <w:rFonts w:ascii="Aptos" w:eastAsia="Times New Roman" w:hAnsi="Aptos" w:cs="Times New Roman"/>
+          <w:lang w:eastAsia="it-IT"/>
+        </w:rPr>
+      </w:pPr>
+      <w:r>
+        <w:rPr>
+          <w:rFonts w:ascii="Aptos" w:eastAsia="Times New Roman" w:hAnsi="Aptos" w:cs="Times New Roman"/>
+          <w:lang w:eastAsia="it-IT"/>
+        </w:rPr>
+        <w:t>Icone e emoji per rendere l’esperienza più coinvolgente</w:t>
+      </w:r>
+    </w:p>
+    <w:p>
+      <w:pPr>
+        <w:numPr>
+          <w:ilvl w:val="0"/>
+          <w:numId w:val="12"/>
+        </w:numPr>
+        <w:spacing w:before="100" w:beforeAutospacing="1" w:after="100" w:afterAutospacing="1" w:line="240" w:lineRule="auto"/>
+        <w:contextualSpacing/>
+        <w:rPr>
+          <w:rFonts w:ascii="Aptos" w:eastAsia="Times New Roman" w:hAnsi="Aptos" w:cs="Times New Roman"/>
+          <w:lang w:eastAsia="it-IT"/>
+        </w:rPr>
+      </w:pPr>
+      <w:r>
+        <w:rPr>
+          <w:rFonts w:ascii="Aptos" w:eastAsia="Times New Roman" w:hAnsi="Aptos" w:cs="Times New Roman"/>
+          <w:lang w:eastAsia="it-IT"/>
+        </w:rPr>
+        <w:t>Colori chiari e motivanti, come sfondo azzurro chiaro o giallo in stile “Note”</w:t>
+      </w:r>
+    </w:p>
+    <w:p>
+      <w:pPr>
+        <w:numPr>
+          <w:ilvl w:val="0"/>
+          <w:numId w:val="12"/>
+        </w:numPr>
+        <w:spacing w:line="256" w:lineRule="auto"/>
+        <w:rPr>
+          <w:rFonts w:ascii="Aptos" w:eastAsia="Times New Roman" w:hAnsi="Aptos" w:cs="Times New Roman"/>
           <w:b/>
           <w:bCs/>
           <w:lang w:eastAsia="it-IT"/>
         </w:rPr>
-        <w:t>D</w:t>
-      </w:r>
-      <w:r>
-        <w:rPr>
-          <w:rFonts w:eastAsia="Times New Roman" w:cs="Times New Roman"/>
+      </w:pPr>
+      <w:r>
+        <w:rPr>
+          <w:rFonts w:ascii="Aptos" w:eastAsia="Times New Roman" w:hAnsi="Aptos" w:cs="Times New Roman"/>
+          <w:lang w:eastAsia="it-IT"/>
+        </w:rPr>
+        <w:t>Uso di barre di avanzamento per dare un senso di progresso</w:t>
+      </w:r>
+    </w:p>
+    <w:p>
+      <w:pPr>
+        <w:spacing w:before="100" w:beforeAutospacing="1" w:after="100" w:afterAutospacing="1" w:line="240" w:lineRule="auto"/>
+        <w:rPr>
+          <w:rFonts w:ascii="Aptos" w:eastAsia="Times New Roman" w:hAnsi="Aptos" w:cs="Times New Roman"/>
           <w:b/>
           <w:bCs/>
           <w:lang w:eastAsia="it-IT"/>
         </w:rPr>
-        <w:t>esign</w:t>
+      </w:pPr>
+      <w:r>
+        <w:rPr>
+          <w:rFonts w:ascii="Aptos" w:eastAsia="Times New Roman" w:hAnsi="Aptos" w:cs="Times New Roman"/>
+          <w:b/>
+          <w:bCs/>
+          <w:lang w:eastAsia="it-IT"/>
+        </w:rPr>
+        <w:t>Elementi Estetici</w:t>
       </w:r>
     </w:p>
     <w:p>
       <w:pPr>
-        <w:pStyle w:val="Paragrafoelenco"/>
         <w:numPr>
           <w:ilvl w:val="0"/>
-          <w:numId w:val="1"/>
+          <w:numId w:val="12"/>
+        </w:numPr>
+        <w:spacing w:line="256" w:lineRule="auto"/>
+        <w:rPr>
+          <w:rFonts w:ascii="Aptos" w:eastAsia="Times New Roman" w:hAnsi="Aptos" w:cs="Times New Roman"/>
+          <w:lang w:eastAsia="it-IT"/>
+        </w:rPr>
+      </w:pPr>
+      <w:r>
+        <w:rPr>
+          <w:rFonts w:ascii="Aptos" w:eastAsia="Times New Roman" w:hAnsi="Aptos" w:cs="Times New Roman"/>
+          <w:lang w:eastAsia="it-IT"/>
+        </w:rPr>
+        <w:t xml:space="preserve">In alto al centro titolo dell’app Family Hub </w:t>
+      </w:r>
+    </w:p>
+    <w:p>
+      <w:pPr>
+        <w:numPr>
+          <w:ilvl w:val="0"/>
+          <w:numId w:val="12"/>
+        </w:numPr>
+        <w:spacing w:line="256" w:lineRule="auto"/>
+        <w:rPr>
+          <w:rFonts w:ascii="Aptos" w:eastAsia="Times New Roman" w:hAnsi="Aptos" w:cs="Times New Roman"/>
+          <w:lang w:eastAsia="it-IT"/>
+        </w:rPr>
+      </w:pPr>
+      <w:r>
+        <w:rPr>
+          <w:rFonts w:ascii="Aptos" w:eastAsia="Times New Roman" w:hAnsi="Aptos" w:cs="Times New Roman"/>
+          <w:lang w:eastAsia="it-IT"/>
+        </w:rPr>
+        <w:t>In alto a destra icona utente rotonda con all’interno lettera iniziale dell’utente, al di sotto punti accumulati e nome dell’utente</w:t>
+      </w:r>
+    </w:p>
+    <w:p>
+      <w:pPr>
+        <w:numPr>
+          <w:ilvl w:val="0"/>
+          <w:numId w:val="12"/>
+        </w:numPr>
+        <w:spacing w:line="256" w:lineRule="auto"/>
+        <w:rPr>
+          <w:rFonts w:ascii="Aptos" w:eastAsia="Times New Roman" w:hAnsi="Aptos" w:cs="Times New Roman"/>
+          <w:lang w:eastAsia="it-IT"/>
+        </w:rPr>
+      </w:pPr>
+      <w:r>
+        <w:rPr>
+          <w:rFonts w:ascii="Aptos" w:eastAsia="Times New Roman" w:hAnsi="Aptos" w:cs="Times New Roman"/>
+          <w:lang w:eastAsia="it-IT"/>
+        </w:rPr>
+        <w:t>Icona impostazioni con opzione “Modifica nome utente” e “logout” (OPZIONALE)</w:t>
+      </w:r>
+    </w:p>
+    <w:p>
+      <w:pPr>
+        <w:spacing w:line="256" w:lineRule="auto"/>
+        <w:rPr>
+          <w:rFonts w:ascii="Aptos" w:eastAsia="Times New Roman" w:hAnsi="Aptos" w:cs="Times New Roman"/>
+          <w:b/>
+          <w:bCs/>
+          <w:lang w:eastAsia="it-IT"/>
+        </w:rPr>
+      </w:pPr>
+      <w:r>
+        <w:rPr>
+          <w:rFonts w:ascii="Aptos" w:eastAsia="Times New Roman" w:hAnsi="Aptos" w:cs="Times New Roman"/>
+          <w:b/>
+          <w:bCs/>
+          <w:lang w:eastAsia="it-IT"/>
+        </w:rPr>
+        <w:t>Sezione Classifica</w:t>
+      </w:r>
+    </w:p>
+    <w:p>
+      <w:pPr>
+        <w:numPr>
+          <w:ilvl w:val="0"/>
+          <w:numId w:val="13"/>
+        </w:numPr>
+        <w:spacing w:line="256" w:lineRule="auto"/>
+        <w:rPr>
+          <w:rFonts w:ascii="Aptos" w:eastAsia="Aptos" w:hAnsi="Aptos" w:cs="Times New Roman"/>
+        </w:rPr>
+      </w:pPr>
+      <w:r>
+        <w:rPr>
+          <w:rFonts w:ascii="Aptos" w:eastAsia="Times New Roman" w:hAnsi="Aptos" w:cs="Times New Roman"/>
+          <w:lang w:eastAsia="it-IT"/>
+        </w:rPr>
+        <w:t>A sinistra della schermata principale, una tabella con la classifica degli utenti in base al totale di punti accumulati</w:t>
+      </w:r>
+    </w:p>
+    <w:p>
+      <w:pPr>
+        <w:spacing w:line="256" w:lineRule="auto"/>
+        <w:rPr>
+          <w:rFonts w:ascii="Aptos" w:eastAsia="Times New Roman" w:hAnsi="Aptos" w:cs="Times New Roman"/>
+          <w:b/>
+          <w:bCs/>
+          <w:lang w:eastAsia="it-IT"/>
+        </w:rPr>
+      </w:pPr>
+      <w:r>
+        <w:rPr>
+          <w:rFonts w:ascii="Aptos" w:eastAsia="Times New Roman" w:hAnsi="Aptos" w:cs="Times New Roman"/>
+          <w:b/>
+          <w:bCs/>
+          <w:lang w:eastAsia="it-IT"/>
+        </w:rPr>
+        <w:t>Sezione Premi</w:t>
+      </w:r>
+    </w:p>
+    <w:p>
+      <w:pPr>
+        <w:spacing w:line="256" w:lineRule="auto"/>
+        <w:rPr>
+          <w:rFonts w:ascii="Aptos" w:eastAsia="Times New Roman" w:hAnsi="Aptos" w:cs="Times New Roman"/>
+          <w:lang w:eastAsia="it-IT"/>
+        </w:rPr>
+      </w:pPr>
+      <w:r>
+        <w:rPr>
+          <w:rFonts w:ascii="Aptos" w:eastAsia="Times New Roman" w:hAnsi="Aptos" w:cs="Times New Roman"/>
+          <w:lang w:eastAsia="it-IT"/>
+        </w:rPr>
+        <w:t>Situata al centro-sinistra dello schermo, se cliccata si suddivide in due liste:</w:t>
+      </w:r>
+    </w:p>
+    <w:p>
+      <w:pPr>
+        <w:numPr>
+          <w:ilvl w:val="1"/>
+          <w:numId w:val="14"/>
+        </w:numPr>
+        <w:spacing w:line="256" w:lineRule="auto"/>
+        <w:rPr>
+          <w:rFonts w:ascii="Aptos" w:eastAsia="Times New Roman" w:hAnsi="Aptos" w:cs="Times New Roman"/>
+          <w:lang w:eastAsia="it-IT"/>
+        </w:rPr>
+      </w:pPr>
+      <w:r>
+        <w:rPr>
+          <w:rFonts w:ascii="Aptos" w:eastAsia="Times New Roman" w:hAnsi="Aptos" w:cs="Times New Roman"/>
+          <w:lang w:eastAsia="it-IT"/>
+        </w:rPr>
+        <w:t>Premi già riscossi, con nome premio e data di riscossione</w:t>
+      </w:r>
+    </w:p>
+    <w:p>
+      <w:pPr>
+        <w:numPr>
+          <w:ilvl w:val="1"/>
+          <w:numId w:val="14"/>
+        </w:numPr>
+        <w:spacing w:line="256" w:lineRule="auto"/>
+        <w:rPr>
+          <w:rFonts w:ascii="Aptos" w:eastAsia="Times New Roman" w:hAnsi="Aptos" w:cs="Times New Roman"/>
+          <w:lang w:eastAsia="it-IT"/>
+        </w:rPr>
+      </w:pPr>
+      <w:r>
+        <w:rPr>
+          <w:rFonts w:ascii="Aptos" w:eastAsia="Times New Roman" w:hAnsi="Aptos" w:cs="Times New Roman"/>
+          <w:lang w:eastAsia="it-IT"/>
+        </w:rPr>
+        <w:t>Premi disponibili (con nome premio e pulsante “Riscatta”, attivo solo se l’utente ha abbastanza punti)</w:t>
+      </w:r>
+    </w:p>
+    <w:p>
+      <w:pPr>
+        <w:spacing w:before="100" w:beforeAutospacing="1" w:after="100" w:afterAutospacing="1" w:line="240" w:lineRule="auto"/>
+        <w:rPr>
+          <w:rFonts w:ascii="Aptos" w:eastAsia="Times New Roman" w:hAnsi="Aptos" w:cs="Times New Roman"/>
+          <w:b/>
+          <w:bCs/>
+          <w:lang w:eastAsia="it-IT"/>
+        </w:rPr>
+      </w:pPr>
+      <w:r>
+        <w:rPr>
+          <w:rFonts w:ascii="Aptos" w:eastAsia="Times New Roman" w:hAnsi="Aptos" w:cs="Times New Roman"/>
+          <w:lang w:eastAsia="it-IT"/>
+        </w:rPr>
+        <w:t>Progress bar che mostra quanti punti mancano al prossimo premio (opzionale, per motivare gli utenti)</w:t>
+      </w:r>
+    </w:p>
+    <w:p>
+      <w:pPr>
+        <w:spacing w:before="100" w:beforeAutospacing="1" w:after="100" w:afterAutospacing="1" w:line="240" w:lineRule="auto"/>
+        <w:rPr>
+          <w:rFonts w:ascii="Aptos" w:eastAsia="Times New Roman" w:hAnsi="Aptos" w:cs="Times New Roman"/>
+          <w:b/>
+          <w:bCs/>
+          <w:lang w:eastAsia="it-IT"/>
+        </w:rPr>
+      </w:pPr>
+      <w:r>
+        <w:rPr>
+          <w:rFonts w:ascii="Aptos" w:eastAsia="Times New Roman" w:hAnsi="Aptos" w:cs="Times New Roman"/>
+          <w:b/>
+          <w:bCs/>
+          <w:lang w:eastAsia="it-IT"/>
+        </w:rPr>
+        <w:t>Sezione Obiettivi</w:t>
+      </w:r>
+    </w:p>
+    <w:p>
+      <w:pPr>
+        <w:spacing w:line="256" w:lineRule="auto"/>
+        <w:rPr>
+          <w:rFonts w:ascii="Aptos" w:eastAsia="Times New Roman" w:hAnsi="Aptos" w:cs="Times New Roman"/>
+          <w:lang w:eastAsia="it-IT"/>
+        </w:rPr>
+      </w:pPr>
+      <w:r>
+        <w:rPr>
+          <w:rFonts w:ascii="Aptos" w:eastAsia="Times New Roman" w:hAnsi="Aptos" w:cs="Times New Roman"/>
+          <w:lang w:eastAsia="it-IT"/>
+        </w:rPr>
+        <w:t xml:space="preserve">Gli obiettivi sono suddivisi prima per frequenza (settimanali/mensili/annuali/occasionali), poi ogni tabella (ad es. obiettivi settimanali) sarà distinta in due liste (potrei anche inserire in modo OPZIONALE una terza lista </w:t>
+      </w:r>
+      <w:r>
+        <w:rPr>
+          <w:rFonts w:ascii="Aptos" w:eastAsia="Times New Roman" w:hAnsi="Aptos" w:cs="Times New Roman"/>
+          <w:b/>
+          <w:bCs/>
+          <w:lang w:eastAsia="it-IT"/>
+        </w:rPr>
+        <w:t>Tutto</w:t>
+      </w:r>
+      <w:r>
+        <w:rPr>
+          <w:rFonts w:ascii="Aptos" w:eastAsia="Times New Roman" w:hAnsi="Aptos" w:cs="Times New Roman"/>
+          <w:lang w:eastAsia="it-IT"/>
+        </w:rPr>
+        <w:t xml:space="preserve"> in cui l’utente visualizza tutti gli obiettivi della settimana/mese/anno…, senza distinzioni tra attività e sfide) :</w:t>
+      </w:r>
+    </w:p>
+    <w:p>
+      <w:pPr>
+        <w:numPr>
+          <w:ilvl w:val="1"/>
+          <w:numId w:val="15"/>
+        </w:numPr>
+        <w:spacing w:line="256" w:lineRule="auto"/>
+        <w:rPr>
+          <w:rFonts w:ascii="Aptos" w:eastAsia="Times New Roman" w:hAnsi="Aptos" w:cs="Times New Roman"/>
+          <w:lang w:eastAsia="it-IT"/>
+        </w:rPr>
+      </w:pPr>
+      <w:r>
+        <w:rPr>
+          <w:rFonts w:ascii="Aptos" w:eastAsia="Times New Roman" w:hAnsi="Aptos" w:cs="Times New Roman"/>
+          <w:b/>
+          <w:bCs/>
+          <w:lang w:eastAsia="it-IT"/>
+        </w:rPr>
+        <w:t>Attività</w:t>
+      </w:r>
+      <w:r>
+        <w:rPr>
+          <w:rFonts w:ascii="Aptos" w:eastAsia="Times New Roman" w:hAnsi="Aptos" w:cs="Times New Roman"/>
+          <w:lang w:eastAsia="it-IT"/>
+        </w:rPr>
+        <w:t xml:space="preserve"> (da completare/completate)</w:t>
+      </w:r>
+    </w:p>
+    <w:p>
+      <w:pPr>
+        <w:numPr>
+          <w:ilvl w:val="1"/>
+          <w:numId w:val="15"/>
+        </w:numPr>
+        <w:spacing w:line="256" w:lineRule="auto"/>
+        <w:rPr>
+          <w:rFonts w:ascii="Aptos" w:eastAsia="Times New Roman" w:hAnsi="Aptos" w:cs="Times New Roman"/>
+          <w:lang w:eastAsia="it-IT"/>
+        </w:rPr>
+      </w:pPr>
+      <w:r>
+        <w:rPr>
+          <w:rFonts w:ascii="Aptos" w:eastAsia="Times New Roman" w:hAnsi="Aptos" w:cs="Times New Roman"/>
+          <w:b/>
+          <w:bCs/>
+          <w:lang w:eastAsia="it-IT"/>
+        </w:rPr>
+        <w:t>Sfide</w:t>
+      </w:r>
+      <w:r>
+        <w:rPr>
+          <w:rFonts w:ascii="Aptos" w:eastAsia="Times New Roman" w:hAnsi="Aptos" w:cs="Times New Roman"/>
+          <w:lang w:eastAsia="it-IT"/>
+        </w:rPr>
+        <w:t xml:space="preserve"> (da completare/completate)</w:t>
+      </w:r>
+    </w:p>
+    <w:p>
+      <w:pPr>
+        <w:spacing w:before="100" w:beforeAutospacing="1" w:after="100" w:afterAutospacing="1" w:line="240" w:lineRule="auto"/>
+        <w:rPr>
+          <w:rFonts w:ascii="Aptos" w:eastAsia="Times New Roman" w:hAnsi="Aptos" w:cs="Times New Roman"/>
+          <w:lang w:eastAsia="it-IT"/>
+        </w:rPr>
+      </w:pPr>
+      <w:r>
+        <w:rPr>
+          <w:rFonts w:ascii="Aptos" w:eastAsia="Times New Roman" w:hAnsi="Aptos" w:cs="Times New Roman"/>
+          <w:lang w:eastAsia="it-IT"/>
+        </w:rPr>
+        <w:t>Cliccando su attività o su sfide mostro di default prima gli obiettivi da completare, poi avrò un pulsante per aggiornare lo stato del mio obiettivo (ad esempio “Segna come completato”).</w:t>
+      </w:r>
+      <w:r>
+        <w:rPr>
+          <w:rFonts w:ascii="Aptos" w:eastAsia="Times New Roman" w:hAnsi="Aptos" w:cs="Times New Roman"/>
+          <w:lang w:eastAsia="it-IT"/>
+        </w:rPr>
+        <w:br/>
+        <w:t xml:space="preserve">Gli obiettivi completati e da completare hanno due colori diversi. </w:t>
+      </w:r>
+      <w:r>
+        <w:rPr>
+          <w:rFonts w:ascii="Aptos" w:eastAsia="Times New Roman" w:hAnsi="Aptos" w:cs="Times New Roman"/>
+          <w:lang w:eastAsia="it-IT"/>
+        </w:rPr>
+        <w:br/>
+        <w:t>Gli obiettivi scaduti o le sfide rifiutate non vengono visualizzati…</w:t>
+      </w:r>
+    </w:p>
+    <w:p>
+      <w:pPr>
+        <w:spacing w:before="100" w:beforeAutospacing="1" w:after="100" w:afterAutospacing="1" w:line="240" w:lineRule="auto"/>
+        <w:rPr>
+          <w:rFonts w:ascii="Aptos" w:eastAsia="Times New Roman" w:hAnsi="Aptos" w:cs="Times New Roman"/>
+          <w:lang w:eastAsia="it-IT"/>
+        </w:rPr>
+      </w:pPr>
+      <w:r>
+        <w:rPr>
+          <w:rFonts w:ascii="Aptos" w:eastAsia="Times New Roman" w:hAnsi="Aptos" w:cs="Times New Roman"/>
+          <w:lang w:eastAsia="it-IT"/>
+        </w:rPr>
+        <w:lastRenderedPageBreak/>
+        <w:t>Inserisco una Progress Bar che mostra la percentuale di completamento degli obiettivi in base alla loro frequenza (settimanale, mensile, annuale). Quindi avrò 3 diverse progress bar, che cambiano di colore in base alla percentuale di caricamento (Bootstrap)</w:t>
+      </w:r>
+    </w:p>
+    <w:p>
+      <w:pPr>
+        <w:spacing w:before="100" w:beforeAutospacing="1" w:after="100" w:afterAutospacing="1" w:line="240" w:lineRule="auto"/>
+        <w:rPr>
+          <w:rFonts w:ascii="Aptos" w:eastAsia="Times New Roman" w:hAnsi="Aptos" w:cs="Times New Roman"/>
+          <w:b/>
+          <w:bCs/>
+          <w:color w:val="196B24" w:themeColor="accent3"/>
+          <w:lang w:eastAsia="it-IT"/>
+        </w:rPr>
+      </w:pPr>
+      <w:r>
+        <w:rPr>
+          <w:rFonts w:ascii="Aptos" w:eastAsia="Times New Roman" w:hAnsi="Aptos" w:cs="Times New Roman"/>
+          <w:b/>
+          <w:bCs/>
+          <w:color w:val="196B24" w:themeColor="accent3"/>
+          <w:lang w:eastAsia="it-IT"/>
+        </w:rPr>
+        <w:t>Funzionalità utili (da approfondire)</w:t>
+      </w:r>
+      <w:r>
+        <w:rPr>
+          <w:rFonts w:ascii="Aptos" w:eastAsia="Times New Roman" w:hAnsi="Aptos" w:cs="Times New Roman"/>
+          <w:b/>
+          <w:bCs/>
+          <w:color w:val="196B24" w:themeColor="accent3"/>
+          <w:lang w:eastAsia="it-IT"/>
+        </w:rPr>
+        <w:t xml:space="preserve"> per una migliore visualizzazione grafica</w:t>
+      </w:r>
+      <w:r>
+        <w:rPr>
+          <w:rFonts w:ascii="Aptos" w:eastAsia="Times New Roman" w:hAnsi="Aptos" w:cs="Times New Roman"/>
+          <w:b/>
+          <w:bCs/>
+          <w:color w:val="196B24" w:themeColor="accent3"/>
+          <w:lang w:eastAsia="it-IT"/>
+        </w:rPr>
+        <w:t xml:space="preserve"> </w:t>
+      </w:r>
+      <w:r>
+        <w:rPr>
+          <w:rFonts w:ascii="Aptos" w:eastAsia="Times New Roman" w:hAnsi="Aptos" w:cs="Times New Roman"/>
+          <w:b/>
+          <w:bCs/>
+          <w:color w:val="196B24" w:themeColor="accent3"/>
+          <w:lang w:eastAsia="it-IT"/>
+        </w:rPr>
+        <w:t xml:space="preserve">(con </w:t>
+      </w:r>
+      <w:r>
+        <w:rPr>
+          <w:rFonts w:ascii="Aptos" w:eastAsia="Times New Roman" w:hAnsi="Aptos" w:cs="Times New Roman"/>
+          <w:b/>
+          <w:bCs/>
+          <w:color w:val="196B24" w:themeColor="accent3"/>
+          <w:lang w:eastAsia="it-IT"/>
+        </w:rPr>
+        <w:t xml:space="preserve">Bootstrap </w:t>
+      </w:r>
+      <w:r>
+        <w:rPr>
+          <w:rFonts w:ascii="Aptos" w:eastAsia="Times New Roman" w:hAnsi="Aptos" w:cs="Times New Roman"/>
+          <w:b/>
+          <w:bCs/>
+          <w:color w:val="196B24" w:themeColor="accent3"/>
+          <w:lang w:eastAsia="it-IT"/>
+        </w:rPr>
+        <w:t>)</w:t>
+      </w:r>
+    </w:p>
+    <w:p>
+      <w:pPr>
+        <w:numPr>
+          <w:ilvl w:val="0"/>
+          <w:numId w:val="16"/>
         </w:numPr>
         <w:spacing w:before="100" w:beforeAutospacing="1" w:after="100" w:afterAutospacing="1" w:line="240" w:lineRule="auto"/>
-        <w:rPr>
-          <w:rFonts w:eastAsia="Times New Roman" w:cs="Times New Roman"/>
-          <w:lang w:eastAsia="it-IT"/>
-        </w:rPr>
-      </w:pPr>
-      <w:r>
-        <w:rPr>
-          <w:rFonts w:eastAsia="Times New Roman" w:cs="Times New Roman"/>
-          <w:lang w:eastAsia="it-IT"/>
-        </w:rPr>
-        <w:t>Icone e emoji per rendere l’esperienza più coinvolgente</w:t>
+        <w:contextualSpacing/>
+        <w:rPr>
+          <w:rFonts w:ascii="Aptos" w:eastAsia="Times New Roman" w:hAnsi="Aptos" w:cs="Times New Roman"/>
+          <w:color w:val="000000" w:themeColor="text1"/>
+          <w:lang w:eastAsia="it-IT"/>
+        </w:rPr>
+      </w:pPr>
+      <w:r>
+        <w:rPr>
+          <w:rFonts w:ascii="Aptos" w:eastAsia="Times New Roman" w:hAnsi="Aptos" w:cs="Times New Roman"/>
+          <w:color w:val="000000" w:themeColor="text1"/>
+          <w:lang w:eastAsia="it-IT"/>
+        </w:rPr>
+        <w:t>Tables</w:t>
       </w:r>
     </w:p>
     <w:p>
       <w:pPr>
-        <w:pStyle w:val="Paragrafoelenco"/>
         <w:numPr>
           <w:ilvl w:val="0"/>
-          <w:numId w:val="1"/>
+          <w:numId w:val="16"/>
         </w:numPr>
         <w:spacing w:before="100" w:beforeAutospacing="1" w:after="100" w:afterAutospacing="1" w:line="240" w:lineRule="auto"/>
-        <w:rPr>
-          <w:rFonts w:eastAsia="Times New Roman" w:cs="Times New Roman"/>
-          <w:lang w:eastAsia="it-IT"/>
-        </w:rPr>
-      </w:pPr>
-      <w:r>
-        <w:rPr>
-          <w:rFonts w:eastAsia="Times New Roman" w:cs="Times New Roman"/>
-          <w:lang w:eastAsia="it-IT"/>
-        </w:rPr>
-        <w:t>Colori chiari e motivanti, come sfondo azzurro chiaro o giallo</w:t>
-      </w:r>
-      <w:r>
-        <w:rPr>
-          <w:rFonts w:eastAsia="Times New Roman" w:cs="Times New Roman"/>
-          <w:lang w:eastAsia="it-IT"/>
-        </w:rPr>
-        <w:t xml:space="preserve"> in</w:t>
-      </w:r>
-      <w:r>
-        <w:rPr>
-          <w:rFonts w:eastAsia="Times New Roman" w:cs="Times New Roman"/>
-          <w:lang w:eastAsia="it-IT"/>
-        </w:rPr>
-        <w:t xml:space="preserve"> stile </w:t>
-      </w:r>
-      <w:r>
-        <w:rPr>
-          <w:rFonts w:eastAsia="Times New Roman" w:cs="Times New Roman"/>
-          <w:lang w:eastAsia="it-IT"/>
-        </w:rPr>
-        <w:t>“Note”</w:t>
+        <w:contextualSpacing/>
+        <w:rPr>
+          <w:rFonts w:ascii="Aptos" w:eastAsia="Times New Roman" w:hAnsi="Aptos" w:cs="Times New Roman"/>
+          <w:color w:val="000000" w:themeColor="text1"/>
+          <w:lang w:eastAsia="it-IT"/>
+        </w:rPr>
+      </w:pPr>
+      <w:r>
+        <w:rPr>
+          <w:rFonts w:ascii="Aptos" w:eastAsia="Times New Roman" w:hAnsi="Aptos" w:cs="Times New Roman"/>
+          <w:color w:val="000000" w:themeColor="text1"/>
+          <w:lang w:eastAsia="it-IT"/>
+        </w:rPr>
+        <w:t>Progress bar</w:t>
       </w:r>
     </w:p>
     <w:p>
       <w:pPr>
         <w:numPr>
           <w:ilvl w:val="0"/>
-          <w:numId w:val="1"/>
+          <w:numId w:val="16"/>
         </w:numPr>
-        <w:rPr>
-          <w:rFonts w:eastAsia="Times New Roman" w:cs="Times New Roman"/>
-          <w:b/>
-          <w:bCs/>
-          <w:lang w:eastAsia="it-IT"/>
-        </w:rPr>
-      </w:pPr>
-      <w:r>
-        <w:rPr>
-          <w:rFonts w:eastAsia="Times New Roman" w:cs="Times New Roman"/>
-          <w:lang w:eastAsia="it-IT"/>
-        </w:rPr>
-        <w:t>Uso di barre</w:t>
-      </w:r>
-      <w:r>
-        <w:rPr>
-          <w:rFonts w:eastAsia="Times New Roman" w:cs="Times New Roman"/>
-          <w:lang w:eastAsia="it-IT"/>
-        </w:rPr>
-        <w:t xml:space="preserve"> di avanzamento per dare un senso di progresso</w:t>
+        <w:spacing w:before="100" w:beforeAutospacing="1" w:after="100" w:afterAutospacing="1" w:line="240" w:lineRule="auto"/>
+        <w:contextualSpacing/>
+        <w:rPr>
+          <w:rFonts w:ascii="Aptos" w:eastAsia="Times New Roman" w:hAnsi="Aptos" w:cs="Times New Roman"/>
+          <w:color w:val="000000" w:themeColor="text1"/>
+          <w:lang w:eastAsia="it-IT"/>
+        </w:rPr>
+      </w:pPr>
+      <w:r>
+        <w:rPr>
+          <w:rFonts w:ascii="Aptos" w:eastAsia="Times New Roman" w:hAnsi="Aptos" w:cs="Times New Roman"/>
+          <w:color w:val="000000" w:themeColor="text1"/>
+          <w:lang w:eastAsia="it-IT"/>
+        </w:rPr>
+        <w:t>Forms per login utente</w:t>
       </w:r>
     </w:p>
     <w:p>
       <w:pPr>
+        <w:numPr>
+          <w:ilvl w:val="0"/>
+          <w:numId w:val="16"/>
+        </w:numPr>
         <w:spacing w:before="100" w:beforeAutospacing="1" w:after="100" w:afterAutospacing="1" w:line="240" w:lineRule="auto"/>
-        <w:rPr>
-          <w:rFonts w:eastAsia="Times New Roman" w:cs="Times New Roman"/>
-          <w:b/>
-          <w:bCs/>
-          <w:lang w:eastAsia="it-IT"/>
-        </w:rPr>
-      </w:pPr>
-      <w:r>
-        <w:rPr>
-          <w:rFonts w:eastAsia="Times New Roman" w:cs="Times New Roman"/>
-          <w:b/>
-          <w:bCs/>
-          <w:lang w:eastAsia="it-IT"/>
-        </w:rPr>
-        <w:t xml:space="preserve">Elementi </w:t>
-      </w:r>
-      <w:r>
-        <w:rPr>
-          <w:rFonts w:eastAsia="Times New Roman" w:cs="Times New Roman"/>
-          <w:b/>
-          <w:bCs/>
-          <w:lang w:eastAsia="it-IT"/>
-        </w:rPr>
-        <w:t>E</w:t>
-      </w:r>
-      <w:r>
-        <w:rPr>
-          <w:rFonts w:eastAsia="Times New Roman" w:cs="Times New Roman"/>
-          <w:b/>
-          <w:bCs/>
-          <w:lang w:eastAsia="it-IT"/>
-        </w:rPr>
-        <w:t>stetici</w:t>
+        <w:contextualSpacing/>
+        <w:rPr>
+          <w:rFonts w:ascii="Aptos" w:eastAsia="Times New Roman" w:hAnsi="Aptos" w:cs="Times New Roman"/>
+          <w:color w:val="000000" w:themeColor="text1"/>
+          <w:lang w:eastAsia="it-IT"/>
+        </w:rPr>
+      </w:pPr>
+      <w:r>
+        <w:rPr>
+          <w:rFonts w:ascii="Aptos" w:eastAsia="Times New Roman" w:hAnsi="Aptos" w:cs="Times New Roman"/>
+          <w:color w:val="000000" w:themeColor="text1"/>
+          <w:lang w:eastAsia="it-IT"/>
+        </w:rPr>
+        <w:t>Select form per selezionare (tra quelli disponibili) l’utente a cui lanciare la sfida</w:t>
       </w:r>
     </w:p>
     <w:p>
       <w:pPr>
         <w:numPr>
           <w:ilvl w:val="0"/>
-          <w:numId w:val="1"/>
+          <w:numId w:val="16"/>
         </w:numPr>
-        <w:rPr>
-          <w:rFonts w:eastAsia="Times New Roman" w:cs="Times New Roman"/>
-          <w:lang w:eastAsia="it-IT"/>
-        </w:rPr>
-      </w:pPr>
-      <w:r>
-        <w:rPr>
-          <w:rFonts w:eastAsia="Times New Roman" w:cs="Times New Roman"/>
-          <w:lang w:eastAsia="it-IT"/>
-        </w:rPr>
-        <w:t>In alto al centro</w:t>
-      </w:r>
-      <w:r>
-        <w:rPr>
-          <w:rFonts w:eastAsia="Times New Roman" w:cs="Times New Roman"/>
-          <w:lang w:eastAsia="it-IT"/>
-        </w:rPr>
-        <w:t xml:space="preserve"> </w:t>
-      </w:r>
-      <w:r>
-        <w:rPr>
-          <w:rFonts w:eastAsia="Times New Roman" w:cs="Times New Roman"/>
-          <w:lang w:eastAsia="it-IT"/>
-        </w:rPr>
-        <w:t>titolo dell’app</w:t>
-      </w:r>
-      <w:r>
-        <w:rPr>
-          <w:rFonts w:eastAsia="Times New Roman" w:cs="Times New Roman"/>
-          <w:lang w:eastAsia="it-IT"/>
-        </w:rPr>
-        <w:t xml:space="preserve"> Family Hub </w:t>
+        <w:spacing w:before="100" w:beforeAutospacing="1" w:after="100" w:afterAutospacing="1" w:line="240" w:lineRule="auto"/>
+        <w:contextualSpacing/>
+        <w:rPr>
+          <w:rFonts w:ascii="Aptos" w:eastAsia="Times New Roman" w:hAnsi="Aptos" w:cs="Times New Roman"/>
+          <w:color w:val="000000" w:themeColor="text1"/>
+          <w:lang w:eastAsia="it-IT"/>
+        </w:rPr>
+      </w:pPr>
+      <w:r>
+        <w:rPr>
+          <w:rFonts w:ascii="Aptos" w:eastAsia="Times New Roman" w:hAnsi="Aptos" w:cs="Times New Roman"/>
+          <w:color w:val="000000" w:themeColor="text1"/>
+          <w:lang w:eastAsia="it-IT"/>
+        </w:rPr>
+        <w:t>Checkbox per il completamento di attività e sfide</w:t>
       </w:r>
     </w:p>
     <w:p>
       <w:pPr>
         <w:numPr>
           <w:ilvl w:val="0"/>
-          <w:numId w:val="1"/>
+          <w:numId w:val="16"/>
         </w:numPr>
-        <w:rPr>
-          <w:rFonts w:eastAsia="Times New Roman" w:cs="Times New Roman"/>
-          <w:lang w:eastAsia="it-IT"/>
-        </w:rPr>
-      </w:pPr>
-      <w:r>
-        <w:rPr>
-          <w:rFonts w:eastAsia="Times New Roman" w:cs="Times New Roman"/>
-          <w:lang w:eastAsia="it-IT"/>
-        </w:rPr>
-        <w:t xml:space="preserve">In alto a destra </w:t>
-      </w:r>
-      <w:r>
-        <w:rPr>
-          <w:rFonts w:eastAsia="Times New Roman" w:cs="Times New Roman"/>
-          <w:lang w:eastAsia="it-IT"/>
-        </w:rPr>
-        <w:t xml:space="preserve">icona utente rotonda </w:t>
-      </w:r>
-      <w:r>
-        <w:rPr>
-          <w:rFonts w:eastAsia="Times New Roman" w:cs="Times New Roman"/>
-          <w:lang w:eastAsia="it-IT"/>
-        </w:rPr>
-        <w:t>con all’interno lettera iniziale dell’utente</w:t>
-      </w:r>
-      <w:r>
-        <w:rPr>
-          <w:rFonts w:eastAsia="Times New Roman" w:cs="Times New Roman"/>
-          <w:lang w:eastAsia="it-IT"/>
-        </w:rPr>
-        <w:t>, al di sotto punti accumulati e nome dell’utente</w:t>
+        <w:spacing w:before="100" w:beforeAutospacing="1" w:after="100" w:afterAutospacing="1" w:line="240" w:lineRule="auto"/>
+        <w:contextualSpacing/>
+        <w:rPr>
+          <w:rFonts w:ascii="Aptos" w:eastAsia="Times New Roman" w:hAnsi="Aptos" w:cs="Times New Roman"/>
+          <w:color w:val="000000" w:themeColor="text1"/>
+          <w:lang w:eastAsia="it-IT"/>
+        </w:rPr>
+      </w:pPr>
+      <w:r>
+        <w:rPr>
+          <w:rFonts w:ascii="Aptos" w:eastAsia="Times New Roman" w:hAnsi="Aptos" w:cs="Times New Roman"/>
+          <w:color w:val="000000" w:themeColor="text1"/>
+          <w:lang w:eastAsia="it-IT"/>
+        </w:rPr>
+        <w:t>Buttons per notifiche sfide da accettare/rifiutare (OPZIONALE)</w:t>
       </w:r>
     </w:p>
     <w:p>
       <w:pPr>
         <w:numPr>
           <w:ilvl w:val="0"/>
-          <w:numId w:val="1"/>
+          <w:numId w:val="16"/>
         </w:numPr>
-        <w:rPr>
-          <w:rFonts w:eastAsia="Times New Roman" w:cs="Times New Roman"/>
-          <w:lang w:eastAsia="it-IT"/>
-        </w:rPr>
-      </w:pPr>
-      <w:r>
-        <w:rPr>
-          <w:rFonts w:eastAsia="Times New Roman" w:cs="Times New Roman"/>
-          <w:lang w:eastAsia="it-IT"/>
-        </w:rPr>
-        <w:t>Icona impostazioni con opzione “Modifica nome utente” e “logout” (OPZIONALE)</w:t>
+        <w:spacing w:before="100" w:beforeAutospacing="1" w:after="100" w:afterAutospacing="1" w:line="240" w:lineRule="auto"/>
+        <w:contextualSpacing/>
+        <w:rPr>
+          <w:rFonts w:ascii="Aptos" w:eastAsia="Times New Roman" w:hAnsi="Aptos" w:cs="Times New Roman"/>
+          <w:color w:val="000000" w:themeColor="text1"/>
+          <w:lang w:eastAsia="it-IT"/>
+        </w:rPr>
+      </w:pPr>
+      <w:r>
+        <w:rPr>
+          <w:rFonts w:ascii="Aptos" w:eastAsia="Times New Roman" w:hAnsi="Aptos" w:cs="Times New Roman"/>
+          <w:color w:val="000000" w:themeColor="text1"/>
+          <w:lang w:eastAsia="it-IT"/>
+        </w:rPr>
+        <w:t>Spinners per il caricamento delle pagine</w:t>
       </w:r>
     </w:p>
     <w:p>
       <w:pPr>
+        <w:spacing w:before="100" w:beforeAutospacing="1" w:after="100" w:afterAutospacing="1" w:line="240" w:lineRule="auto"/>
         <w:rPr>
           <w:rFonts w:eastAsia="Times New Roman" w:cs="Times New Roman"/>
-          <w:b/>
-          <w:bCs/>
-          <w:lang w:eastAsia="it-IT"/>
-        </w:rPr>
-      </w:pPr>
-      <w:r>
-        <w:rPr>
-          <w:rFonts w:eastAsia="Times New Roman" w:cs="Times New Roman"/>
-          <w:b/>
-          <w:bCs/>
-          <w:lang w:eastAsia="it-IT"/>
-        </w:rPr>
-        <w:t>Sezione Classifica</w:t>
-      </w:r>
-    </w:p>
-    <w:p>
-      <w:pPr>
-        <w:numPr>
-          <w:ilvl w:val="0"/>
-          <w:numId w:val="6"/>
-        </w:numPr>
-      </w:pPr>
-      <w:r>
-        <w:rPr>
-          <w:rFonts w:eastAsia="Times New Roman" w:cs="Times New Roman"/>
-          <w:lang w:eastAsia="it-IT"/>
-        </w:rPr>
-        <w:t>A sinistra della schermata principale, u</w:t>
-      </w:r>
-      <w:r>
-        <w:rPr>
-          <w:rFonts w:eastAsia="Times New Roman" w:cs="Times New Roman"/>
-          <w:lang w:eastAsia="it-IT"/>
-        </w:rPr>
-        <w:t>na tabella con la classifica degli utenti in base a</w:t>
-      </w:r>
-      <w:r>
-        <w:rPr>
-          <w:rFonts w:eastAsia="Times New Roman" w:cs="Times New Roman"/>
-          <w:lang w:eastAsia="it-IT"/>
-        </w:rPr>
-        <w:t>l totale di</w:t>
-      </w:r>
-      <w:r>
-        <w:rPr>
-          <w:rFonts w:eastAsia="Times New Roman" w:cs="Times New Roman"/>
-          <w:lang w:eastAsia="it-IT"/>
-        </w:rPr>
-        <w:t xml:space="preserve"> punti accumulati</w:t>
-      </w:r>
-    </w:p>
-    <w:p>
-      <w:pPr>
-        <w:rPr>
-          <w:rFonts w:eastAsia="Times New Roman" w:cs="Times New Roman"/>
-          <w:b/>
-          <w:bCs/>
-          <w:lang w:eastAsia="it-IT"/>
-        </w:rPr>
-      </w:pPr>
-      <w:r>
-        <w:rPr>
-          <w:rFonts w:eastAsia="Times New Roman" w:cs="Times New Roman"/>
-          <w:b/>
-          <w:bCs/>
-          <w:lang w:eastAsia="it-IT"/>
-        </w:rPr>
-        <w:t>Sezione Premi</w:t>
-      </w:r>
-    </w:p>
-    <w:p>
-      <w:pPr>
-        <w:rPr>
-          <w:rFonts w:eastAsia="Times New Roman" w:cs="Times New Roman"/>
-          <w:lang w:eastAsia="it-IT"/>
-        </w:rPr>
-      </w:pPr>
-      <w:r>
-        <w:rPr>
-          <w:rFonts w:eastAsia="Times New Roman" w:cs="Times New Roman"/>
-          <w:lang w:eastAsia="it-IT"/>
-        </w:rPr>
-        <w:t>S</w:t>
-      </w:r>
-      <w:r>
-        <w:rPr>
-          <w:rFonts w:eastAsia="Times New Roman" w:cs="Times New Roman"/>
-          <w:lang w:eastAsia="it-IT"/>
-        </w:rPr>
-        <w:t>ituata al centro-sinistra dello schermo, s</w:t>
-      </w:r>
-      <w:r>
-        <w:rPr>
-          <w:rFonts w:eastAsia="Times New Roman" w:cs="Times New Roman"/>
-          <w:lang w:eastAsia="it-IT"/>
-        </w:rPr>
-        <w:t>e cliccata si suddivide in due liste:</w:t>
-      </w:r>
-    </w:p>
-    <w:p>
-      <w:pPr>
-        <w:numPr>
-          <w:ilvl w:val="1"/>
-          <w:numId w:val="10"/>
-        </w:numPr>
-        <w:rPr>
-          <w:rFonts w:eastAsia="Times New Roman" w:cs="Times New Roman"/>
-          <w:lang w:eastAsia="it-IT"/>
-        </w:rPr>
-      </w:pPr>
-      <w:r>
-        <w:rPr>
-          <w:rFonts w:eastAsia="Times New Roman" w:cs="Times New Roman"/>
-          <w:lang w:eastAsia="it-IT"/>
-        </w:rPr>
-        <w:t>Premi già riscossi</w:t>
-      </w:r>
-      <w:r>
-        <w:rPr>
-          <w:rFonts w:eastAsia="Times New Roman" w:cs="Times New Roman"/>
-          <w:lang w:eastAsia="it-IT"/>
-        </w:rPr>
-        <w:t>, con nome premio e data di riscossione</w:t>
-      </w:r>
-    </w:p>
-    <w:p>
-      <w:pPr>
-        <w:numPr>
-          <w:ilvl w:val="1"/>
-          <w:numId w:val="10"/>
-        </w:numPr>
-        <w:rPr>
-          <w:rFonts w:eastAsia="Times New Roman" w:cs="Times New Roman"/>
-          <w:lang w:eastAsia="it-IT"/>
-        </w:rPr>
-      </w:pPr>
-      <w:r>
-        <w:rPr>
-          <w:rFonts w:eastAsia="Times New Roman" w:cs="Times New Roman"/>
-          <w:lang w:eastAsia="it-IT"/>
-        </w:rPr>
-        <w:t xml:space="preserve">Premi disponibili </w:t>
-      </w:r>
-      <w:r>
-        <w:rPr>
-          <w:rFonts w:eastAsia="Times New Roman" w:cs="Times New Roman"/>
-          <w:lang w:eastAsia="it-IT"/>
-        </w:rPr>
-        <w:t>(</w:t>
-      </w:r>
-      <w:r>
-        <w:rPr>
-          <w:rFonts w:eastAsia="Times New Roman" w:cs="Times New Roman"/>
-          <w:lang w:eastAsia="it-IT"/>
-        </w:rPr>
-        <w:t xml:space="preserve">con </w:t>
-      </w:r>
-      <w:r>
-        <w:rPr>
-          <w:rFonts w:eastAsia="Times New Roman" w:cs="Times New Roman"/>
-          <w:lang w:eastAsia="it-IT"/>
-        </w:rPr>
-        <w:t xml:space="preserve">nome premio e </w:t>
-      </w:r>
-      <w:r>
-        <w:rPr>
-          <w:rFonts w:eastAsia="Times New Roman" w:cs="Times New Roman"/>
-          <w:lang w:eastAsia="it-IT"/>
-        </w:rPr>
-        <w:t>pulsante “Riscatta”</w:t>
-      </w:r>
-      <w:r>
-        <w:rPr>
-          <w:rFonts w:eastAsia="Times New Roman" w:cs="Times New Roman"/>
-          <w:lang w:eastAsia="it-IT"/>
-        </w:rPr>
-        <w:t xml:space="preserve">, </w:t>
-      </w:r>
-      <w:r>
-        <w:rPr>
-          <w:rFonts w:eastAsia="Times New Roman" w:cs="Times New Roman"/>
-          <w:lang w:eastAsia="it-IT"/>
-        </w:rPr>
-        <w:t>attivo solo se l’utente ha abbastanza punti)</w:t>
-      </w:r>
-    </w:p>
-    <w:p>
-      <w:pPr>
-        <w:spacing w:before="100" w:beforeAutospacing="1" w:after="100" w:afterAutospacing="1" w:line="240" w:lineRule="auto"/>
-        <w:rPr>
-          <w:rFonts w:eastAsia="Times New Roman" w:cs="Times New Roman"/>
-          <w:b/>
-          <w:bCs/>
-          <w:lang w:eastAsia="it-IT"/>
-        </w:rPr>
-      </w:pPr>
-      <w:r>
-        <w:rPr>
-          <w:rFonts w:eastAsia="Times New Roman" w:cs="Times New Roman"/>
-          <w:lang w:eastAsia="it-IT"/>
-        </w:rPr>
-        <w:t>Progress bar che mostra quanti punti mancano al prossimo premio (opzionale, per motivare gli utenti)</w:t>
-      </w:r>
-    </w:p>
-    <w:p>
-      <w:pPr>
-        <w:spacing w:before="100" w:beforeAutospacing="1" w:after="100" w:afterAutospacing="1" w:line="240" w:lineRule="auto"/>
-        <w:rPr>
-          <w:rFonts w:eastAsia="Times New Roman" w:cs="Times New Roman"/>
-          <w:b/>
-          <w:bCs/>
-          <w:lang w:eastAsia="it-IT"/>
-        </w:rPr>
-      </w:pPr>
-      <w:r>
-        <w:rPr>
-          <w:rFonts w:eastAsia="Times New Roman" w:cs="Times New Roman"/>
-          <w:b/>
-          <w:bCs/>
-          <w:lang w:eastAsia="it-IT"/>
-        </w:rPr>
-        <w:t>Sezione Obiettivi</w:t>
-      </w:r>
-    </w:p>
-    <w:p>
-      <w:pPr>
-        <w:rPr>
-          <w:rFonts w:eastAsia="Times New Roman" w:cs="Times New Roman"/>
-          <w:lang w:eastAsia="it-IT"/>
-        </w:rPr>
-      </w:pPr>
-      <w:r>
-        <w:rPr>
-          <w:rFonts w:eastAsia="Times New Roman" w:cs="Times New Roman"/>
-          <w:lang w:eastAsia="it-IT"/>
-        </w:rPr>
-        <w:t xml:space="preserve">Gli obiettivi sono suddivisi </w:t>
-      </w:r>
-      <w:r>
-        <w:rPr>
-          <w:rFonts w:eastAsia="Times New Roman" w:cs="Times New Roman"/>
-          <w:lang w:eastAsia="it-IT"/>
-        </w:rPr>
-        <w:t xml:space="preserve">prima </w:t>
-      </w:r>
-      <w:r>
-        <w:rPr>
-          <w:rFonts w:eastAsia="Times New Roman" w:cs="Times New Roman"/>
-          <w:lang w:eastAsia="it-IT"/>
-        </w:rPr>
-        <w:t>per frequenza (settimanali/mensili/annuali/occasionali)</w:t>
-      </w:r>
-      <w:r>
-        <w:rPr>
-          <w:rFonts w:eastAsia="Times New Roman" w:cs="Times New Roman"/>
-          <w:lang w:eastAsia="it-IT"/>
-        </w:rPr>
-        <w:t>, poi</w:t>
-      </w:r>
-      <w:r>
-        <w:rPr>
-          <w:rFonts w:eastAsia="Times New Roman" w:cs="Times New Roman"/>
-          <w:lang w:eastAsia="it-IT"/>
-        </w:rPr>
-        <w:t xml:space="preserve"> ogni</w:t>
-      </w:r>
-      <w:r>
-        <w:rPr>
-          <w:rFonts w:eastAsia="Times New Roman" w:cs="Times New Roman"/>
-          <w:lang w:eastAsia="it-IT"/>
-        </w:rPr>
-        <w:t xml:space="preserve"> tabella </w:t>
-      </w:r>
-      <w:r>
-        <w:rPr>
-          <w:rFonts w:eastAsia="Times New Roman" w:cs="Times New Roman"/>
-          <w:lang w:eastAsia="it-IT"/>
-        </w:rPr>
-        <w:t>(ad es. obiettivi settimanali) sarà</w:t>
-      </w:r>
-      <w:r>
-        <w:rPr>
-          <w:rFonts w:eastAsia="Times New Roman" w:cs="Times New Roman"/>
-          <w:lang w:eastAsia="it-IT"/>
-        </w:rPr>
-        <w:t xml:space="preserve"> </w:t>
-      </w:r>
-      <w:r>
-        <w:rPr>
-          <w:rFonts w:eastAsia="Times New Roman" w:cs="Times New Roman"/>
-          <w:lang w:eastAsia="it-IT"/>
-        </w:rPr>
-        <w:t>distinta</w:t>
-      </w:r>
-      <w:r>
-        <w:rPr>
-          <w:rFonts w:eastAsia="Times New Roman" w:cs="Times New Roman"/>
-          <w:lang w:eastAsia="it-IT"/>
-        </w:rPr>
-        <w:t xml:space="preserve"> in due </w:t>
-      </w:r>
-      <w:r>
-        <w:rPr>
-          <w:rFonts w:eastAsia="Times New Roman" w:cs="Times New Roman"/>
-          <w:lang w:eastAsia="it-IT"/>
-        </w:rPr>
-        <w:t>liste</w:t>
-      </w:r>
-      <w:r>
-        <w:rPr>
-          <w:rFonts w:eastAsia="Times New Roman" w:cs="Times New Roman"/>
-          <w:lang w:eastAsia="it-IT"/>
-        </w:rPr>
-        <w:t xml:space="preserve"> (potrei anche inserire in modo OPZIONALE una terza lista </w:t>
-      </w:r>
-      <w:r>
-        <w:rPr>
-          <w:rFonts w:eastAsia="Times New Roman" w:cs="Times New Roman"/>
-          <w:b/>
-          <w:bCs/>
-          <w:lang w:eastAsia="it-IT"/>
-        </w:rPr>
-        <w:t>Tutto</w:t>
-      </w:r>
-      <w:r>
-        <w:rPr>
-          <w:rFonts w:eastAsia="Times New Roman" w:cs="Times New Roman"/>
-          <w:lang w:eastAsia="it-IT"/>
-        </w:rPr>
-        <w:t xml:space="preserve"> in cui l’utente visualizza tutti gli obiettivi della settimana/mese/anno…, senza distinzioni tra attività e sfide) </w:t>
-      </w:r>
-      <w:r>
-        <w:rPr>
-          <w:rFonts w:eastAsia="Times New Roman" w:cs="Times New Roman"/>
-          <w:lang w:eastAsia="it-IT"/>
-        </w:rPr>
-        <w:t>:</w:t>
-      </w:r>
-    </w:p>
-    <w:p>
-      <w:pPr>
-        <w:numPr>
-          <w:ilvl w:val="1"/>
-          <w:numId w:val="11"/>
-        </w:numPr>
-        <w:rPr>
-          <w:rFonts w:eastAsia="Times New Roman" w:cs="Times New Roman"/>
-          <w:lang w:eastAsia="it-IT"/>
-        </w:rPr>
-      </w:pPr>
-      <w:r>
-        <w:rPr>
-          <w:rFonts w:eastAsia="Times New Roman" w:cs="Times New Roman"/>
-          <w:b/>
-          <w:bCs/>
-          <w:lang w:eastAsia="it-IT"/>
-        </w:rPr>
-        <w:t>Attività</w:t>
-      </w:r>
-      <w:r>
-        <w:rPr>
-          <w:rFonts w:eastAsia="Times New Roman" w:cs="Times New Roman"/>
-          <w:lang w:eastAsia="it-IT"/>
-        </w:rPr>
-        <w:t xml:space="preserve"> (</w:t>
-      </w:r>
-      <w:r>
-        <w:rPr>
-          <w:rFonts w:eastAsia="Times New Roman" w:cs="Times New Roman"/>
-          <w:lang w:eastAsia="it-IT"/>
-        </w:rPr>
-        <w:t>da completare/completate</w:t>
-      </w:r>
-      <w:r>
-        <w:rPr>
-          <w:rFonts w:eastAsia="Times New Roman" w:cs="Times New Roman"/>
-          <w:lang w:eastAsia="it-IT"/>
-        </w:rPr>
-        <w:t>)</w:t>
-      </w:r>
-    </w:p>
-    <w:p>
-      <w:pPr>
-        <w:numPr>
-          <w:ilvl w:val="1"/>
-          <w:numId w:val="11"/>
-        </w:numPr>
-        <w:rPr>
-          <w:rFonts w:eastAsia="Times New Roman" w:cs="Times New Roman"/>
-          <w:lang w:eastAsia="it-IT"/>
-        </w:rPr>
-      </w:pPr>
-      <w:r>
-        <w:rPr>
-          <w:rFonts w:eastAsia="Times New Roman" w:cs="Times New Roman"/>
-          <w:b/>
-          <w:bCs/>
-          <w:lang w:eastAsia="it-IT"/>
-        </w:rPr>
-        <w:t>Sfide</w:t>
-      </w:r>
-      <w:r>
-        <w:rPr>
-          <w:rFonts w:eastAsia="Times New Roman" w:cs="Times New Roman"/>
-          <w:lang w:eastAsia="it-IT"/>
-        </w:rPr>
-        <w:t xml:space="preserve"> (</w:t>
-      </w:r>
-      <w:r>
-        <w:rPr>
-          <w:rFonts w:eastAsia="Times New Roman" w:cs="Times New Roman"/>
-          <w:lang w:eastAsia="it-IT"/>
-        </w:rPr>
-        <w:t>da completare/completate</w:t>
-      </w:r>
-      <w:r>
-        <w:rPr>
-          <w:rFonts w:eastAsia="Times New Roman" w:cs="Times New Roman"/>
-          <w:lang w:eastAsia="it-IT"/>
-        </w:rPr>
-        <w:t>)</w:t>
-      </w:r>
-    </w:p>
-    <w:p>
-      <w:pPr>
-        <w:spacing w:before="100" w:beforeAutospacing="1" w:after="100" w:afterAutospacing="1" w:line="240" w:lineRule="auto"/>
-        <w:rPr>
-          <w:rFonts w:eastAsia="Times New Roman" w:cs="Times New Roman"/>
-          <w:lang w:eastAsia="it-IT"/>
-        </w:rPr>
-      </w:pPr>
-      <w:r>
-        <w:rPr>
-          <w:rFonts w:eastAsia="Times New Roman" w:cs="Times New Roman"/>
-          <w:lang w:eastAsia="it-IT"/>
-        </w:rPr>
-        <w:t>Cliccando su attività o su sfide m</w:t>
-      </w:r>
-      <w:r>
-        <w:rPr>
-          <w:rFonts w:eastAsia="Times New Roman" w:cs="Times New Roman"/>
-          <w:lang w:eastAsia="it-IT"/>
-        </w:rPr>
-        <w:t>ostro di default prima gli obiettivi da completare, poi avrò un p</w:t>
-      </w:r>
-      <w:r>
-        <w:rPr>
-          <w:rFonts w:eastAsia="Times New Roman" w:cs="Times New Roman"/>
-          <w:lang w:eastAsia="it-IT"/>
-        </w:rPr>
-        <w:t>ulsante per aggiornare lo stato del mio obiettivo (ad esempio “Segna come completato”</w:t>
-      </w:r>
-      <w:r>
-        <w:rPr>
-          <w:rFonts w:eastAsia="Times New Roman" w:cs="Times New Roman"/>
-          <w:lang w:eastAsia="it-IT"/>
-        </w:rPr>
-        <w:t>).</w:t>
-      </w:r>
-      <w:r>
-        <w:rPr>
-          <w:rFonts w:eastAsia="Times New Roman" w:cs="Times New Roman"/>
-          <w:lang w:eastAsia="it-IT"/>
-        </w:rPr>
-        <w:br/>
-        <w:t>G</w:t>
-      </w:r>
-      <w:r>
-        <w:rPr>
-          <w:rFonts w:eastAsia="Times New Roman" w:cs="Times New Roman"/>
-          <w:lang w:eastAsia="it-IT"/>
-        </w:rPr>
-        <w:t>li obiettivi completati e da completare hanno due colori diversi</w:t>
-      </w:r>
-      <w:r>
-        <w:rPr>
-          <w:rFonts w:eastAsia="Times New Roman" w:cs="Times New Roman"/>
-          <w:lang w:eastAsia="it-IT"/>
-        </w:rPr>
-        <w:t xml:space="preserve">. </w:t>
-      </w:r>
-      <w:r>
-        <w:rPr>
-          <w:rFonts w:eastAsia="Times New Roman" w:cs="Times New Roman"/>
-          <w:lang w:eastAsia="it-IT"/>
-        </w:rPr>
-        <w:br/>
-      </w:r>
-      <w:r>
-        <w:rPr>
-          <w:rFonts w:eastAsia="Times New Roman" w:cs="Times New Roman"/>
-          <w:lang w:eastAsia="it-IT"/>
-        </w:rPr>
-        <w:t>Gli obiettivi scaduti o le sfide rifiutate non vengono visualizzati…</w:t>
-      </w:r>
-    </w:p>
-    <w:p>
-      <w:pPr>
-        <w:spacing w:before="100" w:beforeAutospacing="1" w:after="100" w:afterAutospacing="1" w:line="240" w:lineRule="auto"/>
-        <w:rPr>
-          <w:rFonts w:eastAsia="Times New Roman" w:cs="Times New Roman"/>
-          <w:lang w:eastAsia="it-IT"/>
-        </w:rPr>
-      </w:pPr>
-      <w:r>
-        <w:rPr>
-          <w:rFonts w:eastAsia="Times New Roman" w:cs="Times New Roman"/>
-          <w:lang w:eastAsia="it-IT"/>
-        </w:rPr>
-        <w:lastRenderedPageBreak/>
-        <w:t>Inserisco una P</w:t>
-      </w:r>
-      <w:r>
-        <w:rPr>
-          <w:rFonts w:eastAsia="Times New Roman" w:cs="Times New Roman"/>
-          <w:lang w:eastAsia="it-IT"/>
-        </w:rPr>
-        <w:t xml:space="preserve">rogress </w:t>
-      </w:r>
-      <w:r>
-        <w:rPr>
-          <w:rFonts w:eastAsia="Times New Roman" w:cs="Times New Roman"/>
-          <w:lang w:eastAsia="it-IT"/>
-        </w:rPr>
-        <w:t>B</w:t>
-      </w:r>
-      <w:r>
-        <w:rPr>
-          <w:rFonts w:eastAsia="Times New Roman" w:cs="Times New Roman"/>
-          <w:lang w:eastAsia="it-IT"/>
-        </w:rPr>
-        <w:t xml:space="preserve">ar che mostra la percentuale di completamento </w:t>
-      </w:r>
-      <w:r>
-        <w:rPr>
-          <w:rFonts w:eastAsia="Times New Roman" w:cs="Times New Roman"/>
-          <w:lang w:eastAsia="it-IT"/>
-        </w:rPr>
-        <w:t>degli obiettivi</w:t>
-      </w:r>
-      <w:r>
-        <w:rPr>
-          <w:rFonts w:eastAsia="Times New Roman" w:cs="Times New Roman"/>
-          <w:lang w:eastAsia="it-IT"/>
-        </w:rPr>
-        <w:t xml:space="preserve"> </w:t>
-      </w:r>
-      <w:r>
-        <w:rPr>
-          <w:rFonts w:eastAsia="Times New Roman" w:cs="Times New Roman"/>
-          <w:lang w:eastAsia="it-IT"/>
-        </w:rPr>
-        <w:t xml:space="preserve">in base alla </w:t>
-      </w:r>
-      <w:r>
-        <w:rPr>
-          <w:rFonts w:eastAsia="Times New Roman" w:cs="Times New Roman"/>
-          <w:lang w:eastAsia="it-IT"/>
-        </w:rPr>
-        <w:t xml:space="preserve">loro frequenza (settimanale, mensile, </w:t>
-      </w:r>
-      <w:r>
-        <w:rPr>
-          <w:rFonts w:eastAsia="Times New Roman" w:cs="Times New Roman"/>
-          <w:lang w:eastAsia="it-IT"/>
-        </w:rPr>
-        <w:t>annuale</w:t>
-      </w:r>
-      <w:r>
-        <w:rPr>
-          <w:rFonts w:eastAsia="Times New Roman" w:cs="Times New Roman"/>
-          <w:lang w:eastAsia="it-IT"/>
-        </w:rPr>
-        <w:t>)</w:t>
-      </w:r>
-      <w:r>
-        <w:rPr>
-          <w:rFonts w:eastAsia="Times New Roman" w:cs="Times New Roman"/>
-          <w:lang w:eastAsia="it-IT"/>
-        </w:rPr>
-        <w:t>. Quindi avrò 3 diverse progress bar, che cambiano di colore in base alla percentuale di caricamento (Bootstrap)</w:t>
-      </w:r>
+          <w:lang w:eastAsia="it-IT"/>
+        </w:rPr>
+      </w:pPr>
     </w:p>
     <w:sectPr>
       <w:pgSz w:w="11906" w:h="16838"/>
@@ -1400,6 +1205,119 @@
     </w:lvl>
   </w:abstractNum>
   <w:abstractNum w:abstractNumId="3" w15:restartNumberingAfterBreak="0">
+    <w:nsid w:val="1A502C36"/>
+    <w:multiLevelType w:val="hybridMultilevel"/>
+    <w:tmpl w:val="87D8F86C"/>
+    <w:lvl w:ilvl="0" w:tplc="81B6CAD4">
+      <w:start w:val="1"/>
+      <w:numFmt w:val="bullet"/>
+      <w:lvlText w:val=""/>
+      <w:lvlJc w:val="left"/>
+      <w:pPr>
+        <w:ind w:left="720" w:hanging="360"/>
+      </w:pPr>
+      <w:rPr>
+        <w:rFonts w:ascii="Symbol" w:hAnsi="Symbol" w:hint="default"/>
+      </w:rPr>
+    </w:lvl>
+    <w:lvl w:ilvl="1" w:tplc="04100003">
+      <w:start w:val="1"/>
+      <w:numFmt w:val="bullet"/>
+      <w:lvlText w:val="o"/>
+      <w:lvlJc w:val="left"/>
+      <w:pPr>
+        <w:ind w:left="1440" w:hanging="360"/>
+      </w:pPr>
+      <w:rPr>
+        <w:rFonts w:ascii="Courier New" w:hAnsi="Courier New" w:cs="Courier New" w:hint="default"/>
+      </w:rPr>
+    </w:lvl>
+    <w:lvl w:ilvl="2" w:tplc="04100005">
+      <w:start w:val="1"/>
+      <w:numFmt w:val="bullet"/>
+      <w:lvlText w:val=""/>
+      <w:lvlJc w:val="left"/>
+      <w:pPr>
+        <w:ind w:left="2160" w:hanging="360"/>
+      </w:pPr>
+      <w:rPr>
+        <w:rFonts w:ascii="Wingdings" w:hAnsi="Wingdings" w:hint="default"/>
+      </w:rPr>
+    </w:lvl>
+    <w:lvl w:ilvl="3" w:tplc="04100001">
+      <w:start w:val="1"/>
+      <w:numFmt w:val="bullet"/>
+      <w:lvlText w:val=""/>
+      <w:lvlJc w:val="left"/>
+      <w:pPr>
+        <w:ind w:left="2880" w:hanging="360"/>
+      </w:pPr>
+      <w:rPr>
+        <w:rFonts w:ascii="Symbol" w:hAnsi="Symbol" w:hint="default"/>
+      </w:rPr>
+    </w:lvl>
+    <w:lvl w:ilvl="4" w:tplc="04100003">
+      <w:start w:val="1"/>
+      <w:numFmt w:val="bullet"/>
+      <w:lvlText w:val="o"/>
+      <w:lvlJc w:val="left"/>
+      <w:pPr>
+        <w:ind w:left="3600" w:hanging="360"/>
+      </w:pPr>
+      <w:rPr>
+        <w:rFonts w:ascii="Courier New" w:hAnsi="Courier New" w:cs="Courier New" w:hint="default"/>
+      </w:rPr>
+    </w:lvl>
+    <w:lvl w:ilvl="5" w:tplc="04100005">
+      <w:start w:val="1"/>
+      <w:numFmt w:val="bullet"/>
+      <w:lvlText w:val=""/>
+      <w:lvlJc w:val="left"/>
+      <w:pPr>
+        <w:ind w:left="4320" w:hanging="360"/>
+      </w:pPr>
+      <w:rPr>
+        <w:rFonts w:ascii="Wingdings" w:hAnsi="Wingdings" w:hint="default"/>
+      </w:rPr>
+    </w:lvl>
+    <w:lvl w:ilvl="6" w:tplc="04100001">
+      <w:start w:val="1"/>
+      <w:numFmt w:val="bullet"/>
+      <w:lvlText w:val=""/>
+      <w:lvlJc w:val="left"/>
+      <w:pPr>
+        <w:ind w:left="5040" w:hanging="360"/>
+      </w:pPr>
+      <w:rPr>
+        <w:rFonts w:ascii="Symbol" w:hAnsi="Symbol" w:hint="default"/>
+      </w:rPr>
+    </w:lvl>
+    <w:lvl w:ilvl="7" w:tplc="04100003">
+      <w:start w:val="1"/>
+      <w:numFmt w:val="bullet"/>
+      <w:lvlText w:val="o"/>
+      <w:lvlJc w:val="left"/>
+      <w:pPr>
+        <w:ind w:left="5760" w:hanging="360"/>
+      </w:pPr>
+      <w:rPr>
+        <w:rFonts w:ascii="Courier New" w:hAnsi="Courier New" w:cs="Courier New" w:hint="default"/>
+      </w:rPr>
+    </w:lvl>
+    <w:lvl w:ilvl="8" w:tplc="04100005">
+      <w:start w:val="1"/>
+      <w:numFmt w:val="bullet"/>
+      <w:lvlText w:val=""/>
+      <w:lvlJc w:val="left"/>
+      <w:pPr>
+        <w:ind w:left="6480" w:hanging="360"/>
+      </w:pPr>
+      <w:rPr>
+        <w:rFonts w:ascii="Wingdings" w:hAnsi="Wingdings" w:hint="default"/>
+      </w:rPr>
+    </w:lvl>
+  </w:abstractNum>
+  <w:abstractNum w:abstractNumId="4" w15:restartNumberingAfterBreak="0">
     <w:nsid w:val="1FE42889"/>
     <w:multiLevelType w:val="multilevel"/>
     <w:tmpl w:val="8D72EF40"/>
@@ -1548,7 +1466,7 @@
       </w:rPr>
     </w:lvl>
   </w:abstractNum>
-  <w:abstractNum w:abstractNumId="4" w15:restartNumberingAfterBreak="0">
+  <w:abstractNum w:abstractNumId="5" w15:restartNumberingAfterBreak="0">
     <w:nsid w:val="342D5E11"/>
     <w:multiLevelType w:val="multilevel"/>
     <w:tmpl w:val="DFF8CA62"/>
@@ -1697,7 +1615,7 @@
       </w:rPr>
     </w:lvl>
   </w:abstractNum>
-  <w:abstractNum w:abstractNumId="5" w15:restartNumberingAfterBreak="0">
+  <w:abstractNum w:abstractNumId="6" w15:restartNumberingAfterBreak="0">
     <w:nsid w:val="3F086594"/>
     <w:multiLevelType w:val="multilevel"/>
     <w:tmpl w:val="884E8BC8"/>
@@ -1842,7 +1760,7 @@
       </w:rPr>
     </w:lvl>
   </w:abstractNum>
-  <w:abstractNum w:abstractNumId="6" w15:restartNumberingAfterBreak="0">
+  <w:abstractNum w:abstractNumId="7" w15:restartNumberingAfterBreak="0">
     <w:nsid w:val="49074823"/>
     <w:multiLevelType w:val="multilevel"/>
     <w:tmpl w:val="6D3E65B6"/>
@@ -1991,7 +1909,7 @@
       </w:rPr>
     </w:lvl>
   </w:abstractNum>
-  <w:abstractNum w:abstractNumId="7" w15:restartNumberingAfterBreak="0">
+  <w:abstractNum w:abstractNumId="8" w15:restartNumberingAfterBreak="0">
     <w:nsid w:val="62023D5C"/>
     <w:multiLevelType w:val="multilevel"/>
     <w:tmpl w:val="6896B2DE"/>
@@ -2140,7 +2058,7 @@
       </w:rPr>
     </w:lvl>
   </w:abstractNum>
-  <w:abstractNum w:abstractNumId="8" w15:restartNumberingAfterBreak="0">
+  <w:abstractNum w:abstractNumId="9" w15:restartNumberingAfterBreak="0">
     <w:nsid w:val="68A41F8F"/>
     <w:multiLevelType w:val="hybridMultilevel"/>
     <w:tmpl w:val="63D8E10A"/>
@@ -2229,7 +2147,7 @@
       </w:pPr>
     </w:lvl>
   </w:abstractNum>
-  <w:abstractNum w:abstractNumId="9" w15:restartNumberingAfterBreak="0">
+  <w:abstractNum w:abstractNumId="10" w15:restartNumberingAfterBreak="0">
     <w:nsid w:val="71187592"/>
     <w:multiLevelType w:val="multilevel"/>
     <w:tmpl w:val="4BAA3212"/>
@@ -2378,7 +2296,7 @@
       </w:rPr>
     </w:lvl>
   </w:abstractNum>
-  <w:abstractNum w:abstractNumId="10" w15:restartNumberingAfterBreak="0">
+  <w:abstractNum w:abstractNumId="11" w15:restartNumberingAfterBreak="0">
     <w:nsid w:val="78EB2FBB"/>
     <w:multiLevelType w:val="multilevel"/>
     <w:tmpl w:val="96F0E368"/>
@@ -2527,34 +2445,94 @@
     <w:abstractNumId w:val="2"/>
   </w:num>
   <w:num w:numId="2" w16cid:durableId="458844466">
-    <w:abstractNumId w:val="9"/>
+    <w:abstractNumId w:val="10"/>
   </w:num>
   <w:num w:numId="3" w16cid:durableId="1264189684">
-    <w:abstractNumId w:val="7"/>
+    <w:abstractNumId w:val="8"/>
   </w:num>
   <w:num w:numId="4" w16cid:durableId="1291742061">
-    <w:abstractNumId w:val="4"/>
+    <w:abstractNumId w:val="5"/>
   </w:num>
   <w:num w:numId="5" w16cid:durableId="908004526">
     <w:abstractNumId w:val="1"/>
   </w:num>
   <w:num w:numId="6" w16cid:durableId="196550382">
-    <w:abstractNumId w:val="3"/>
+    <w:abstractNumId w:val="4"/>
   </w:num>
   <w:num w:numId="7" w16cid:durableId="915749743">
-    <w:abstractNumId w:val="6"/>
+    <w:abstractNumId w:val="7"/>
   </w:num>
   <w:num w:numId="8" w16cid:durableId="1045326028">
-    <w:abstractNumId w:val="8"/>
+    <w:abstractNumId w:val="9"/>
   </w:num>
   <w:num w:numId="9" w16cid:durableId="1521091220">
     <w:abstractNumId w:val="0"/>
   </w:num>
   <w:num w:numId="10" w16cid:durableId="1304195097">
-    <w:abstractNumId w:val="10"/>
+    <w:abstractNumId w:val="11"/>
   </w:num>
   <w:num w:numId="11" w16cid:durableId="809975389">
-    <w:abstractNumId w:val="5"/>
+    <w:abstractNumId w:val="6"/>
+  </w:num>
+  <w:num w:numId="12" w16cid:durableId="165898344">
+    <w:abstractNumId w:val="2"/>
+    <w:lvlOverride w:ilvl="0"/>
+    <w:lvlOverride w:ilvl="1"/>
+    <w:lvlOverride w:ilvl="2"/>
+    <w:lvlOverride w:ilvl="3"/>
+    <w:lvlOverride w:ilvl="4"/>
+    <w:lvlOverride w:ilvl="5"/>
+    <w:lvlOverride w:ilvl="6"/>
+    <w:lvlOverride w:ilvl="7"/>
+    <w:lvlOverride w:ilvl="8"/>
+  </w:num>
+  <w:num w:numId="13" w16cid:durableId="1063529096">
+    <w:abstractNumId w:val="4"/>
+    <w:lvlOverride w:ilvl="0"/>
+    <w:lvlOverride w:ilvl="1"/>
+    <w:lvlOverride w:ilvl="2"/>
+    <w:lvlOverride w:ilvl="3"/>
+    <w:lvlOverride w:ilvl="4"/>
+    <w:lvlOverride w:ilvl="5"/>
+    <w:lvlOverride w:ilvl="6"/>
+    <w:lvlOverride w:ilvl="7"/>
+    <w:lvlOverride w:ilvl="8"/>
+  </w:num>
+  <w:num w:numId="14" w16cid:durableId="1035037105">
+    <w:abstractNumId w:val="11"/>
+    <w:lvlOverride w:ilvl="0"/>
+    <w:lvlOverride w:ilvl="1"/>
+    <w:lvlOverride w:ilvl="2"/>
+    <w:lvlOverride w:ilvl="3"/>
+    <w:lvlOverride w:ilvl="4"/>
+    <w:lvlOverride w:ilvl="5"/>
+    <w:lvlOverride w:ilvl="6"/>
+    <w:lvlOverride w:ilvl="7"/>
+    <w:lvlOverride w:ilvl="8"/>
+  </w:num>
+  <w:num w:numId="15" w16cid:durableId="805047839">
+    <w:abstractNumId w:val="6"/>
+    <w:lvlOverride w:ilvl="0"/>
+    <w:lvlOverride w:ilvl="1"/>
+    <w:lvlOverride w:ilvl="2"/>
+    <w:lvlOverride w:ilvl="3"/>
+    <w:lvlOverride w:ilvl="4"/>
+    <w:lvlOverride w:ilvl="5"/>
+    <w:lvlOverride w:ilvl="6"/>
+    <w:lvlOverride w:ilvl="7"/>
+    <w:lvlOverride w:ilvl="8"/>
+  </w:num>
+  <w:num w:numId="16" w16cid:durableId="203753898">
+    <w:abstractNumId w:val="3"/>
+    <w:lvlOverride w:ilvl="0"/>
+    <w:lvlOverride w:ilvl="1"/>
+    <w:lvlOverride w:ilvl="2"/>
+    <w:lvlOverride w:ilvl="3"/>
+    <w:lvlOverride w:ilvl="4"/>
+    <w:lvlOverride w:ilvl="5"/>
+    <w:lvlOverride w:ilvl="6"/>
+    <w:lvlOverride w:ilvl="7"/>
+    <w:lvlOverride w:ilvl="8"/>
   </w:num>
 </w:numbering>
 </file>
@@ -3163,6 +3141,7 @@
   <w:style w:type="character" w:default="1" w:styleId="Carpredefinitoparagrafo">
     <w:name w:val="Default Paragraph Font"/>
     <w:uiPriority w:val="1"/>
+    <w:semiHidden/>
     <w:unhideWhenUsed/>
   </w:style>
   <w:style w:type="table" w:default="1" w:styleId="Tabellanormale">

</xml_diff>

<commit_message>
risistemato file INTERFACCIA (ancora da cambiare il formato)
</commit_message>
<xml_diff>
--- a/INTERFACCIA UTENTE.docx
+++ b/INTERFACCIA UTENTE.docx
@@ -25,6 +25,30 @@
           <w:szCs w:val="24"/>
           <w:lang w:eastAsia="it-IT"/>
         </w:rPr>
+        <w:t>FAMILY HUB - SPECIFICHE DELL'</w:t>
+      </w:r>
+      <w:r>
+        <w:rPr>
+          <w:rFonts w:ascii="Aptos" w:eastAsia="Times New Roman" w:hAnsi="Aptos" w:cs="Times New Roman"/>
+          <w:b/>
+          <w:bCs/>
+          <w:color w:val="FF0000"/>
+          <w:sz w:val="24"/>
+          <w:szCs w:val="24"/>
+          <w:lang w:eastAsia="it-IT"/>
+        </w:rPr>
+        <w:t xml:space="preserve"> </w:t>
+      </w:r>
+      <w:r>
+        <w:rPr>
+          <w:rFonts w:ascii="Aptos" w:eastAsia="Times New Roman" w:hAnsi="Aptos" w:cs="Times New Roman"/>
+          <w:b/>
+          <w:bCs/>
+          <w:color w:val="FF0000"/>
+          <w:sz w:val="24"/>
+          <w:szCs w:val="24"/>
+          <w:lang w:eastAsia="it-IT"/>
+        </w:rPr>
         <w:t>INTERFACCIA UTENTE</w:t>
       </w:r>
     </w:p>
@@ -35,6 +59,7 @@
           <w:rFonts w:ascii="Aptos" w:eastAsia="Times New Roman" w:hAnsi="Aptos" w:cs="Times New Roman"/>
           <w:b/>
           <w:bCs/>
+          <w:color w:val="BF4E14" w:themeColor="accent2" w:themeShade="BF"/>
           <w:lang w:eastAsia="it-IT"/>
         </w:rPr>
       </w:pPr>
@@ -43,59 +68,177 @@
           <w:rFonts w:ascii="Aptos" w:eastAsia="Times New Roman" w:hAnsi="Aptos" w:cs="Times New Roman"/>
           <w:b/>
           <w:bCs/>
-          <w:lang w:eastAsia="it-IT"/>
-        </w:rPr>
-        <w:t>Accesso all’App</w:t>
+          <w:color w:val="BF4E14" w:themeColor="accent2" w:themeShade="BF"/>
+          <w:lang w:eastAsia="it-IT"/>
+        </w:rPr>
+        <w:t xml:space="preserve">Prossime Funzionalità da introdurre </w:t>
       </w:r>
     </w:p>
     <w:p>
       <w:pPr>
+        <w:pStyle w:val="Paragrafoelenco"/>
         <w:numPr>
           <w:ilvl w:val="0"/>
-          <w:numId w:val="12"/>
+          <w:numId w:val="24"/>
         </w:numPr>
-        <w:spacing w:before="100" w:beforeAutospacing="1" w:after="100" w:afterAutospacing="1" w:line="240" w:lineRule="auto"/>
-        <w:contextualSpacing/>
-        <w:rPr>
-          <w:rFonts w:ascii="Aptos" w:eastAsia="Times New Roman" w:hAnsi="Aptos" w:cs="Times New Roman"/>
-          <w:lang w:eastAsia="it-IT"/>
-        </w:rPr>
-      </w:pPr>
-      <w:r>
-        <w:rPr>
-          <w:rFonts w:ascii="Aptos" w:eastAsia="Times New Roman" w:hAnsi="Aptos" w:cs="Times New Roman"/>
-          <w:lang w:eastAsia="it-IT"/>
-        </w:rPr>
-        <w:t>Registrazione all’app con indirizzo email e password come primo accesso (tramite form), scelta del nome utente e assegnazione di un bonus punti di benvenuto</w:t>
+        <w:spacing w:line="256" w:lineRule="auto"/>
+        <w:rPr>
+          <w:rFonts w:ascii="Aptos" w:eastAsia="Times New Roman" w:hAnsi="Aptos" w:cs="Times New Roman"/>
+          <w:color w:val="000000" w:themeColor="text1"/>
+          <w:lang w:eastAsia="it-IT"/>
+        </w:rPr>
+      </w:pPr>
+      <w:r>
+        <w:rPr>
+          <w:rFonts w:ascii="Aptos" w:eastAsia="Times New Roman" w:hAnsi="Aptos" w:cs="Times New Roman"/>
+          <w:color w:val="000000" w:themeColor="text1"/>
+          <w:lang w:eastAsia="it-IT"/>
+        </w:rPr>
+        <w:t>Login form utente (utente accede all’app e viene visualizzata la homepage)</w:t>
       </w:r>
     </w:p>
     <w:p>
       <w:pPr>
+        <w:pStyle w:val="Paragrafoelenco"/>
         <w:numPr>
           <w:ilvl w:val="0"/>
-          <w:numId w:val="12"/>
+          <w:numId w:val="24"/>
         </w:numPr>
-        <w:spacing w:before="100" w:beforeAutospacing="1" w:after="100" w:afterAutospacing="1" w:line="240" w:lineRule="auto"/>
-        <w:contextualSpacing/>
-        <w:rPr>
-          <w:rFonts w:ascii="Aptos" w:eastAsia="Times New Roman" w:hAnsi="Aptos" w:cs="Times New Roman"/>
-          <w:u w:val="single"/>
-          <w:lang w:eastAsia="it-IT"/>
-        </w:rPr>
-      </w:pPr>
-      <w:r>
-        <w:rPr>
-          <w:rFonts w:ascii="Aptos" w:eastAsia="Times New Roman" w:hAnsi="Aptos" w:cs="Times New Roman"/>
-          <w:lang w:eastAsia="it-IT"/>
-        </w:rPr>
-        <w:t>Saluto all’utente (es. Ciao Simone !</w:t>
+        <w:spacing w:line="256" w:lineRule="auto"/>
+        <w:rPr>
+          <w:rFonts w:ascii="Aptos" w:eastAsia="Times New Roman" w:hAnsi="Aptos" w:cs="Times New Roman"/>
+          <w:color w:val="000000" w:themeColor="text1"/>
+          <w:lang w:eastAsia="it-IT"/>
+        </w:rPr>
+      </w:pPr>
+      <w:r>
+        <w:rPr>
+          <w:rFonts w:ascii="Aptos" w:eastAsia="Times New Roman" w:hAnsi="Aptos" w:cs="Times New Roman"/>
+          <w:color w:val="000000" w:themeColor="text1"/>
+          <w:lang w:eastAsia="it-IT"/>
+        </w:rPr>
+        <w:t>Metto Progress Bar</w:t>
+      </w:r>
+      <w:r>
+        <w:rPr>
+          <w:rFonts w:ascii="Aptos" w:eastAsia="Times New Roman" w:hAnsi="Aptos" w:cs="Times New Roman"/>
+          <w:color w:val="000000" w:themeColor="text1"/>
+          <w:lang w:eastAsia="it-IT"/>
+        </w:rPr>
+        <w:t xml:space="preserve"> per gli Obiettivi</w:t>
+      </w:r>
+    </w:p>
+    <w:p>
+      <w:pPr>
+        <w:spacing w:line="256" w:lineRule="auto"/>
+        <w:rPr>
+          <w:rFonts w:ascii="Aptos" w:eastAsia="Times New Roman" w:hAnsi="Aptos" w:cs="Times New Roman"/>
+          <w:b/>
+          <w:bCs/>
+          <w:lang w:eastAsia="it-IT"/>
+        </w:rPr>
+      </w:pPr>
+      <w:r>
+        <w:rPr>
+          <w:rFonts w:ascii="Aptos" w:eastAsia="Times New Roman" w:hAnsi="Aptos" w:cs="Times New Roman"/>
+          <w:b/>
+          <w:bCs/>
+          <w:lang w:eastAsia="it-IT"/>
+        </w:rPr>
+        <w:t>Accesso all’App</w:t>
+      </w:r>
+    </w:p>
+    <w:p>
+      <w:pPr>
+        <w:numPr>
+          <w:ilvl w:val="0"/>
+          <w:numId w:val="17"/>
+        </w:numPr>
+        <w:spacing w:line="256" w:lineRule="auto"/>
+        <w:rPr>
+          <w:rFonts w:ascii="Aptos" w:eastAsia="Times New Roman" w:hAnsi="Aptos" w:cs="Times New Roman"/>
+          <w:b/>
+          <w:bCs/>
+          <w:lang w:eastAsia="it-IT"/>
+        </w:rPr>
+      </w:pPr>
+      <w:r>
+        <w:rPr>
+          <w:rFonts w:ascii="Aptos" w:eastAsia="Times New Roman" w:hAnsi="Aptos" w:cs="Times New Roman"/>
+          <w:lang w:eastAsia="it-IT"/>
+        </w:rPr>
+        <w:t xml:space="preserve">Al primo accesso, l'utente deve registrarsi con </w:t>
+      </w:r>
+      <w:proofErr w:type="gramStart"/>
+      <w:r>
+        <w:rPr>
+          <w:rFonts w:ascii="Aptos" w:eastAsia="Times New Roman" w:hAnsi="Aptos" w:cs="Times New Roman"/>
+          <w:lang w:eastAsia="it-IT"/>
+        </w:rPr>
+        <w:t>email</w:t>
+      </w:r>
+      <w:proofErr w:type="gramEnd"/>
+      <w:r>
+        <w:rPr>
+          <w:rFonts w:ascii="Aptos" w:eastAsia="Times New Roman" w:hAnsi="Aptos" w:cs="Times New Roman"/>
+          <w:lang w:eastAsia="it-IT"/>
+        </w:rPr>
+        <w:t xml:space="preserve"> e password tramite un form. Dopo la registrazione, sceglie un nome utente e riceve un bonus punti di benvenuto.</w:t>
+      </w:r>
+    </w:p>
+    <w:p>
+      <w:pPr>
+        <w:numPr>
+          <w:ilvl w:val="0"/>
+          <w:numId w:val="17"/>
+        </w:numPr>
+        <w:spacing w:line="256" w:lineRule="auto"/>
+        <w:rPr>
+          <w:rFonts w:ascii="Aptos" w:eastAsia="Times New Roman" w:hAnsi="Aptos" w:cs="Times New Roman"/>
+          <w:b/>
+          <w:bCs/>
+          <w:lang w:eastAsia="it-IT"/>
+        </w:rPr>
+      </w:pPr>
+      <w:r>
+        <w:rPr>
+          <w:rFonts w:ascii="Aptos" w:eastAsia="Times New Roman" w:hAnsi="Aptos" w:cs="Times New Roman"/>
+          <w:lang w:eastAsia="it-IT"/>
+        </w:rPr>
+        <w:t>A</w:t>
+      </w:r>
+      <w:r>
+        <w:rPr>
+          <w:rFonts w:ascii="Aptos" w:eastAsia="Times New Roman" w:hAnsi="Aptos" w:cs="Times New Roman"/>
+          <w:lang w:eastAsia="it-IT"/>
+        </w:rPr>
+        <w:t xml:space="preserve">d ogni </w:t>
+      </w:r>
+      <w:r>
+        <w:rPr>
+          <w:rFonts w:ascii="Aptos" w:eastAsia="Times New Roman" w:hAnsi="Aptos" w:cs="Times New Roman"/>
+          <w:lang w:eastAsia="it-IT"/>
+        </w:rPr>
+        <w:t xml:space="preserve">accesso, viene mostrato un messaggio di benvenuto con il nome utente </w:t>
+      </w:r>
+      <w:r>
+        <w:rPr>
+          <w:rFonts w:ascii="Aptos" w:eastAsia="Times New Roman" w:hAnsi="Aptos" w:cs="Times New Roman"/>
+          <w:lang w:eastAsia="it-IT"/>
+        </w:rPr>
+        <w:br/>
+      </w:r>
+      <w:r>
+        <w:rPr>
+          <w:rFonts w:eastAsia="Times New Roman" w:cs="Times New Roman"/>
+          <w:lang w:eastAsia="it-IT"/>
+        </w:rPr>
+        <w:t>(es. Ciao Simone !</w:t>
       </w:r>
       <w:r>
         <w:rPr>
           <mc:AlternateContent>
-            <mc:Choice Requires="w16se">
-              <w:rFonts w:ascii="Aptos" w:eastAsia="Aptos" w:hAnsi="Aptos" w:cs="Times New Roman"/>
-            </mc:Choice>
+            <mc:Choice Requires="w16se"/>
             <mc:Fallback>
               <w:rFonts w:ascii="Segoe UI Emoji" w:eastAsia="Segoe UI Emoji" w:hAnsi="Segoe UI Emoji" w:cs="Segoe UI Emoji"/>
             </mc:Fallback>
@@ -113,10 +256,38 @@
       </w:r>
       <w:r>
         <w:rPr>
-          <w:rFonts w:ascii="Aptos" w:eastAsia="Aptos" w:hAnsi="Aptos" w:cs="Times New Roman"/>
-          <w:lang w:eastAsia="it-IT"/>
-        </w:rPr>
-        <w:t>) al caricamento la pagina (inserisco rotellina che gira da Bootstrap), quindi ogni volta che si entra nell’app</w:t>
+          <w:lang w:eastAsia="it-IT"/>
+        </w:rPr>
+        <w:t xml:space="preserve">) </w:t>
+      </w:r>
+      <w:r>
+        <w:rPr>
+          <w:lang w:eastAsia="it-IT"/>
+        </w:rPr>
+        <w:t>.</w:t>
+      </w:r>
+      <w:r>
+        <w:rPr>
+          <w:rFonts w:ascii="Aptos" w:eastAsia="Times New Roman" w:hAnsi="Aptos" w:cs="Times New Roman"/>
+          <w:lang w:eastAsia="it-IT"/>
+        </w:rPr>
+        <w:t xml:space="preserve">Cliccando su Accedi, l’utente viene indirizzato nella pagina Home della </w:t>
+      </w:r>
+      <w:proofErr w:type="spellStart"/>
+      <w:r>
+        <w:rPr>
+          <w:rFonts w:ascii="Aptos" w:eastAsia="Times New Roman" w:hAnsi="Aptos" w:cs="Times New Roman"/>
+          <w:lang w:eastAsia="it-IT"/>
+        </w:rPr>
+        <w:t>Webapp</w:t>
+      </w:r>
+      <w:proofErr w:type="spellEnd"/>
+      <w:r>
+        <w:rPr>
+          <w:rFonts w:ascii="Aptos" w:eastAsia="Times New Roman" w:hAnsi="Aptos" w:cs="Times New Roman"/>
+          <w:lang w:eastAsia="it-IT"/>
+        </w:rPr>
+        <w:t>.</w:t>
       </w:r>
     </w:p>
     <w:p>
@@ -136,60 +307,88 @@
           <w:bCs/>
           <w:lang w:eastAsia="it-IT"/>
         </w:rPr>
-        <w:t>Stile e Design</w:t>
+        <w:t>Design e Stile</w:t>
       </w:r>
     </w:p>
     <w:p>
       <w:pPr>
         <w:numPr>
           <w:ilvl w:val="0"/>
-          <w:numId w:val="12"/>
+          <w:numId w:val="18"/>
         </w:numPr>
-        <w:spacing w:before="100" w:beforeAutospacing="1" w:after="100" w:afterAutospacing="1" w:line="240" w:lineRule="auto"/>
-        <w:contextualSpacing/>
-        <w:rPr>
-          <w:rFonts w:ascii="Aptos" w:eastAsia="Times New Roman" w:hAnsi="Aptos" w:cs="Times New Roman"/>
-          <w:lang w:eastAsia="it-IT"/>
-        </w:rPr>
-      </w:pPr>
-      <w:r>
-        <w:rPr>
-          <w:rFonts w:ascii="Aptos" w:eastAsia="Times New Roman" w:hAnsi="Aptos" w:cs="Times New Roman"/>
-          <w:lang w:eastAsia="it-IT"/>
-        </w:rPr>
-        <w:t>Icone e emoji per rendere l’esperienza più coinvolgente</w:t>
+        <w:spacing w:line="256" w:lineRule="auto"/>
+        <w:rPr>
+          <w:rFonts w:ascii="Aptos" w:eastAsia="Times New Roman" w:hAnsi="Aptos" w:cs="Times New Roman"/>
+          <w:lang w:eastAsia="it-IT"/>
+        </w:rPr>
+      </w:pPr>
+      <w:r>
+        <w:rPr>
+          <w:rFonts w:ascii="Aptos" w:eastAsia="Times New Roman" w:hAnsi="Aptos" w:cs="Times New Roman"/>
+          <w:lang w:eastAsia="it-IT"/>
+        </w:rPr>
+        <w:t>Uso di icone ed emoji per rendere l’interfaccia più intuitiva e piacevole.</w:t>
+      </w:r>
+      <w:r>
+        <w:rPr>
+          <w:rFonts w:ascii="Aptos" w:eastAsia="Times New Roman" w:hAnsi="Aptos" w:cs="Times New Roman"/>
+          <w:lang w:eastAsia="it-IT"/>
+        </w:rPr>
+        <w:t xml:space="preserve"> </w:t>
       </w:r>
     </w:p>
     <w:p>
       <w:pPr>
         <w:numPr>
           <w:ilvl w:val="0"/>
-          <w:numId w:val="12"/>
+          <w:numId w:val="18"/>
         </w:numPr>
-        <w:spacing w:before="100" w:beforeAutospacing="1" w:after="100" w:afterAutospacing="1" w:line="240" w:lineRule="auto"/>
-        <w:contextualSpacing/>
-        <w:rPr>
-          <w:rFonts w:ascii="Aptos" w:eastAsia="Times New Roman" w:hAnsi="Aptos" w:cs="Times New Roman"/>
-          <w:lang w:eastAsia="it-IT"/>
-        </w:rPr>
-      </w:pPr>
-      <w:r>
-        <w:rPr>
-          <w:rFonts w:ascii="Aptos" w:eastAsia="Times New Roman" w:hAnsi="Aptos" w:cs="Times New Roman"/>
-          <w:lang w:eastAsia="it-IT"/>
-        </w:rPr>
-        <w:t>Colori chiari e motivanti, come sfondo azzurro chiaro o giallo in stile “Note”</w:t>
+        <w:spacing w:line="256" w:lineRule="auto"/>
+        <w:rPr>
+          <w:rFonts w:ascii="Aptos" w:eastAsia="Times New Roman" w:hAnsi="Aptos" w:cs="Times New Roman"/>
+          <w:lang w:eastAsia="it-IT"/>
+        </w:rPr>
+      </w:pPr>
+      <w:r>
+        <w:rPr>
+          <w:rFonts w:ascii="Aptos" w:eastAsia="Times New Roman" w:hAnsi="Aptos" w:cs="Times New Roman"/>
+          <w:lang w:eastAsia="it-IT"/>
+        </w:rPr>
+        <w:t>Sfondo in tonalità chiare, come azzurro chiaro o giallo (in stile "Note").</w:t>
+      </w:r>
+      <w:r>
+        <w:rPr>
+          <w:rFonts w:ascii="Aptos" w:eastAsia="Times New Roman" w:hAnsi="Aptos" w:cs="Times New Roman"/>
+          <w:lang w:eastAsia="it-IT"/>
+        </w:rPr>
+        <w:t xml:space="preserve"> </w:t>
       </w:r>
     </w:p>
     <w:p>
       <w:pPr>
         <w:numPr>
           <w:ilvl w:val="0"/>
-          <w:numId w:val="12"/>
+          <w:numId w:val="18"/>
         </w:numPr>
         <w:spacing w:line="256" w:lineRule="auto"/>
         <w:rPr>
           <w:rFonts w:ascii="Aptos" w:eastAsia="Times New Roman" w:hAnsi="Aptos" w:cs="Times New Roman"/>
+          <w:lang w:eastAsia="it-IT"/>
+        </w:rPr>
+      </w:pPr>
+      <w:r>
+        <w:rPr>
+          <w:rFonts w:ascii="Aptos" w:eastAsia="Times New Roman" w:hAnsi="Aptos" w:cs="Times New Roman"/>
+          <w:lang w:eastAsia="it-IT"/>
+        </w:rPr>
+        <w:t>Implementazione di progress bar per mostrare i progressi degli utenti e motivarli.</w:t>
+      </w:r>
+    </w:p>
+    <w:p>
+      <w:pPr>
+        <w:spacing w:line="256" w:lineRule="auto"/>
+        <w:rPr>
+          <w:rFonts w:ascii="Aptos" w:eastAsia="Times New Roman" w:hAnsi="Aptos" w:cs="Times New Roman"/>
           <w:b/>
           <w:bCs/>
           <w:lang w:eastAsia="it-IT"/>
@@ -198,14 +397,20 @@
       <w:r>
         <w:rPr>
           <w:rFonts w:ascii="Aptos" w:eastAsia="Times New Roman" w:hAnsi="Aptos" w:cs="Times New Roman"/>
-          <w:lang w:eastAsia="it-IT"/>
-        </w:rPr>
-        <w:t>Uso di barre di avanzamento per dare un senso di progresso</w:t>
+          <w:b/>
+          <w:bCs/>
+          <w:lang w:eastAsia="it-IT"/>
+        </w:rPr>
+        <w:t>Elementi Estetici Principali</w:t>
       </w:r>
     </w:p>
     <w:p>
       <w:pPr>
-        <w:spacing w:before="100" w:beforeAutospacing="1" w:after="100" w:afterAutospacing="1" w:line="240" w:lineRule="auto"/>
+        <w:numPr>
+          <w:ilvl w:val="0"/>
+          <w:numId w:val="19"/>
+        </w:numPr>
+        <w:spacing w:line="256" w:lineRule="auto"/>
         <w:rPr>
           <w:rFonts w:ascii="Aptos" w:eastAsia="Times New Roman" w:hAnsi="Aptos" w:cs="Times New Roman"/>
           <w:b/>
@@ -216,18 +421,32 @@
       <w:r>
         <w:rPr>
           <w:rFonts w:ascii="Aptos" w:eastAsia="Times New Roman" w:hAnsi="Aptos" w:cs="Times New Roman"/>
+          <w:lang w:eastAsia="it-IT"/>
+        </w:rPr>
+        <w:t>Titolo</w:t>
+      </w:r>
+      <w:r>
+        <w:rPr>
+          <w:rFonts w:ascii="Aptos" w:eastAsia="Times New Roman" w:hAnsi="Aptos" w:cs="Times New Roman"/>
           <w:b/>
           <w:bCs/>
           <w:lang w:eastAsia="it-IT"/>
         </w:rPr>
-        <w:t>Elementi Estetici</w:t>
+        <w:t xml:space="preserve"> </w:t>
+      </w:r>
+      <w:r>
+        <w:rPr>
+          <w:rFonts w:ascii="Aptos" w:eastAsia="Times New Roman" w:hAnsi="Aptos" w:cs="Times New Roman"/>
+          <w:lang w:eastAsia="it-IT"/>
+        </w:rPr>
+        <w:t>“Family Hub” al centro della barra superiore.</w:t>
       </w:r>
     </w:p>
     <w:p>
       <w:pPr>
         <w:numPr>
           <w:ilvl w:val="0"/>
-          <w:numId w:val="12"/>
+          <w:numId w:val="19"/>
         </w:numPr>
         <w:spacing w:line="256" w:lineRule="auto"/>
         <w:rPr>
@@ -240,34 +459,102 @@
           <w:rFonts w:ascii="Aptos" w:eastAsia="Times New Roman" w:hAnsi="Aptos" w:cs="Times New Roman"/>
           <w:lang w:eastAsia="it-IT"/>
         </w:rPr>
-        <w:t xml:space="preserve">In alto al centro titolo dell’app Family Hub </w:t>
+        <w:t>In alto a destra, un’icona circolare con l’iniziale del nome utente. Sotto l’icona, vengono visualizzati il nome e i punti accumulati.</w:t>
       </w:r>
     </w:p>
     <w:p>
       <w:pPr>
         <w:numPr>
           <w:ilvl w:val="0"/>
-          <w:numId w:val="12"/>
+          <w:numId w:val="19"/>
         </w:numPr>
         <w:spacing w:line="256" w:lineRule="auto"/>
         <w:rPr>
           <w:rFonts w:ascii="Aptos" w:eastAsia="Times New Roman" w:hAnsi="Aptos" w:cs="Times New Roman"/>
-          <w:lang w:eastAsia="it-IT"/>
-        </w:rPr>
-      </w:pPr>
-      <w:r>
-        <w:rPr>
-          <w:rFonts w:ascii="Aptos" w:eastAsia="Times New Roman" w:hAnsi="Aptos" w:cs="Times New Roman"/>
-          <w:lang w:eastAsia="it-IT"/>
-        </w:rPr>
-        <w:t>In alto a destra icona utente rotonda con all’interno lettera iniziale dell’utente, al di sotto punti accumulati e nome dell’utente</w:t>
+          <w:b/>
+          <w:bCs/>
+          <w:lang w:eastAsia="it-IT"/>
+        </w:rPr>
+      </w:pPr>
+      <w:r>
+        <w:rPr>
+          <w:rFonts w:ascii="Aptos" w:eastAsia="Times New Roman" w:hAnsi="Aptos" w:cs="Times New Roman"/>
+          <w:lang w:eastAsia="it-IT"/>
+        </w:rPr>
+        <w:t xml:space="preserve">Un’icona che apre un menu </w:t>
+      </w:r>
+      <w:r>
+        <w:rPr>
+          <w:rFonts w:ascii="Aptos" w:eastAsia="Times New Roman" w:hAnsi="Aptos" w:cs="Times New Roman"/>
+          <w:lang w:eastAsia="it-IT"/>
+        </w:rPr>
+        <w:t xml:space="preserve">impostazioni (OPZIONALE) </w:t>
+      </w:r>
+      <w:r>
+        <w:rPr>
+          <w:rFonts w:ascii="Aptos" w:eastAsia="Times New Roman" w:hAnsi="Aptos" w:cs="Times New Roman"/>
+          <w:lang w:eastAsia="it-IT"/>
+        </w:rPr>
+        <w:t xml:space="preserve">con le opzioni </w:t>
+      </w:r>
+      <w:r>
+        <w:rPr>
+          <w:rFonts w:ascii="Aptos" w:eastAsia="Times New Roman" w:hAnsi="Aptos" w:cs="Times New Roman"/>
+          <w:i/>
+          <w:iCs/>
+          <w:lang w:eastAsia="it-IT"/>
+        </w:rPr>
+        <w:t>"Modifica nome utente"</w:t>
+      </w:r>
+      <w:r>
+        <w:rPr>
+          <w:rFonts w:ascii="Aptos" w:eastAsia="Times New Roman" w:hAnsi="Aptos" w:cs="Times New Roman"/>
+          <w:lang w:eastAsia="it-IT"/>
+        </w:rPr>
+        <w:t xml:space="preserve"> e </w:t>
+      </w:r>
+      <w:r>
+        <w:rPr>
+          <w:rFonts w:ascii="Aptos" w:eastAsia="Times New Roman" w:hAnsi="Aptos" w:cs="Times New Roman"/>
+          <w:i/>
+          <w:iCs/>
+          <w:lang w:eastAsia="it-IT"/>
+        </w:rPr>
+        <w:t>"Logout"</w:t>
+      </w:r>
+      <w:r>
+        <w:rPr>
+          <w:rFonts w:ascii="Aptos" w:eastAsia="Times New Roman" w:hAnsi="Aptos" w:cs="Times New Roman"/>
+          <w:lang w:eastAsia="it-IT"/>
+        </w:rPr>
+        <w:t>.</w:t>
       </w:r>
     </w:p>
     <w:p>
       <w:pPr>
+        <w:spacing w:line="256" w:lineRule="auto"/>
+        <w:rPr>
+          <w:rFonts w:ascii="Aptos" w:eastAsia="Times New Roman" w:hAnsi="Aptos" w:cs="Times New Roman"/>
+          <w:b/>
+          <w:bCs/>
+          <w:lang w:eastAsia="it-IT"/>
+        </w:rPr>
+      </w:pPr>
+      <w:r>
+        <w:rPr>
+          <w:rFonts w:ascii="Aptos" w:eastAsia="Times New Roman" w:hAnsi="Aptos" w:cs="Times New Roman"/>
+          <w:b/>
+          <w:bCs/>
+          <w:lang w:eastAsia="it-IT"/>
+        </w:rPr>
+        <w:t>Sezione Classifica</w:t>
+      </w:r>
+    </w:p>
+    <w:p>
+      <w:pPr>
         <w:numPr>
           <w:ilvl w:val="0"/>
-          <w:numId w:val="12"/>
+          <w:numId w:val="20"/>
         </w:numPr>
         <w:spacing w:line="256" w:lineRule="auto"/>
         <w:rPr>
@@ -280,11 +567,31 @@
           <w:rFonts w:ascii="Aptos" w:eastAsia="Times New Roman" w:hAnsi="Aptos" w:cs="Times New Roman"/>
           <w:lang w:eastAsia="it-IT"/>
         </w:rPr>
-        <w:t>Icona impostazioni con opzione “Modifica nome utente” e “logout” (OPZIONALE)</w:t>
+        <w:t>Posizionata a sinistra della schermata principale.</w:t>
       </w:r>
     </w:p>
     <w:p>
       <w:pPr>
+        <w:numPr>
+          <w:ilvl w:val="0"/>
+          <w:numId w:val="20"/>
+        </w:numPr>
+        <w:spacing w:line="256" w:lineRule="auto"/>
+        <w:rPr>
+          <w:rFonts w:ascii="Aptos" w:eastAsia="Times New Roman" w:hAnsi="Aptos" w:cs="Times New Roman"/>
+          <w:lang w:eastAsia="it-IT"/>
+        </w:rPr>
+      </w:pPr>
+      <w:r>
+        <w:rPr>
+          <w:rFonts w:ascii="Aptos" w:eastAsia="Times New Roman" w:hAnsi="Aptos" w:cs="Times New Roman"/>
+          <w:lang w:eastAsia="it-IT"/>
+        </w:rPr>
+        <w:t>Contiene una tabella con la classifica degli utenti, ordinata per il totale di punti accumulati.</w:t>
+      </w:r>
+    </w:p>
+    <w:p>
+      <w:pPr>
         <w:spacing w:line="256" w:lineRule="auto"/>
         <w:rPr>
           <w:rFonts w:ascii="Aptos" w:eastAsia="Times New Roman" w:hAnsi="Aptos" w:cs="Times New Roman"/>
@@ -300,30 +607,55 @@
           <w:bCs/>
           <w:lang w:eastAsia="it-IT"/>
         </w:rPr>
-        <w:t>Sezione Classifica</w:t>
+        <w:t>Sezione Premi</w:t>
       </w:r>
     </w:p>
     <w:p>
       <w:pPr>
         <w:numPr>
           <w:ilvl w:val="0"/>
-          <w:numId w:val="13"/>
+          <w:numId w:val="21"/>
         </w:numPr>
         <w:spacing w:line="256" w:lineRule="auto"/>
         <w:rPr>
-          <w:rFonts w:ascii="Aptos" w:eastAsia="Aptos" w:hAnsi="Aptos" w:cs="Times New Roman"/>
-        </w:rPr>
-      </w:pPr>
-      <w:r>
-        <w:rPr>
-          <w:rFonts w:ascii="Aptos" w:eastAsia="Times New Roman" w:hAnsi="Aptos" w:cs="Times New Roman"/>
-          <w:lang w:eastAsia="it-IT"/>
-        </w:rPr>
-        <w:t>A sinistra della schermata principale, una tabella con la classifica degli utenti in base al totale di punti accumulati</w:t>
+          <w:rFonts w:ascii="Aptos" w:eastAsia="Times New Roman" w:hAnsi="Aptos" w:cs="Times New Roman"/>
+          <w:lang w:eastAsia="it-IT"/>
+        </w:rPr>
+      </w:pPr>
+      <w:r>
+        <w:rPr>
+          <w:rFonts w:ascii="Aptos" w:eastAsia="Times New Roman" w:hAnsi="Aptos" w:cs="Times New Roman"/>
+          <w:lang w:eastAsia="it-IT"/>
+        </w:rPr>
+        <w:t>Situata al centro-sinistra dello schermo.</w:t>
       </w:r>
     </w:p>
     <w:p>
       <w:pPr>
+        <w:numPr>
+          <w:ilvl w:val="0"/>
+          <w:numId w:val="21"/>
+        </w:numPr>
+        <w:spacing w:line="256" w:lineRule="auto"/>
+        <w:rPr>
+          <w:rFonts w:ascii="Aptos" w:eastAsia="Times New Roman" w:hAnsi="Aptos" w:cs="Times New Roman"/>
+          <w:lang w:eastAsia="it-IT"/>
+        </w:rPr>
+      </w:pPr>
+      <w:r>
+        <w:rPr>
+          <w:rFonts w:ascii="Aptos" w:eastAsia="Times New Roman" w:hAnsi="Aptos" w:cs="Times New Roman"/>
+          <w:lang w:eastAsia="it-IT"/>
+        </w:rPr>
+        <w:t xml:space="preserve">Cliccandola, si espande in due liste: </w:t>
+      </w:r>
+    </w:p>
+    <w:p>
+      <w:pPr>
+        <w:numPr>
+          <w:ilvl w:val="1"/>
+          <w:numId w:val="23"/>
+        </w:numPr>
         <w:spacing w:line="256" w:lineRule="auto"/>
         <w:rPr>
           <w:rFonts w:ascii="Aptos" w:eastAsia="Times New Roman" w:hAnsi="Aptos" w:cs="Times New Roman"/>
@@ -335,15 +667,33 @@
       <w:r>
         <w:rPr>
           <w:rFonts w:ascii="Aptos" w:eastAsia="Times New Roman" w:hAnsi="Aptos" w:cs="Times New Roman"/>
+          <w:lang w:eastAsia="it-IT"/>
+        </w:rPr>
+        <w:t>Premi già riscossi:</w:t>
+      </w:r>
+      <w:r>
+        <w:rPr>
+          <w:rFonts w:ascii="Aptos" w:eastAsia="Times New Roman" w:hAnsi="Aptos" w:cs="Times New Roman"/>
           <w:b/>
           <w:bCs/>
           <w:lang w:eastAsia="it-IT"/>
         </w:rPr>
-        <w:t>Sezione Premi</w:t>
+        <w:t xml:space="preserve"> </w:t>
+      </w:r>
+      <w:r>
+        <w:rPr>
+          <w:rFonts w:ascii="Aptos" w:eastAsia="Times New Roman" w:hAnsi="Aptos" w:cs="Times New Roman"/>
+          <w:lang w:eastAsia="it-IT"/>
+        </w:rPr>
+        <w:t>Mostra il nome del premio e la data di riscossione.</w:t>
       </w:r>
     </w:p>
     <w:p>
       <w:pPr>
+        <w:numPr>
+          <w:ilvl w:val="1"/>
+          <w:numId w:val="23"/>
+        </w:numPr>
         <w:spacing w:line="256" w:lineRule="auto"/>
         <w:rPr>
           <w:rFonts w:ascii="Aptos" w:eastAsia="Times New Roman" w:hAnsi="Aptos" w:cs="Times New Roman"/>
@@ -355,14 +705,133 @@
           <w:rFonts w:ascii="Aptos" w:eastAsia="Times New Roman" w:hAnsi="Aptos" w:cs="Times New Roman"/>
           <w:lang w:eastAsia="it-IT"/>
         </w:rPr>
-        <w:t>Situata al centro-sinistra dello schermo, se cliccata si suddivide in due liste:</w:t>
+        <w:t>Premi disponibili:</w:t>
+      </w:r>
+      <w:r>
+        <w:rPr>
+          <w:rFonts w:ascii="Aptos" w:eastAsia="Times New Roman" w:hAnsi="Aptos" w:cs="Times New Roman"/>
+          <w:b/>
+          <w:bCs/>
+          <w:lang w:eastAsia="it-IT"/>
+        </w:rPr>
+        <w:t xml:space="preserve"> </w:t>
+      </w:r>
+      <w:r>
+        <w:rPr>
+          <w:rFonts w:ascii="Aptos" w:eastAsia="Times New Roman" w:hAnsi="Aptos" w:cs="Times New Roman"/>
+          <w:lang w:eastAsia="it-IT"/>
+        </w:rPr>
+        <w:t>Contiene un pulsante “riscatta”</w:t>
+      </w:r>
+      <w:r>
+        <w:rPr>
+          <w:rFonts w:ascii="Aptos" w:eastAsia="Times New Roman" w:hAnsi="Aptos" w:cs="Times New Roman"/>
+          <w:lang w:eastAsia="it-IT"/>
+        </w:rPr>
+        <w:t>,</w:t>
+      </w:r>
+      <w:r>
+        <w:rPr>
+          <w:rFonts w:ascii="Aptos" w:eastAsia="Times New Roman" w:hAnsi="Aptos" w:cs="Times New Roman"/>
+          <w:lang w:eastAsia="it-IT"/>
+        </w:rPr>
+        <w:t xml:space="preserve"> attivo solo se l'utente ha abbastanza punti.</w:t>
       </w:r>
     </w:p>
     <w:p>
       <w:pPr>
+        <w:spacing w:before="100" w:beforeAutospacing="1" w:after="100" w:afterAutospacing="1" w:line="240" w:lineRule="auto"/>
+        <w:rPr>
+          <w:rFonts w:ascii="Aptos" w:eastAsia="Times New Roman" w:hAnsi="Aptos" w:cs="Times New Roman"/>
+          <w:b/>
+          <w:bCs/>
+          <w:lang w:eastAsia="it-IT"/>
+        </w:rPr>
+      </w:pPr>
+      <w:r>
+        <w:rPr>
+          <w:rFonts w:ascii="Aptos" w:eastAsia="Times New Roman" w:hAnsi="Aptos" w:cs="Times New Roman"/>
+          <w:b/>
+          <w:bCs/>
+          <w:lang w:eastAsia="it-IT"/>
+        </w:rPr>
+        <w:t>Sezione Obiettivi</w:t>
+      </w:r>
+    </w:p>
+    <w:p>
+      <w:pPr>
+        <w:spacing w:line="256" w:lineRule="auto"/>
+        <w:rPr>
+          <w:rFonts w:ascii="Aptos" w:eastAsia="Times New Roman" w:hAnsi="Aptos" w:cs="Times New Roman"/>
+          <w:lang w:eastAsia="it-IT"/>
+        </w:rPr>
+      </w:pPr>
+      <w:r>
+        <w:rPr>
+          <w:rFonts w:ascii="Aptos" w:eastAsia="Times New Roman" w:hAnsi="Aptos" w:cs="Times New Roman"/>
+          <w:lang w:eastAsia="it-IT"/>
+        </w:rPr>
+        <w:t xml:space="preserve">Gli obiettivi sono suddivisi prima per frequenza (settimanali/mensili/annuali/occasionali), poi ogni tabella (ad es. obiettivi settimanali) sarà distinta in due liste (potrei anche inserire in modo OPZIONALE </w:t>
+      </w:r>
+      <w:r>
+        <w:rPr>
+          <w:rFonts w:ascii="Aptos" w:eastAsia="Times New Roman" w:hAnsi="Aptos" w:cs="Times New Roman"/>
+          <w:lang w:eastAsia="it-IT"/>
+        </w:rPr>
+        <w:t xml:space="preserve">un’unica </w:t>
+      </w:r>
+      <w:proofErr w:type="gramStart"/>
+      <w:r>
+        <w:rPr>
+          <w:rFonts w:ascii="Aptos" w:eastAsia="Times New Roman" w:hAnsi="Aptos" w:cs="Times New Roman"/>
+          <w:lang w:eastAsia="it-IT"/>
+        </w:rPr>
+        <w:t>lista</w:t>
+      </w:r>
+      <w:proofErr w:type="gramEnd"/>
+      <w:r>
+        <w:rPr>
+          <w:rFonts w:ascii="Aptos" w:eastAsia="Times New Roman" w:hAnsi="Aptos" w:cs="Times New Roman"/>
+          <w:lang w:eastAsia="it-IT"/>
+        </w:rPr>
+        <w:t xml:space="preserve"> </w:t>
+      </w:r>
+      <w:r>
+        <w:rPr>
+          <w:rFonts w:ascii="Aptos" w:eastAsia="Times New Roman" w:hAnsi="Aptos" w:cs="Times New Roman"/>
+          <w:b/>
+          <w:bCs/>
+          <w:lang w:eastAsia="it-IT"/>
+        </w:rPr>
+        <w:t>Tutti</w:t>
+      </w:r>
+      <w:r>
+        <w:rPr>
+          <w:rFonts w:ascii="Aptos" w:eastAsia="Times New Roman" w:hAnsi="Aptos" w:cs="Times New Roman"/>
+          <w:lang w:eastAsia="it-IT"/>
+        </w:rPr>
+        <w:t xml:space="preserve"> che</w:t>
+      </w:r>
+      <w:r>
+        <w:rPr>
+          <w:rFonts w:ascii="Aptos" w:eastAsia="Times New Roman" w:hAnsi="Aptos" w:cs="Times New Roman"/>
+          <w:lang w:eastAsia="it-IT"/>
+        </w:rPr>
+        <w:t xml:space="preserve"> permette di visualizzare tutti gli obiettivi di una categoria senza distinzione tra attività e sfide.</w:t>
+      </w:r>
+      <w:r>
+        <w:rPr>
+          <w:rFonts w:ascii="Aptos" w:eastAsia="Times New Roman" w:hAnsi="Aptos" w:cs="Times New Roman"/>
+          <w:lang w:eastAsia="it-IT"/>
+        </w:rPr>
+        <w:t>) :</w:t>
+      </w:r>
+    </w:p>
+    <w:p>
+      <w:pPr>
         <w:numPr>
           <w:ilvl w:val="1"/>
-          <w:numId w:val="14"/>
+          <w:numId w:val="11"/>
         </w:numPr>
         <w:spacing w:line="256" w:lineRule="auto"/>
         <w:rPr>
@@ -373,16 +842,25 @@
       <w:r>
         <w:rPr>
           <w:rFonts w:ascii="Aptos" w:eastAsia="Times New Roman" w:hAnsi="Aptos" w:cs="Times New Roman"/>
-          <w:lang w:eastAsia="it-IT"/>
-        </w:rPr>
-        <w:t>Premi già riscossi, con nome premio e data di riscossione</w:t>
+          <w:b/>
+          <w:bCs/>
+          <w:lang w:eastAsia="it-IT"/>
+        </w:rPr>
+        <w:t>Attività</w:t>
+      </w:r>
+      <w:r>
+        <w:rPr>
+          <w:rFonts w:ascii="Aptos" w:eastAsia="Times New Roman" w:hAnsi="Aptos" w:cs="Times New Roman"/>
+          <w:lang w:eastAsia="it-IT"/>
+        </w:rPr>
+        <w:t xml:space="preserve"> (da completare/completate)</w:t>
       </w:r>
     </w:p>
     <w:p>
       <w:pPr>
         <w:numPr>
           <w:ilvl w:val="1"/>
-          <w:numId w:val="14"/>
+          <w:numId w:val="11"/>
         </w:numPr>
         <w:spacing w:line="256" w:lineRule="auto"/>
         <w:rPr>
@@ -393,9 +871,19 @@
       <w:r>
         <w:rPr>
           <w:rFonts w:ascii="Aptos" w:eastAsia="Times New Roman" w:hAnsi="Aptos" w:cs="Times New Roman"/>
-          <w:lang w:eastAsia="it-IT"/>
-        </w:rPr>
-        <w:t>Premi disponibili (con nome premio e pulsante “Riscatta”, attivo solo se l’utente ha abbastanza punti)</w:t>
+          <w:b/>
+          <w:bCs/>
+          <w:lang w:eastAsia="it-IT"/>
+        </w:rPr>
+        <w:lastRenderedPageBreak/>
+        <w:t>Sfide</w:t>
+      </w:r>
+      <w:r>
+        <w:rPr>
+          <w:rFonts w:ascii="Aptos" w:eastAsia="Times New Roman" w:hAnsi="Aptos" w:cs="Times New Roman"/>
+          <w:lang w:eastAsia="it-IT"/>
+        </w:rPr>
+        <w:t xml:space="preserve"> (da completare/completate)</w:t>
       </w:r>
     </w:p>
     <w:p>
@@ -403,6 +891,70 @@
         <w:spacing w:before="100" w:beforeAutospacing="1" w:after="100" w:afterAutospacing="1" w:line="240" w:lineRule="auto"/>
         <w:rPr>
           <w:rFonts w:ascii="Aptos" w:eastAsia="Times New Roman" w:hAnsi="Aptos" w:cs="Times New Roman"/>
+          <w:lang w:eastAsia="it-IT"/>
+        </w:rPr>
+      </w:pPr>
+      <w:r>
+        <w:rPr>
+          <w:rFonts w:ascii="Aptos" w:eastAsia="Times New Roman" w:hAnsi="Aptos" w:cs="Times New Roman"/>
+          <w:lang w:eastAsia="it-IT"/>
+        </w:rPr>
+        <w:t>Cliccando su attività o su sfide mostro di default prima gli obiettivi da completare, poi avrò un pulsante per aggiornare lo stato del mio obiettivo (ad esempio “Segna come completato”).</w:t>
+      </w:r>
+      <w:r>
+        <w:rPr>
+          <w:rFonts w:ascii="Aptos" w:eastAsia="Times New Roman" w:hAnsi="Aptos" w:cs="Times New Roman"/>
+          <w:lang w:eastAsia="it-IT"/>
+        </w:rPr>
+        <w:br/>
+        <w:t xml:space="preserve">Gli obiettivi completati e da completare hanno due colori diversi. </w:t>
+      </w:r>
+      <w:r>
+        <w:rPr>
+          <w:rFonts w:ascii="Aptos" w:eastAsia="Times New Roman" w:hAnsi="Aptos" w:cs="Times New Roman"/>
+          <w:lang w:eastAsia="it-IT"/>
+        </w:rPr>
+        <w:br/>
+        <w:t>Gli obiettivi scaduti o le sfide rifiutate non vengono visualizzati…</w:t>
+      </w:r>
+    </w:p>
+    <w:p>
+      <w:pPr>
+        <w:spacing w:before="100" w:beforeAutospacing="1" w:after="100" w:afterAutospacing="1" w:line="240" w:lineRule="auto"/>
+        <w:rPr>
+          <w:rFonts w:ascii="Aptos" w:eastAsia="Times New Roman" w:hAnsi="Aptos" w:cs="Times New Roman"/>
+          <w:lang w:eastAsia="it-IT"/>
+        </w:rPr>
+      </w:pPr>
+      <w:r>
+        <w:rPr>
+          <w:rFonts w:ascii="Aptos" w:eastAsia="Times New Roman" w:hAnsi="Aptos" w:cs="Times New Roman"/>
+          <w:lang w:eastAsia="it-IT"/>
+        </w:rPr>
+        <w:t xml:space="preserve">Inserisco una Progress Bar che mostra la percentuale di completamento degli obiettivi in base alla loro frequenza (settimanale, mensile, annuale). Quindi avrò </w:t>
+      </w:r>
+      <w:proofErr w:type="gramStart"/>
+      <w:r>
+        <w:rPr>
+          <w:rFonts w:ascii="Aptos" w:eastAsia="Times New Roman" w:hAnsi="Aptos" w:cs="Times New Roman"/>
+          <w:lang w:eastAsia="it-IT"/>
+        </w:rPr>
+        <w:t>3</w:t>
+      </w:r>
+      <w:proofErr w:type="gramEnd"/>
+      <w:r>
+        <w:rPr>
+          <w:rFonts w:ascii="Aptos" w:eastAsia="Times New Roman" w:hAnsi="Aptos" w:cs="Times New Roman"/>
+          <w:lang w:eastAsia="it-IT"/>
+        </w:rPr>
+        <w:t xml:space="preserve"> diverse progress bar, che cambiano di colore in base alla percentuale di caricamento (Bootstrap)</w:t>
+      </w:r>
+    </w:p>
+    <w:p>
+      <w:pPr>
+        <w:spacing w:line="256" w:lineRule="auto"/>
+        <w:rPr>
+          <w:rFonts w:ascii="Aptos" w:eastAsia="Times New Roman" w:hAnsi="Aptos" w:cs="Times New Roman"/>
           <w:b/>
           <w:bCs/>
           <w:lang w:eastAsia="it-IT"/>
@@ -411,33 +963,39 @@
       <w:r>
         <w:rPr>
           <w:rFonts w:ascii="Aptos" w:eastAsia="Times New Roman" w:hAnsi="Aptos" w:cs="Times New Roman"/>
-          <w:lang w:eastAsia="it-IT"/>
-        </w:rPr>
-        <w:t>Progress bar che mostra quanti punti mancano al prossimo premio (opzionale, per motivare gli utenti)</w:t>
+          <w:b/>
+          <w:bCs/>
+          <w:lang w:eastAsia="it-IT"/>
+        </w:rPr>
+        <w:t>Funzionalità Grafiche da Implementare (con Bootstrap)</w:t>
       </w:r>
     </w:p>
     <w:p>
       <w:pPr>
-        <w:spacing w:before="100" w:beforeAutospacing="1" w:after="100" w:afterAutospacing="1" w:line="240" w:lineRule="auto"/>
-        <w:rPr>
-          <w:rFonts w:ascii="Aptos" w:eastAsia="Times New Roman" w:hAnsi="Aptos" w:cs="Times New Roman"/>
-          <w:b/>
-          <w:bCs/>
-          <w:lang w:eastAsia="it-IT"/>
-        </w:rPr>
-      </w:pPr>
-      <w:r>
-        <w:rPr>
-          <w:rFonts w:ascii="Aptos" w:eastAsia="Times New Roman" w:hAnsi="Aptos" w:cs="Times New Roman"/>
-          <w:b/>
-          <w:bCs/>
-          <w:lang w:eastAsia="it-IT"/>
-        </w:rPr>
-        <w:t>Sezione Obiettivi</w:t>
+        <w:numPr>
+          <w:ilvl w:val="0"/>
+          <w:numId w:val="22"/>
+        </w:numPr>
+        <w:spacing w:line="256" w:lineRule="auto"/>
+        <w:rPr>
+          <w:rFonts w:ascii="Aptos" w:eastAsia="Times New Roman" w:hAnsi="Aptos" w:cs="Times New Roman"/>
+          <w:lang w:eastAsia="it-IT"/>
+        </w:rPr>
+      </w:pPr>
+      <w:r>
+        <w:rPr>
+          <w:rFonts w:ascii="Aptos" w:eastAsia="Times New Roman" w:hAnsi="Aptos" w:cs="Times New Roman"/>
+          <w:lang w:eastAsia="it-IT"/>
+        </w:rPr>
+        <w:t>Tables → Per la classifica utenti e la gestione dei premi.</w:t>
       </w:r>
     </w:p>
     <w:p>
       <w:pPr>
+        <w:numPr>
+          <w:ilvl w:val="0"/>
+          <w:numId w:val="22"/>
+        </w:numPr>
         <w:spacing w:line="256" w:lineRule="auto"/>
         <w:rPr>
           <w:rFonts w:ascii="Aptos" w:eastAsia="Times New Roman" w:hAnsi="Aptos" w:cs="Times New Roman"/>
@@ -449,30 +1007,14 @@
           <w:rFonts w:ascii="Aptos" w:eastAsia="Times New Roman" w:hAnsi="Aptos" w:cs="Times New Roman"/>
           <w:lang w:eastAsia="it-IT"/>
         </w:rPr>
-        <w:t xml:space="preserve">Gli obiettivi sono suddivisi prima per frequenza (settimanali/mensili/annuali/occasionali), poi ogni tabella (ad es. obiettivi settimanali) sarà distinta in due liste (potrei anche inserire in modo OPZIONALE una terza lista </w:t>
-      </w:r>
-      <w:r>
-        <w:rPr>
-          <w:rFonts w:ascii="Aptos" w:eastAsia="Times New Roman" w:hAnsi="Aptos" w:cs="Times New Roman"/>
-          <w:b/>
-          <w:bCs/>
-          <w:lang w:eastAsia="it-IT"/>
-        </w:rPr>
-        <w:t>Tutto</w:t>
-      </w:r>
-      <w:r>
-        <w:rPr>
-          <w:rFonts w:ascii="Aptos" w:eastAsia="Times New Roman" w:hAnsi="Aptos" w:cs="Times New Roman"/>
-          <w:lang w:eastAsia="it-IT"/>
-        </w:rPr>
-        <w:t xml:space="preserve"> in cui l’utente visualizza tutti gli obiettivi della settimana/mese/anno…, senza distinzioni tra attività e sfide) :</w:t>
+        <w:t>Modals → Per mostrare dettagli o conferme di azioni.</w:t>
       </w:r>
     </w:p>
     <w:p>
       <w:pPr>
         <w:numPr>
-          <w:ilvl w:val="1"/>
-          <w:numId w:val="15"/>
+          <w:ilvl w:val="0"/>
+          <w:numId w:val="22"/>
         </w:numPr>
         <w:spacing w:line="256" w:lineRule="auto"/>
         <w:rPr>
@@ -483,25 +1025,16 @@
       <w:r>
         <w:rPr>
           <w:rFonts w:ascii="Aptos" w:eastAsia="Times New Roman" w:hAnsi="Aptos" w:cs="Times New Roman"/>
-          <w:b/>
-          <w:bCs/>
-          <w:lang w:eastAsia="it-IT"/>
-        </w:rPr>
-        <w:t>Attività</w:t>
-      </w:r>
-      <w:r>
-        <w:rPr>
-          <w:rFonts w:ascii="Aptos" w:eastAsia="Times New Roman" w:hAnsi="Aptos" w:cs="Times New Roman"/>
-          <w:lang w:eastAsia="it-IT"/>
-        </w:rPr>
-        <w:t xml:space="preserve"> (da completare/completate)</w:t>
+          <w:lang w:eastAsia="it-IT"/>
+        </w:rPr>
+        <w:t>Progress Bar → Per visualizzare i progressi degli obiettivi e i punti per riscattare premi.</w:t>
       </w:r>
     </w:p>
     <w:p>
       <w:pPr>
         <w:numPr>
-          <w:ilvl w:val="1"/>
-          <w:numId w:val="15"/>
+          <w:ilvl w:val="0"/>
+          <w:numId w:val="22"/>
         </w:numPr>
         <w:spacing w:line="256" w:lineRule="auto"/>
         <w:rPr>
@@ -512,311 +1045,113 @@
       <w:r>
         <w:rPr>
           <w:rFonts w:ascii="Aptos" w:eastAsia="Times New Roman" w:hAnsi="Aptos" w:cs="Times New Roman"/>
-          <w:b/>
-          <w:bCs/>
-          <w:lang w:eastAsia="it-IT"/>
-        </w:rPr>
-        <w:t>Sfide</w:t>
-      </w:r>
-      <w:r>
-        <w:rPr>
-          <w:rFonts w:ascii="Aptos" w:eastAsia="Times New Roman" w:hAnsi="Aptos" w:cs="Times New Roman"/>
-          <w:lang w:eastAsia="it-IT"/>
-        </w:rPr>
-        <w:t xml:space="preserve"> (da completare/completate)</w:t>
+          <w:lang w:eastAsia="it-IT"/>
+        </w:rPr>
+        <w:t>Forms → Per il login e la registrazione dell’utente.</w:t>
       </w:r>
     </w:p>
     <w:p>
       <w:pPr>
-        <w:spacing w:before="100" w:beforeAutospacing="1" w:after="100" w:afterAutospacing="1" w:line="240" w:lineRule="auto"/>
-        <w:rPr>
-          <w:rFonts w:ascii="Aptos" w:eastAsia="Times New Roman" w:hAnsi="Aptos" w:cs="Times New Roman"/>
-          <w:lang w:eastAsia="it-IT"/>
-        </w:rPr>
-      </w:pPr>
-      <w:r>
-        <w:rPr>
-          <w:rFonts w:ascii="Aptos" w:eastAsia="Times New Roman" w:hAnsi="Aptos" w:cs="Times New Roman"/>
-          <w:lang w:eastAsia="it-IT"/>
-        </w:rPr>
-        <w:t>Cliccando su attività o su sfide mostro di default prima gli obiettivi da completare, poi avrò un pulsante per aggiornare lo stato del mio obiettivo (ad esempio “Segna come completato”).</w:t>
-      </w:r>
-      <w:r>
-        <w:rPr>
-          <w:rFonts w:ascii="Aptos" w:eastAsia="Times New Roman" w:hAnsi="Aptos" w:cs="Times New Roman"/>
-          <w:lang w:eastAsia="it-IT"/>
-        </w:rPr>
-        <w:br/>
-        <w:t xml:space="preserve">Gli obiettivi completati e da completare hanno due colori diversi. </w:t>
-      </w:r>
-      <w:r>
-        <w:rPr>
-          <w:rFonts w:ascii="Aptos" w:eastAsia="Times New Roman" w:hAnsi="Aptos" w:cs="Times New Roman"/>
-          <w:lang w:eastAsia="it-IT"/>
-        </w:rPr>
-        <w:br/>
-        <w:t>Gli obiettivi scaduti o le sfide rifiutate non vengono visualizzati…</w:t>
+        <w:numPr>
+          <w:ilvl w:val="0"/>
+          <w:numId w:val="22"/>
+        </w:numPr>
+        <w:spacing w:line="256" w:lineRule="auto"/>
+        <w:rPr>
+          <w:rFonts w:ascii="Aptos" w:eastAsia="Times New Roman" w:hAnsi="Aptos" w:cs="Times New Roman"/>
+          <w:lang w:eastAsia="it-IT"/>
+        </w:rPr>
+      </w:pPr>
+      <w:r>
+        <w:rPr>
+          <w:rFonts w:ascii="Aptos" w:eastAsia="Times New Roman" w:hAnsi="Aptos" w:cs="Times New Roman"/>
+          <w:lang w:eastAsia="it-IT"/>
+        </w:rPr>
+        <w:t>Select Form → Per scegliere un utente a cui lanciare una sfida.</w:t>
       </w:r>
     </w:p>
     <w:p>
       <w:pPr>
-        <w:spacing w:before="100" w:beforeAutospacing="1" w:after="100" w:afterAutospacing="1" w:line="240" w:lineRule="auto"/>
-        <w:rPr>
-          <w:rFonts w:ascii="Aptos" w:eastAsia="Times New Roman" w:hAnsi="Aptos" w:cs="Times New Roman"/>
-          <w:lang w:eastAsia="it-IT"/>
-        </w:rPr>
-      </w:pPr>
-      <w:r>
-        <w:rPr>
-          <w:rFonts w:ascii="Aptos" w:eastAsia="Times New Roman" w:hAnsi="Aptos" w:cs="Times New Roman"/>
-          <w:lang w:eastAsia="it-IT"/>
-        </w:rPr>
-        <w:lastRenderedPageBreak/>
-        <w:t>Inserisco una Progress Bar che mostra la percentuale di completamento degli obiettivi in base alla loro frequenza (settimanale, mensile, annuale). Quindi avrò 3 diverse progress bar, che cambiano di colore in base alla percentuale di caricamento (Bootstrap)</w:t>
+        <w:numPr>
+          <w:ilvl w:val="0"/>
+          <w:numId w:val="22"/>
+        </w:numPr>
+        <w:spacing w:line="256" w:lineRule="auto"/>
+        <w:rPr>
+          <w:rFonts w:ascii="Aptos" w:eastAsia="Times New Roman" w:hAnsi="Aptos" w:cs="Times New Roman"/>
+          <w:lang w:eastAsia="it-IT"/>
+        </w:rPr>
+      </w:pPr>
+      <w:r>
+        <w:rPr>
+          <w:rFonts w:ascii="Aptos" w:eastAsia="Times New Roman" w:hAnsi="Aptos" w:cs="Times New Roman"/>
+          <w:lang w:eastAsia="it-IT"/>
+        </w:rPr>
+        <w:t>Checkbox → Per il completamento di attività e sfide.</w:t>
       </w:r>
     </w:p>
     <w:p>
       <w:pPr>
-        <w:spacing w:before="100" w:beforeAutospacing="1" w:after="100" w:afterAutospacing="1" w:line="240" w:lineRule="auto"/>
-        <w:rPr>
-          <w:rFonts w:ascii="Aptos" w:eastAsia="Times New Roman" w:hAnsi="Aptos" w:cs="Times New Roman"/>
-          <w:b/>
-          <w:bCs/>
-          <w:color w:val="196B24" w:themeColor="accent3"/>
-          <w:lang w:eastAsia="it-IT"/>
-        </w:rPr>
-      </w:pPr>
-      <w:r>
-        <w:rPr>
-          <w:rFonts w:ascii="Aptos" w:eastAsia="Times New Roman" w:hAnsi="Aptos" w:cs="Times New Roman"/>
-          <w:b/>
-          <w:bCs/>
-          <w:color w:val="196B24" w:themeColor="accent3"/>
-          <w:lang w:eastAsia="it-IT"/>
-        </w:rPr>
-        <w:t>Funzionalità utili (da approfondire)</w:t>
-      </w:r>
-      <w:r>
-        <w:rPr>
-          <w:rFonts w:ascii="Aptos" w:eastAsia="Times New Roman" w:hAnsi="Aptos" w:cs="Times New Roman"/>
-          <w:b/>
-          <w:bCs/>
-          <w:color w:val="196B24" w:themeColor="accent3"/>
-          <w:lang w:eastAsia="it-IT"/>
-        </w:rPr>
-        <w:t xml:space="preserve"> per una migliore visualizzazione grafica</w:t>
-      </w:r>
-      <w:r>
-        <w:rPr>
-          <w:rFonts w:ascii="Aptos" w:eastAsia="Times New Roman" w:hAnsi="Aptos" w:cs="Times New Roman"/>
-          <w:b/>
-          <w:bCs/>
-          <w:color w:val="196B24" w:themeColor="accent3"/>
-          <w:lang w:eastAsia="it-IT"/>
-        </w:rPr>
-        <w:t xml:space="preserve"> </w:t>
-      </w:r>
-      <w:r>
-        <w:rPr>
-          <w:rFonts w:ascii="Aptos" w:eastAsia="Times New Roman" w:hAnsi="Aptos" w:cs="Times New Roman"/>
-          <w:b/>
-          <w:bCs/>
-          <w:color w:val="196B24" w:themeColor="accent3"/>
-          <w:lang w:eastAsia="it-IT"/>
-        </w:rPr>
-        <w:t xml:space="preserve">(con </w:t>
-      </w:r>
-      <w:r>
-        <w:rPr>
-          <w:rFonts w:ascii="Aptos" w:eastAsia="Times New Roman" w:hAnsi="Aptos" w:cs="Times New Roman"/>
-          <w:b/>
-          <w:bCs/>
-          <w:color w:val="196B24" w:themeColor="accent3"/>
-          <w:lang w:eastAsia="it-IT"/>
-        </w:rPr>
-        <w:t xml:space="preserve">Bootstrap </w:t>
-      </w:r>
-      <w:r>
-        <w:rPr>
-          <w:rFonts w:ascii="Aptos" w:eastAsia="Times New Roman" w:hAnsi="Aptos" w:cs="Times New Roman"/>
-          <w:b/>
-          <w:bCs/>
-          <w:color w:val="196B24" w:themeColor="accent3"/>
-          <w:lang w:eastAsia="it-IT"/>
-        </w:rPr>
-        <w:t>)</w:t>
+        <w:numPr>
+          <w:ilvl w:val="0"/>
+          <w:numId w:val="22"/>
+        </w:numPr>
+        <w:spacing w:line="256" w:lineRule="auto"/>
+        <w:rPr>
+          <w:rFonts w:ascii="Aptos" w:eastAsia="Times New Roman" w:hAnsi="Aptos" w:cs="Times New Roman"/>
+          <w:lang w:eastAsia="it-IT"/>
+        </w:rPr>
+      </w:pPr>
+      <w:r>
+        <w:rPr>
+          <w:rFonts w:ascii="Aptos" w:eastAsia="Times New Roman" w:hAnsi="Aptos" w:cs="Times New Roman"/>
+          <w:lang w:eastAsia="it-IT"/>
+        </w:rPr>
+        <w:t>Buttons → Per accettare/rifiutare sfide (opzionale).</w:t>
       </w:r>
     </w:p>
     <w:p>
       <w:pPr>
         <w:numPr>
           <w:ilvl w:val="0"/>
-          <w:numId w:val="16"/>
+          <w:numId w:val="22"/>
         </w:numPr>
-        <w:spacing w:before="100" w:beforeAutospacing="1" w:after="100" w:afterAutospacing="1" w:line="240" w:lineRule="auto"/>
-        <w:contextualSpacing/>
-        <w:rPr>
-          <w:rFonts w:ascii="Aptos" w:eastAsia="Times New Roman" w:hAnsi="Aptos" w:cs="Times New Roman"/>
-          <w:color w:val="000000" w:themeColor="text1"/>
-          <w:lang w:eastAsia="it-IT"/>
-        </w:rPr>
-      </w:pPr>
-      <w:r>
-        <w:rPr>
-          <w:rFonts w:ascii="Aptos" w:eastAsia="Times New Roman" w:hAnsi="Aptos" w:cs="Times New Roman"/>
-          <w:color w:val="000000" w:themeColor="text1"/>
-          <w:lang w:eastAsia="it-IT"/>
-        </w:rPr>
-        <w:t>Tables</w:t>
+        <w:spacing w:line="256" w:lineRule="auto"/>
+        <w:rPr>
+          <w:rFonts w:ascii="Aptos" w:eastAsia="Times New Roman" w:hAnsi="Aptos" w:cs="Times New Roman"/>
+          <w:lang w:eastAsia="it-IT"/>
+        </w:rPr>
+      </w:pPr>
+      <w:r>
+        <w:rPr>
+          <w:rFonts w:ascii="Aptos" w:eastAsia="Times New Roman" w:hAnsi="Aptos" w:cs="Times New Roman"/>
+          <w:lang w:eastAsia="it-IT"/>
+        </w:rPr>
+        <w:t>Spinners → Per il caricamento delle pagine.</w:t>
       </w:r>
     </w:p>
     <w:p>
       <w:pPr>
         <w:numPr>
           <w:ilvl w:val="0"/>
-          <w:numId w:val="16"/>
+          <w:numId w:val="22"/>
         </w:numPr>
-        <w:spacing w:before="100" w:beforeAutospacing="1" w:after="100" w:afterAutospacing="1" w:line="240" w:lineRule="auto"/>
-        <w:contextualSpacing/>
-        <w:rPr>
-          <w:rFonts w:ascii="Aptos" w:eastAsia="Times New Roman" w:hAnsi="Aptos" w:cs="Times New Roman"/>
-          <w:color w:val="000000" w:themeColor="text1"/>
-          <w:lang w:eastAsia="it-IT"/>
-        </w:rPr>
-      </w:pPr>
-      <w:r>
-        <w:rPr>
-          <w:rFonts w:ascii="Aptos" w:eastAsia="Times New Roman" w:hAnsi="Aptos" w:cs="Times New Roman"/>
-          <w:color w:val="000000" w:themeColor="text1"/>
-          <w:lang w:eastAsia="it-IT"/>
-        </w:rPr>
-        <w:t>Progress bar</w:t>
+        <w:spacing w:line="256" w:lineRule="auto"/>
+        <w:rPr>
+          <w:rFonts w:ascii="Aptos" w:eastAsia="Times New Roman" w:hAnsi="Aptos" w:cs="Times New Roman"/>
+          <w:lang w:eastAsia="it-IT"/>
+        </w:rPr>
+      </w:pPr>
+      <w:r>
+        <w:rPr>
+          <w:rFonts w:ascii="Aptos" w:eastAsia="Times New Roman" w:hAnsi="Aptos" w:cs="Times New Roman"/>
+          <w:lang w:eastAsia="it-IT"/>
+        </w:rPr>
+        <w:t>Accordion → Per nascondere o mostrare sezioni (es. premi disponibili).</w:t>
       </w:r>
     </w:p>
-    <w:p>
-      <w:pPr>
-        <w:numPr>
-          <w:ilvl w:val="0"/>
-          <w:numId w:val="16"/>
-        </w:numPr>
-        <w:spacing w:before="100" w:beforeAutospacing="1" w:after="100" w:afterAutospacing="1" w:line="240" w:lineRule="auto"/>
-        <w:contextualSpacing/>
-        <w:rPr>
-          <w:rFonts w:ascii="Aptos" w:eastAsia="Times New Roman" w:hAnsi="Aptos" w:cs="Times New Roman"/>
-          <w:color w:val="000000" w:themeColor="text1"/>
-          <w:lang w:eastAsia="it-IT"/>
-        </w:rPr>
-      </w:pPr>
-      <w:r>
-        <w:rPr>
-          <w:rFonts w:ascii="Aptos" w:eastAsia="Times New Roman" w:hAnsi="Aptos" w:cs="Times New Roman"/>
-          <w:color w:val="000000" w:themeColor="text1"/>
-          <w:lang w:eastAsia="it-IT"/>
-        </w:rPr>
-        <w:t>Forms per login utente</w:t>
-      </w:r>
-    </w:p>
-    <w:p>
-      <w:pPr>
-        <w:numPr>
-          <w:ilvl w:val="0"/>
-          <w:numId w:val="16"/>
-        </w:numPr>
-        <w:spacing w:before="100" w:beforeAutospacing="1" w:after="100" w:afterAutospacing="1" w:line="240" w:lineRule="auto"/>
-        <w:contextualSpacing/>
-        <w:rPr>
-          <w:rFonts w:ascii="Aptos" w:eastAsia="Times New Roman" w:hAnsi="Aptos" w:cs="Times New Roman"/>
-          <w:color w:val="000000" w:themeColor="text1"/>
-          <w:lang w:eastAsia="it-IT"/>
-        </w:rPr>
-      </w:pPr>
-      <w:r>
-        <w:rPr>
-          <w:rFonts w:ascii="Aptos" w:eastAsia="Times New Roman" w:hAnsi="Aptos" w:cs="Times New Roman"/>
-          <w:color w:val="000000" w:themeColor="text1"/>
-          <w:lang w:eastAsia="it-IT"/>
-        </w:rPr>
-        <w:t>Select form per selezionare (tra quelli disponibili) l’utente a cui lanciare la sfida</w:t>
-      </w:r>
-    </w:p>
-    <w:p>
-      <w:pPr>
-        <w:numPr>
-          <w:ilvl w:val="0"/>
-          <w:numId w:val="16"/>
-        </w:numPr>
-        <w:spacing w:before="100" w:beforeAutospacing="1" w:after="100" w:afterAutospacing="1" w:line="240" w:lineRule="auto"/>
-        <w:contextualSpacing/>
-        <w:rPr>
-          <w:rFonts w:ascii="Aptos" w:eastAsia="Times New Roman" w:hAnsi="Aptos" w:cs="Times New Roman"/>
-          <w:color w:val="000000" w:themeColor="text1"/>
-          <w:lang w:eastAsia="it-IT"/>
-        </w:rPr>
-      </w:pPr>
-      <w:r>
-        <w:rPr>
-          <w:rFonts w:ascii="Aptos" w:eastAsia="Times New Roman" w:hAnsi="Aptos" w:cs="Times New Roman"/>
-          <w:color w:val="000000" w:themeColor="text1"/>
-          <w:lang w:eastAsia="it-IT"/>
-        </w:rPr>
-        <w:t>Checkbox per il completamento di attività e sfide</w:t>
-      </w:r>
-    </w:p>
-    <w:p>
-      <w:pPr>
-        <w:numPr>
-          <w:ilvl w:val="0"/>
-          <w:numId w:val="16"/>
-        </w:numPr>
-        <w:spacing w:before="100" w:beforeAutospacing="1" w:after="100" w:afterAutospacing="1" w:line="240" w:lineRule="auto"/>
-        <w:contextualSpacing/>
-        <w:rPr>
-          <w:rFonts w:ascii="Aptos" w:eastAsia="Times New Roman" w:hAnsi="Aptos" w:cs="Times New Roman"/>
-          <w:color w:val="000000" w:themeColor="text1"/>
-          <w:lang w:eastAsia="it-IT"/>
-        </w:rPr>
-      </w:pPr>
-      <w:r>
-        <w:rPr>
-          <w:rFonts w:ascii="Aptos" w:eastAsia="Times New Roman" w:hAnsi="Aptos" w:cs="Times New Roman"/>
-          <w:color w:val="000000" w:themeColor="text1"/>
-          <w:lang w:eastAsia="it-IT"/>
-        </w:rPr>
-        <w:t>Buttons per notifiche sfide da accettare/rifiutare (OPZIONALE)</w:t>
-      </w:r>
-    </w:p>
-    <w:p>
-      <w:pPr>
-        <w:numPr>
-          <w:ilvl w:val="0"/>
-          <w:numId w:val="16"/>
-        </w:numPr>
-        <w:spacing w:before="100" w:beforeAutospacing="1" w:after="100" w:afterAutospacing="1" w:line="240" w:lineRule="auto"/>
-        <w:contextualSpacing/>
-        <w:rPr>
-          <w:rFonts w:ascii="Aptos" w:eastAsia="Times New Roman" w:hAnsi="Aptos" w:cs="Times New Roman"/>
-          <w:color w:val="000000" w:themeColor="text1"/>
-          <w:lang w:eastAsia="it-IT"/>
-        </w:rPr>
-      </w:pPr>
-      <w:r>
-        <w:rPr>
-          <w:rFonts w:ascii="Aptos" w:eastAsia="Times New Roman" w:hAnsi="Aptos" w:cs="Times New Roman"/>
-          <w:color w:val="000000" w:themeColor="text1"/>
-          <w:lang w:eastAsia="it-IT"/>
-        </w:rPr>
-        <w:t>Spinners per il caricamento delle pagine</w:t>
-      </w:r>
-    </w:p>
-    <w:p>
-      <w:pPr>
-        <w:spacing w:before="100" w:beforeAutospacing="1" w:after="100" w:afterAutospacing="1" w:line="240" w:lineRule="auto"/>
-        <w:rPr>
-          <w:rFonts w:eastAsia="Times New Roman" w:cs="Times New Roman"/>
-          <w:lang w:eastAsia="it-IT"/>
-        </w:rPr>
-      </w:pPr>
-    </w:p>
+    <w:p/>
+    <w:p/>
     <w:sectPr>
       <w:pgSz w:w="11906" w:h="16838"/>
       <w:pgMar w:top="1417" w:right="1134" w:bottom="1134" w:left="1134" w:header="708" w:footer="708" w:gutter="0"/>
@@ -1467,6 +1802,566 @@
     </w:lvl>
   </w:abstractNum>
   <w:abstractNum w:abstractNumId="5" w15:restartNumberingAfterBreak="0">
+    <w:nsid w:val="21597AEA"/>
+    <w:multiLevelType w:val="multilevel"/>
+    <w:tmpl w:val="807CB5F2"/>
+    <w:lvl w:ilvl="0">
+      <w:start w:val="1"/>
+      <w:numFmt w:val="bullet"/>
+      <w:lvlText w:val=""/>
+      <w:lvlJc w:val="left"/>
+      <w:pPr>
+        <w:tabs>
+          <w:tab w:val="num" w:pos="720"/>
+        </w:tabs>
+        <w:ind w:left="720" w:hanging="360"/>
+      </w:pPr>
+      <w:rPr>
+        <w:rFonts w:ascii="Symbol" w:hAnsi="Symbol" w:hint="default"/>
+        <w:sz w:val="20"/>
+      </w:rPr>
+    </w:lvl>
+    <w:lvl w:ilvl="1" w:tentative="1">
+      <w:start w:val="1"/>
+      <w:numFmt w:val="bullet"/>
+      <w:lvlText w:val="o"/>
+      <w:lvlJc w:val="left"/>
+      <w:pPr>
+        <w:tabs>
+          <w:tab w:val="num" w:pos="1440"/>
+        </w:tabs>
+        <w:ind w:left="1440" w:hanging="360"/>
+      </w:pPr>
+      <w:rPr>
+        <w:rFonts w:ascii="Courier New" w:hAnsi="Courier New" w:hint="default"/>
+        <w:sz w:val="20"/>
+      </w:rPr>
+    </w:lvl>
+    <w:lvl w:ilvl="2" w:tentative="1">
+      <w:start w:val="1"/>
+      <w:numFmt w:val="bullet"/>
+      <w:lvlText w:val=""/>
+      <w:lvlJc w:val="left"/>
+      <w:pPr>
+        <w:tabs>
+          <w:tab w:val="num" w:pos="2160"/>
+        </w:tabs>
+        <w:ind w:left="2160" w:hanging="360"/>
+      </w:pPr>
+      <w:rPr>
+        <w:rFonts w:ascii="Wingdings" w:hAnsi="Wingdings" w:hint="default"/>
+        <w:sz w:val="20"/>
+      </w:rPr>
+    </w:lvl>
+    <w:lvl w:ilvl="3" w:tentative="1">
+      <w:start w:val="1"/>
+      <w:numFmt w:val="bullet"/>
+      <w:lvlText w:val=""/>
+      <w:lvlJc w:val="left"/>
+      <w:pPr>
+        <w:tabs>
+          <w:tab w:val="num" w:pos="2880"/>
+        </w:tabs>
+        <w:ind w:left="2880" w:hanging="360"/>
+      </w:pPr>
+      <w:rPr>
+        <w:rFonts w:ascii="Wingdings" w:hAnsi="Wingdings" w:hint="default"/>
+        <w:sz w:val="20"/>
+      </w:rPr>
+    </w:lvl>
+    <w:lvl w:ilvl="4" w:tentative="1">
+      <w:start w:val="1"/>
+      <w:numFmt w:val="bullet"/>
+      <w:lvlText w:val=""/>
+      <w:lvlJc w:val="left"/>
+      <w:pPr>
+        <w:tabs>
+          <w:tab w:val="num" w:pos="3600"/>
+        </w:tabs>
+        <w:ind w:left="3600" w:hanging="360"/>
+      </w:pPr>
+      <w:rPr>
+        <w:rFonts w:ascii="Wingdings" w:hAnsi="Wingdings" w:hint="default"/>
+        <w:sz w:val="20"/>
+      </w:rPr>
+    </w:lvl>
+    <w:lvl w:ilvl="5" w:tentative="1">
+      <w:start w:val="1"/>
+      <w:numFmt w:val="bullet"/>
+      <w:lvlText w:val=""/>
+      <w:lvlJc w:val="left"/>
+      <w:pPr>
+        <w:tabs>
+          <w:tab w:val="num" w:pos="4320"/>
+        </w:tabs>
+        <w:ind w:left="4320" w:hanging="360"/>
+      </w:pPr>
+      <w:rPr>
+        <w:rFonts w:ascii="Wingdings" w:hAnsi="Wingdings" w:hint="default"/>
+        <w:sz w:val="20"/>
+      </w:rPr>
+    </w:lvl>
+    <w:lvl w:ilvl="6" w:tentative="1">
+      <w:start w:val="1"/>
+      <w:numFmt w:val="bullet"/>
+      <w:lvlText w:val=""/>
+      <w:lvlJc w:val="left"/>
+      <w:pPr>
+        <w:tabs>
+          <w:tab w:val="num" w:pos="5040"/>
+        </w:tabs>
+        <w:ind w:left="5040" w:hanging="360"/>
+      </w:pPr>
+      <w:rPr>
+        <w:rFonts w:ascii="Wingdings" w:hAnsi="Wingdings" w:hint="default"/>
+        <w:sz w:val="20"/>
+      </w:rPr>
+    </w:lvl>
+    <w:lvl w:ilvl="7" w:tentative="1">
+      <w:start w:val="1"/>
+      <w:numFmt w:val="bullet"/>
+      <w:lvlText w:val=""/>
+      <w:lvlJc w:val="left"/>
+      <w:pPr>
+        <w:tabs>
+          <w:tab w:val="num" w:pos="5760"/>
+        </w:tabs>
+        <w:ind w:left="5760" w:hanging="360"/>
+      </w:pPr>
+      <w:rPr>
+        <w:rFonts w:ascii="Wingdings" w:hAnsi="Wingdings" w:hint="default"/>
+        <w:sz w:val="20"/>
+      </w:rPr>
+    </w:lvl>
+    <w:lvl w:ilvl="8" w:tentative="1">
+      <w:start w:val="1"/>
+      <w:numFmt w:val="bullet"/>
+      <w:lvlText w:val=""/>
+      <w:lvlJc w:val="left"/>
+      <w:pPr>
+        <w:tabs>
+          <w:tab w:val="num" w:pos="6480"/>
+        </w:tabs>
+        <w:ind w:left="6480" w:hanging="360"/>
+      </w:pPr>
+      <w:rPr>
+        <w:rFonts w:ascii="Wingdings" w:hAnsi="Wingdings" w:hint="default"/>
+        <w:sz w:val="20"/>
+      </w:rPr>
+    </w:lvl>
+  </w:abstractNum>
+  <w:abstractNum w:abstractNumId="6" w15:restartNumberingAfterBreak="0">
+    <w:nsid w:val="250F57CE"/>
+    <w:multiLevelType w:val="multilevel"/>
+    <w:tmpl w:val="AAD092E2"/>
+    <w:lvl w:ilvl="0">
+      <w:start w:val="1"/>
+      <w:numFmt w:val="bullet"/>
+      <w:lvlText w:val=""/>
+      <w:lvlJc w:val="left"/>
+      <w:pPr>
+        <w:tabs>
+          <w:tab w:val="num" w:pos="720"/>
+        </w:tabs>
+        <w:ind w:left="720" w:hanging="360"/>
+      </w:pPr>
+      <w:rPr>
+        <w:rFonts w:ascii="Symbol" w:hAnsi="Symbol" w:hint="default"/>
+        <w:sz w:val="20"/>
+      </w:rPr>
+    </w:lvl>
+    <w:lvl w:ilvl="1">
+      <w:start w:val="1"/>
+      <w:numFmt w:val="bullet"/>
+      <w:lvlText w:val="o"/>
+      <w:lvlJc w:val="left"/>
+      <w:pPr>
+        <w:tabs>
+          <w:tab w:val="num" w:pos="1440"/>
+        </w:tabs>
+        <w:ind w:left="1440" w:hanging="360"/>
+      </w:pPr>
+      <w:rPr>
+        <w:rFonts w:ascii="Courier New" w:hAnsi="Courier New" w:hint="default"/>
+        <w:sz w:val="20"/>
+      </w:rPr>
+    </w:lvl>
+    <w:lvl w:ilvl="2" w:tentative="1">
+      <w:start w:val="1"/>
+      <w:numFmt w:val="bullet"/>
+      <w:lvlText w:val=""/>
+      <w:lvlJc w:val="left"/>
+      <w:pPr>
+        <w:tabs>
+          <w:tab w:val="num" w:pos="2160"/>
+        </w:tabs>
+        <w:ind w:left="2160" w:hanging="360"/>
+      </w:pPr>
+      <w:rPr>
+        <w:rFonts w:ascii="Wingdings" w:hAnsi="Wingdings" w:hint="default"/>
+        <w:sz w:val="20"/>
+      </w:rPr>
+    </w:lvl>
+    <w:lvl w:ilvl="3" w:tentative="1">
+      <w:start w:val="1"/>
+      <w:numFmt w:val="bullet"/>
+      <w:lvlText w:val=""/>
+      <w:lvlJc w:val="left"/>
+      <w:pPr>
+        <w:tabs>
+          <w:tab w:val="num" w:pos="2880"/>
+        </w:tabs>
+        <w:ind w:left="2880" w:hanging="360"/>
+      </w:pPr>
+      <w:rPr>
+        <w:rFonts w:ascii="Wingdings" w:hAnsi="Wingdings" w:hint="default"/>
+        <w:sz w:val="20"/>
+      </w:rPr>
+    </w:lvl>
+    <w:lvl w:ilvl="4" w:tentative="1">
+      <w:start w:val="1"/>
+      <w:numFmt w:val="bullet"/>
+      <w:lvlText w:val=""/>
+      <w:lvlJc w:val="left"/>
+      <w:pPr>
+        <w:tabs>
+          <w:tab w:val="num" w:pos="3600"/>
+        </w:tabs>
+        <w:ind w:left="3600" w:hanging="360"/>
+      </w:pPr>
+      <w:rPr>
+        <w:rFonts w:ascii="Wingdings" w:hAnsi="Wingdings" w:hint="default"/>
+        <w:sz w:val="20"/>
+      </w:rPr>
+    </w:lvl>
+    <w:lvl w:ilvl="5" w:tentative="1">
+      <w:start w:val="1"/>
+      <w:numFmt w:val="bullet"/>
+      <w:lvlText w:val=""/>
+      <w:lvlJc w:val="left"/>
+      <w:pPr>
+        <w:tabs>
+          <w:tab w:val="num" w:pos="4320"/>
+        </w:tabs>
+        <w:ind w:left="4320" w:hanging="360"/>
+      </w:pPr>
+      <w:rPr>
+        <w:rFonts w:ascii="Wingdings" w:hAnsi="Wingdings" w:hint="default"/>
+        <w:sz w:val="20"/>
+      </w:rPr>
+    </w:lvl>
+    <w:lvl w:ilvl="6" w:tentative="1">
+      <w:start w:val="1"/>
+      <w:numFmt w:val="bullet"/>
+      <w:lvlText w:val=""/>
+      <w:lvlJc w:val="left"/>
+      <w:pPr>
+        <w:tabs>
+          <w:tab w:val="num" w:pos="5040"/>
+        </w:tabs>
+        <w:ind w:left="5040" w:hanging="360"/>
+      </w:pPr>
+      <w:rPr>
+        <w:rFonts w:ascii="Wingdings" w:hAnsi="Wingdings" w:hint="default"/>
+        <w:sz w:val="20"/>
+      </w:rPr>
+    </w:lvl>
+    <w:lvl w:ilvl="7" w:tentative="1">
+      <w:start w:val="1"/>
+      <w:numFmt w:val="bullet"/>
+      <w:lvlText w:val=""/>
+      <w:lvlJc w:val="left"/>
+      <w:pPr>
+        <w:tabs>
+          <w:tab w:val="num" w:pos="5760"/>
+        </w:tabs>
+        <w:ind w:left="5760" w:hanging="360"/>
+      </w:pPr>
+      <w:rPr>
+        <w:rFonts w:ascii="Wingdings" w:hAnsi="Wingdings" w:hint="default"/>
+        <w:sz w:val="20"/>
+      </w:rPr>
+    </w:lvl>
+    <w:lvl w:ilvl="8" w:tentative="1">
+      <w:start w:val="1"/>
+      <w:numFmt w:val="bullet"/>
+      <w:lvlText w:val=""/>
+      <w:lvlJc w:val="left"/>
+      <w:pPr>
+        <w:tabs>
+          <w:tab w:val="num" w:pos="6480"/>
+        </w:tabs>
+        <w:ind w:left="6480" w:hanging="360"/>
+      </w:pPr>
+      <w:rPr>
+        <w:rFonts w:ascii="Wingdings" w:hAnsi="Wingdings" w:hint="default"/>
+        <w:sz w:val="20"/>
+      </w:rPr>
+    </w:lvl>
+  </w:abstractNum>
+  <w:abstractNum w:abstractNumId="7" w15:restartNumberingAfterBreak="0">
+    <w:nsid w:val="26F00BE6"/>
+    <w:multiLevelType w:val="hybridMultilevel"/>
+    <w:tmpl w:val="49F0C8B0"/>
+    <w:lvl w:ilvl="0" w:tplc="0410000D">
+      <w:start w:val="1"/>
+      <w:numFmt w:val="bullet"/>
+      <w:lvlText w:val=""/>
+      <w:lvlJc w:val="left"/>
+      <w:pPr>
+        <w:ind w:left="720" w:hanging="360"/>
+      </w:pPr>
+      <w:rPr>
+        <w:rFonts w:ascii="Wingdings" w:hAnsi="Wingdings" w:hint="default"/>
+      </w:rPr>
+    </w:lvl>
+    <w:lvl w:ilvl="1" w:tplc="04100003" w:tentative="1">
+      <w:start w:val="1"/>
+      <w:numFmt w:val="bullet"/>
+      <w:lvlText w:val="o"/>
+      <w:lvlJc w:val="left"/>
+      <w:pPr>
+        <w:ind w:left="1440" w:hanging="360"/>
+      </w:pPr>
+      <w:rPr>
+        <w:rFonts w:ascii="Courier New" w:hAnsi="Courier New" w:cs="Courier New" w:hint="default"/>
+      </w:rPr>
+    </w:lvl>
+    <w:lvl w:ilvl="2" w:tplc="04100005" w:tentative="1">
+      <w:start w:val="1"/>
+      <w:numFmt w:val="bullet"/>
+      <w:lvlText w:val=""/>
+      <w:lvlJc w:val="left"/>
+      <w:pPr>
+        <w:ind w:left="2160" w:hanging="360"/>
+      </w:pPr>
+      <w:rPr>
+        <w:rFonts w:ascii="Wingdings" w:hAnsi="Wingdings" w:hint="default"/>
+      </w:rPr>
+    </w:lvl>
+    <w:lvl w:ilvl="3" w:tplc="04100001" w:tentative="1">
+      <w:start w:val="1"/>
+      <w:numFmt w:val="bullet"/>
+      <w:lvlText w:val=""/>
+      <w:lvlJc w:val="left"/>
+      <w:pPr>
+        <w:ind w:left="2880" w:hanging="360"/>
+      </w:pPr>
+      <w:rPr>
+        <w:rFonts w:ascii="Symbol" w:hAnsi="Symbol" w:hint="default"/>
+      </w:rPr>
+    </w:lvl>
+    <w:lvl w:ilvl="4" w:tplc="04100003" w:tentative="1">
+      <w:start w:val="1"/>
+      <w:numFmt w:val="bullet"/>
+      <w:lvlText w:val="o"/>
+      <w:lvlJc w:val="left"/>
+      <w:pPr>
+        <w:ind w:left="3600" w:hanging="360"/>
+      </w:pPr>
+      <w:rPr>
+        <w:rFonts w:ascii="Courier New" w:hAnsi="Courier New" w:cs="Courier New" w:hint="default"/>
+      </w:rPr>
+    </w:lvl>
+    <w:lvl w:ilvl="5" w:tplc="04100005" w:tentative="1">
+      <w:start w:val="1"/>
+      <w:numFmt w:val="bullet"/>
+      <w:lvlText w:val=""/>
+      <w:lvlJc w:val="left"/>
+      <w:pPr>
+        <w:ind w:left="4320" w:hanging="360"/>
+      </w:pPr>
+      <w:rPr>
+        <w:rFonts w:ascii="Wingdings" w:hAnsi="Wingdings" w:hint="default"/>
+      </w:rPr>
+    </w:lvl>
+    <w:lvl w:ilvl="6" w:tplc="04100001" w:tentative="1">
+      <w:start w:val="1"/>
+      <w:numFmt w:val="bullet"/>
+      <w:lvlText w:val=""/>
+      <w:lvlJc w:val="left"/>
+      <w:pPr>
+        <w:ind w:left="5040" w:hanging="360"/>
+      </w:pPr>
+      <w:rPr>
+        <w:rFonts w:ascii="Symbol" w:hAnsi="Symbol" w:hint="default"/>
+      </w:rPr>
+    </w:lvl>
+    <w:lvl w:ilvl="7" w:tplc="04100003" w:tentative="1">
+      <w:start w:val="1"/>
+      <w:numFmt w:val="bullet"/>
+      <w:lvlText w:val="o"/>
+      <w:lvlJc w:val="left"/>
+      <w:pPr>
+        <w:ind w:left="5760" w:hanging="360"/>
+      </w:pPr>
+      <w:rPr>
+        <w:rFonts w:ascii="Courier New" w:hAnsi="Courier New" w:cs="Courier New" w:hint="default"/>
+      </w:rPr>
+    </w:lvl>
+    <w:lvl w:ilvl="8" w:tplc="04100005" w:tentative="1">
+      <w:start w:val="1"/>
+      <w:numFmt w:val="bullet"/>
+      <w:lvlText w:val=""/>
+      <w:lvlJc w:val="left"/>
+      <w:pPr>
+        <w:ind w:left="6480" w:hanging="360"/>
+      </w:pPr>
+      <w:rPr>
+        <w:rFonts w:ascii="Wingdings" w:hAnsi="Wingdings" w:hint="default"/>
+      </w:rPr>
+    </w:lvl>
+  </w:abstractNum>
+  <w:abstractNum w:abstractNumId="8" w15:restartNumberingAfterBreak="0">
+    <w:nsid w:val="31AD7843"/>
+    <w:multiLevelType w:val="multilevel"/>
+    <w:tmpl w:val="C38697FC"/>
+    <w:lvl w:ilvl="0">
+      <w:start w:val="1"/>
+      <w:numFmt w:val="bullet"/>
+      <w:lvlText w:val=""/>
+      <w:lvlJc w:val="left"/>
+      <w:pPr>
+        <w:tabs>
+          <w:tab w:val="num" w:pos="720"/>
+        </w:tabs>
+        <w:ind w:left="720" w:hanging="360"/>
+      </w:pPr>
+      <w:rPr>
+        <w:rFonts w:ascii="Symbol" w:hAnsi="Symbol" w:hint="default"/>
+        <w:sz w:val="20"/>
+      </w:rPr>
+    </w:lvl>
+    <w:lvl w:ilvl="1" w:tentative="1">
+      <w:start w:val="1"/>
+      <w:numFmt w:val="bullet"/>
+      <w:lvlText w:val="o"/>
+      <w:lvlJc w:val="left"/>
+      <w:pPr>
+        <w:tabs>
+          <w:tab w:val="num" w:pos="1440"/>
+        </w:tabs>
+        <w:ind w:left="1440" w:hanging="360"/>
+      </w:pPr>
+      <w:rPr>
+        <w:rFonts w:ascii="Courier New" w:hAnsi="Courier New" w:hint="default"/>
+        <w:sz w:val="20"/>
+      </w:rPr>
+    </w:lvl>
+    <w:lvl w:ilvl="2" w:tentative="1">
+      <w:start w:val="1"/>
+      <w:numFmt w:val="bullet"/>
+      <w:lvlText w:val=""/>
+      <w:lvlJc w:val="left"/>
+      <w:pPr>
+        <w:tabs>
+          <w:tab w:val="num" w:pos="2160"/>
+        </w:tabs>
+        <w:ind w:left="2160" w:hanging="360"/>
+      </w:pPr>
+      <w:rPr>
+        <w:rFonts w:ascii="Wingdings" w:hAnsi="Wingdings" w:hint="default"/>
+        <w:sz w:val="20"/>
+      </w:rPr>
+    </w:lvl>
+    <w:lvl w:ilvl="3" w:tentative="1">
+      <w:start w:val="1"/>
+      <w:numFmt w:val="bullet"/>
+      <w:lvlText w:val=""/>
+      <w:lvlJc w:val="left"/>
+      <w:pPr>
+        <w:tabs>
+          <w:tab w:val="num" w:pos="2880"/>
+        </w:tabs>
+        <w:ind w:left="2880" w:hanging="360"/>
+      </w:pPr>
+      <w:rPr>
+        <w:rFonts w:ascii="Wingdings" w:hAnsi="Wingdings" w:hint="default"/>
+        <w:sz w:val="20"/>
+      </w:rPr>
+    </w:lvl>
+    <w:lvl w:ilvl="4" w:tentative="1">
+      <w:start w:val="1"/>
+      <w:numFmt w:val="bullet"/>
+      <w:lvlText w:val=""/>
+      <w:lvlJc w:val="left"/>
+      <w:pPr>
+        <w:tabs>
+          <w:tab w:val="num" w:pos="3600"/>
+        </w:tabs>
+        <w:ind w:left="3600" w:hanging="360"/>
+      </w:pPr>
+      <w:rPr>
+        <w:rFonts w:ascii="Wingdings" w:hAnsi="Wingdings" w:hint="default"/>
+        <w:sz w:val="20"/>
+      </w:rPr>
+    </w:lvl>
+    <w:lvl w:ilvl="5" w:tentative="1">
+      <w:start w:val="1"/>
+      <w:numFmt w:val="bullet"/>
+      <w:lvlText w:val=""/>
+      <w:lvlJc w:val="left"/>
+      <w:pPr>
+        <w:tabs>
+          <w:tab w:val="num" w:pos="4320"/>
+        </w:tabs>
+        <w:ind w:left="4320" w:hanging="360"/>
+      </w:pPr>
+      <w:rPr>
+        <w:rFonts w:ascii="Wingdings" w:hAnsi="Wingdings" w:hint="default"/>
+        <w:sz w:val="20"/>
+      </w:rPr>
+    </w:lvl>
+    <w:lvl w:ilvl="6" w:tentative="1">
+      <w:start w:val="1"/>
+      <w:numFmt w:val="bullet"/>
+      <w:lvlText w:val=""/>
+      <w:lvlJc w:val="left"/>
+      <w:pPr>
+        <w:tabs>
+          <w:tab w:val="num" w:pos="5040"/>
+        </w:tabs>
+        <w:ind w:left="5040" w:hanging="360"/>
+      </w:pPr>
+      <w:rPr>
+        <w:rFonts w:ascii="Wingdings" w:hAnsi="Wingdings" w:hint="default"/>
+        <w:sz w:val="20"/>
+      </w:rPr>
+    </w:lvl>
+    <w:lvl w:ilvl="7" w:tentative="1">
+      <w:start w:val="1"/>
+      <w:numFmt w:val="bullet"/>
+      <w:lvlText w:val=""/>
+      <w:lvlJc w:val="left"/>
+      <w:pPr>
+        <w:tabs>
+          <w:tab w:val="num" w:pos="5760"/>
+        </w:tabs>
+        <w:ind w:left="5760" w:hanging="360"/>
+      </w:pPr>
+      <w:rPr>
+        <w:rFonts w:ascii="Wingdings" w:hAnsi="Wingdings" w:hint="default"/>
+        <w:sz w:val="20"/>
+      </w:rPr>
+    </w:lvl>
+    <w:lvl w:ilvl="8" w:tentative="1">
+      <w:start w:val="1"/>
+      <w:numFmt w:val="bullet"/>
+      <w:lvlText w:val=""/>
+      <w:lvlJc w:val="left"/>
+      <w:pPr>
+        <w:tabs>
+          <w:tab w:val="num" w:pos="6480"/>
+        </w:tabs>
+        <w:ind w:left="6480" w:hanging="360"/>
+      </w:pPr>
+      <w:rPr>
+        <w:rFonts w:ascii="Wingdings" w:hAnsi="Wingdings" w:hint="default"/>
+        <w:sz w:val="20"/>
+      </w:rPr>
+    </w:lvl>
+  </w:abstractNum>
+  <w:abstractNum w:abstractNumId="9" w15:restartNumberingAfterBreak="0">
     <w:nsid w:val="342D5E11"/>
     <w:multiLevelType w:val="multilevel"/>
     <w:tmpl w:val="DFF8CA62"/>
@@ -1615,7 +2510,7 @@
       </w:rPr>
     </w:lvl>
   </w:abstractNum>
-  <w:abstractNum w:abstractNumId="6" w15:restartNumberingAfterBreak="0">
+  <w:abstractNum w:abstractNumId="10" w15:restartNumberingAfterBreak="0">
     <w:nsid w:val="3F086594"/>
     <w:multiLevelType w:val="multilevel"/>
     <w:tmpl w:val="884E8BC8"/>
@@ -1760,7 +2655,301 @@
       </w:rPr>
     </w:lvl>
   </w:abstractNum>
-  <w:abstractNum w:abstractNumId="7" w15:restartNumberingAfterBreak="0">
+  <w:abstractNum w:abstractNumId="11" w15:restartNumberingAfterBreak="0">
+    <w:nsid w:val="45A624BE"/>
+    <w:multiLevelType w:val="multilevel"/>
+    <w:tmpl w:val="0694D7BE"/>
+    <w:lvl w:ilvl="0">
+      <w:start w:val="1"/>
+      <w:numFmt w:val="bullet"/>
+      <w:lvlText w:val=""/>
+      <w:lvlJc w:val="left"/>
+      <w:pPr>
+        <w:tabs>
+          <w:tab w:val="num" w:pos="720"/>
+        </w:tabs>
+        <w:ind w:left="720" w:hanging="360"/>
+      </w:pPr>
+      <w:rPr>
+        <w:rFonts w:ascii="Symbol" w:hAnsi="Symbol" w:hint="default"/>
+        <w:sz w:val="20"/>
+      </w:rPr>
+    </w:lvl>
+    <w:lvl w:ilvl="1">
+      <w:start w:val="1"/>
+      <w:numFmt w:val="bullet"/>
+      <w:lvlText w:val=""/>
+      <w:lvlJc w:val="left"/>
+      <w:pPr>
+        <w:ind w:left="1440" w:hanging="360"/>
+      </w:pPr>
+      <w:rPr>
+        <w:rFonts w:ascii="Symbol" w:hAnsi="Symbol" w:hint="default"/>
+      </w:rPr>
+    </w:lvl>
+    <w:lvl w:ilvl="2" w:tentative="1">
+      <w:start w:val="1"/>
+      <w:numFmt w:val="bullet"/>
+      <w:lvlText w:val=""/>
+      <w:lvlJc w:val="left"/>
+      <w:pPr>
+        <w:tabs>
+          <w:tab w:val="num" w:pos="2160"/>
+        </w:tabs>
+        <w:ind w:left="2160" w:hanging="360"/>
+      </w:pPr>
+      <w:rPr>
+        <w:rFonts w:ascii="Wingdings" w:hAnsi="Wingdings" w:hint="default"/>
+        <w:sz w:val="20"/>
+      </w:rPr>
+    </w:lvl>
+    <w:lvl w:ilvl="3" w:tentative="1">
+      <w:start w:val="1"/>
+      <w:numFmt w:val="bullet"/>
+      <w:lvlText w:val=""/>
+      <w:lvlJc w:val="left"/>
+      <w:pPr>
+        <w:tabs>
+          <w:tab w:val="num" w:pos="2880"/>
+        </w:tabs>
+        <w:ind w:left="2880" w:hanging="360"/>
+      </w:pPr>
+      <w:rPr>
+        <w:rFonts w:ascii="Wingdings" w:hAnsi="Wingdings" w:hint="default"/>
+        <w:sz w:val="20"/>
+      </w:rPr>
+    </w:lvl>
+    <w:lvl w:ilvl="4" w:tentative="1">
+      <w:start w:val="1"/>
+      <w:numFmt w:val="bullet"/>
+      <w:lvlText w:val=""/>
+      <w:lvlJc w:val="left"/>
+      <w:pPr>
+        <w:tabs>
+          <w:tab w:val="num" w:pos="3600"/>
+        </w:tabs>
+        <w:ind w:left="3600" w:hanging="360"/>
+      </w:pPr>
+      <w:rPr>
+        <w:rFonts w:ascii="Wingdings" w:hAnsi="Wingdings" w:hint="default"/>
+        <w:sz w:val="20"/>
+      </w:rPr>
+    </w:lvl>
+    <w:lvl w:ilvl="5" w:tentative="1">
+      <w:start w:val="1"/>
+      <w:numFmt w:val="bullet"/>
+      <w:lvlText w:val=""/>
+      <w:lvlJc w:val="left"/>
+      <w:pPr>
+        <w:tabs>
+          <w:tab w:val="num" w:pos="4320"/>
+        </w:tabs>
+        <w:ind w:left="4320" w:hanging="360"/>
+      </w:pPr>
+      <w:rPr>
+        <w:rFonts w:ascii="Wingdings" w:hAnsi="Wingdings" w:hint="default"/>
+        <w:sz w:val="20"/>
+      </w:rPr>
+    </w:lvl>
+    <w:lvl w:ilvl="6" w:tentative="1">
+      <w:start w:val="1"/>
+      <w:numFmt w:val="bullet"/>
+      <w:lvlText w:val=""/>
+      <w:lvlJc w:val="left"/>
+      <w:pPr>
+        <w:tabs>
+          <w:tab w:val="num" w:pos="5040"/>
+        </w:tabs>
+        <w:ind w:left="5040" w:hanging="360"/>
+      </w:pPr>
+      <w:rPr>
+        <w:rFonts w:ascii="Wingdings" w:hAnsi="Wingdings" w:hint="default"/>
+        <w:sz w:val="20"/>
+      </w:rPr>
+    </w:lvl>
+    <w:lvl w:ilvl="7" w:tentative="1">
+      <w:start w:val="1"/>
+      <w:numFmt w:val="bullet"/>
+      <w:lvlText w:val=""/>
+      <w:lvlJc w:val="left"/>
+      <w:pPr>
+        <w:tabs>
+          <w:tab w:val="num" w:pos="5760"/>
+        </w:tabs>
+        <w:ind w:left="5760" w:hanging="360"/>
+      </w:pPr>
+      <w:rPr>
+        <w:rFonts w:ascii="Wingdings" w:hAnsi="Wingdings" w:hint="default"/>
+        <w:sz w:val="20"/>
+      </w:rPr>
+    </w:lvl>
+    <w:lvl w:ilvl="8" w:tentative="1">
+      <w:start w:val="1"/>
+      <w:numFmt w:val="bullet"/>
+      <w:lvlText w:val=""/>
+      <w:lvlJc w:val="left"/>
+      <w:pPr>
+        <w:tabs>
+          <w:tab w:val="num" w:pos="6480"/>
+        </w:tabs>
+        <w:ind w:left="6480" w:hanging="360"/>
+      </w:pPr>
+      <w:rPr>
+        <w:rFonts w:ascii="Wingdings" w:hAnsi="Wingdings" w:hint="default"/>
+        <w:sz w:val="20"/>
+      </w:rPr>
+    </w:lvl>
+  </w:abstractNum>
+  <w:abstractNum w:abstractNumId="12" w15:restartNumberingAfterBreak="0">
+    <w:nsid w:val="48EB283B"/>
+    <w:multiLevelType w:val="multilevel"/>
+    <w:tmpl w:val="22A6B0B4"/>
+    <w:lvl w:ilvl="0">
+      <w:start w:val="1"/>
+      <w:numFmt w:val="bullet"/>
+      <w:lvlText w:val=""/>
+      <w:lvlJc w:val="left"/>
+      <w:pPr>
+        <w:tabs>
+          <w:tab w:val="num" w:pos="720"/>
+        </w:tabs>
+        <w:ind w:left="720" w:hanging="360"/>
+      </w:pPr>
+      <w:rPr>
+        <w:rFonts w:ascii="Symbol" w:hAnsi="Symbol" w:hint="default"/>
+        <w:sz w:val="20"/>
+      </w:rPr>
+    </w:lvl>
+    <w:lvl w:ilvl="1" w:tentative="1">
+      <w:start w:val="1"/>
+      <w:numFmt w:val="bullet"/>
+      <w:lvlText w:val="o"/>
+      <w:lvlJc w:val="left"/>
+      <w:pPr>
+        <w:tabs>
+          <w:tab w:val="num" w:pos="1440"/>
+        </w:tabs>
+        <w:ind w:left="1440" w:hanging="360"/>
+      </w:pPr>
+      <w:rPr>
+        <w:rFonts w:ascii="Courier New" w:hAnsi="Courier New" w:hint="default"/>
+        <w:sz w:val="20"/>
+      </w:rPr>
+    </w:lvl>
+    <w:lvl w:ilvl="2" w:tentative="1">
+      <w:start w:val="1"/>
+      <w:numFmt w:val="bullet"/>
+      <w:lvlText w:val=""/>
+      <w:lvlJc w:val="left"/>
+      <w:pPr>
+        <w:tabs>
+          <w:tab w:val="num" w:pos="2160"/>
+        </w:tabs>
+        <w:ind w:left="2160" w:hanging="360"/>
+      </w:pPr>
+      <w:rPr>
+        <w:rFonts w:ascii="Wingdings" w:hAnsi="Wingdings" w:hint="default"/>
+        <w:sz w:val="20"/>
+      </w:rPr>
+    </w:lvl>
+    <w:lvl w:ilvl="3" w:tentative="1">
+      <w:start w:val="1"/>
+      <w:numFmt w:val="bullet"/>
+      <w:lvlText w:val=""/>
+      <w:lvlJc w:val="left"/>
+      <w:pPr>
+        <w:tabs>
+          <w:tab w:val="num" w:pos="2880"/>
+        </w:tabs>
+        <w:ind w:left="2880" w:hanging="360"/>
+      </w:pPr>
+      <w:rPr>
+        <w:rFonts w:ascii="Wingdings" w:hAnsi="Wingdings" w:hint="default"/>
+        <w:sz w:val="20"/>
+      </w:rPr>
+    </w:lvl>
+    <w:lvl w:ilvl="4" w:tentative="1">
+      <w:start w:val="1"/>
+      <w:numFmt w:val="bullet"/>
+      <w:lvlText w:val=""/>
+      <w:lvlJc w:val="left"/>
+      <w:pPr>
+        <w:tabs>
+          <w:tab w:val="num" w:pos="3600"/>
+        </w:tabs>
+        <w:ind w:left="3600" w:hanging="360"/>
+      </w:pPr>
+      <w:rPr>
+        <w:rFonts w:ascii="Wingdings" w:hAnsi="Wingdings" w:hint="default"/>
+        <w:sz w:val="20"/>
+      </w:rPr>
+    </w:lvl>
+    <w:lvl w:ilvl="5" w:tentative="1">
+      <w:start w:val="1"/>
+      <w:numFmt w:val="bullet"/>
+      <w:lvlText w:val=""/>
+      <w:lvlJc w:val="left"/>
+      <w:pPr>
+        <w:tabs>
+          <w:tab w:val="num" w:pos="4320"/>
+        </w:tabs>
+        <w:ind w:left="4320" w:hanging="360"/>
+      </w:pPr>
+      <w:rPr>
+        <w:rFonts w:ascii="Wingdings" w:hAnsi="Wingdings" w:hint="default"/>
+        <w:sz w:val="20"/>
+      </w:rPr>
+    </w:lvl>
+    <w:lvl w:ilvl="6" w:tentative="1">
+      <w:start w:val="1"/>
+      <w:numFmt w:val="bullet"/>
+      <w:lvlText w:val=""/>
+      <w:lvlJc w:val="left"/>
+      <w:pPr>
+        <w:tabs>
+          <w:tab w:val="num" w:pos="5040"/>
+        </w:tabs>
+        <w:ind w:left="5040" w:hanging="360"/>
+      </w:pPr>
+      <w:rPr>
+        <w:rFonts w:ascii="Wingdings" w:hAnsi="Wingdings" w:hint="default"/>
+        <w:sz w:val="20"/>
+      </w:rPr>
+    </w:lvl>
+    <w:lvl w:ilvl="7" w:tentative="1">
+      <w:start w:val="1"/>
+      <w:numFmt w:val="bullet"/>
+      <w:lvlText w:val=""/>
+      <w:lvlJc w:val="left"/>
+      <w:pPr>
+        <w:tabs>
+          <w:tab w:val="num" w:pos="5760"/>
+        </w:tabs>
+        <w:ind w:left="5760" w:hanging="360"/>
+      </w:pPr>
+      <w:rPr>
+        <w:rFonts w:ascii="Wingdings" w:hAnsi="Wingdings" w:hint="default"/>
+        <w:sz w:val="20"/>
+      </w:rPr>
+    </w:lvl>
+    <w:lvl w:ilvl="8" w:tentative="1">
+      <w:start w:val="1"/>
+      <w:numFmt w:val="bullet"/>
+      <w:lvlText w:val=""/>
+      <w:lvlJc w:val="left"/>
+      <w:pPr>
+        <w:tabs>
+          <w:tab w:val="num" w:pos="6480"/>
+        </w:tabs>
+        <w:ind w:left="6480" w:hanging="360"/>
+      </w:pPr>
+      <w:rPr>
+        <w:rFonts w:ascii="Wingdings" w:hAnsi="Wingdings" w:hint="default"/>
+        <w:sz w:val="20"/>
+      </w:rPr>
+    </w:lvl>
+  </w:abstractNum>
+  <w:abstractNum w:abstractNumId="13" w15:restartNumberingAfterBreak="0">
     <w:nsid w:val="49074823"/>
     <w:multiLevelType w:val="multilevel"/>
     <w:tmpl w:val="6D3E65B6"/>
@@ -1909,7 +3098,7 @@
       </w:rPr>
     </w:lvl>
   </w:abstractNum>
-  <w:abstractNum w:abstractNumId="8" w15:restartNumberingAfterBreak="0">
+  <w:abstractNum w:abstractNumId="14" w15:restartNumberingAfterBreak="0">
     <w:nsid w:val="62023D5C"/>
     <w:multiLevelType w:val="multilevel"/>
     <w:tmpl w:val="6896B2DE"/>
@@ -2058,7 +3247,156 @@
       </w:rPr>
     </w:lvl>
   </w:abstractNum>
-  <w:abstractNum w:abstractNumId="9" w15:restartNumberingAfterBreak="0">
+  <w:abstractNum w:abstractNumId="15" w15:restartNumberingAfterBreak="0">
+    <w:nsid w:val="64BA702A"/>
+    <w:multiLevelType w:val="multilevel"/>
+    <w:tmpl w:val="924866A0"/>
+    <w:lvl w:ilvl="0">
+      <w:start w:val="1"/>
+      <w:numFmt w:val="bullet"/>
+      <w:lvlText w:val=""/>
+      <w:lvlJc w:val="left"/>
+      <w:pPr>
+        <w:tabs>
+          <w:tab w:val="num" w:pos="720"/>
+        </w:tabs>
+        <w:ind w:left="720" w:hanging="360"/>
+      </w:pPr>
+      <w:rPr>
+        <w:rFonts w:ascii="Symbol" w:hAnsi="Symbol" w:hint="default"/>
+        <w:sz w:val="20"/>
+      </w:rPr>
+    </w:lvl>
+    <w:lvl w:ilvl="1" w:tentative="1">
+      <w:start w:val="1"/>
+      <w:numFmt w:val="bullet"/>
+      <w:lvlText w:val="o"/>
+      <w:lvlJc w:val="left"/>
+      <w:pPr>
+        <w:tabs>
+          <w:tab w:val="num" w:pos="1440"/>
+        </w:tabs>
+        <w:ind w:left="1440" w:hanging="360"/>
+      </w:pPr>
+      <w:rPr>
+        <w:rFonts w:ascii="Courier New" w:hAnsi="Courier New" w:hint="default"/>
+        <w:sz w:val="20"/>
+      </w:rPr>
+    </w:lvl>
+    <w:lvl w:ilvl="2" w:tentative="1">
+      <w:start w:val="1"/>
+      <w:numFmt w:val="bullet"/>
+      <w:lvlText w:val=""/>
+      <w:lvlJc w:val="left"/>
+      <w:pPr>
+        <w:tabs>
+          <w:tab w:val="num" w:pos="2160"/>
+        </w:tabs>
+        <w:ind w:left="2160" w:hanging="360"/>
+      </w:pPr>
+      <w:rPr>
+        <w:rFonts w:ascii="Wingdings" w:hAnsi="Wingdings" w:hint="default"/>
+        <w:sz w:val="20"/>
+      </w:rPr>
+    </w:lvl>
+    <w:lvl w:ilvl="3" w:tentative="1">
+      <w:start w:val="1"/>
+      <w:numFmt w:val="bullet"/>
+      <w:lvlText w:val=""/>
+      <w:lvlJc w:val="left"/>
+      <w:pPr>
+        <w:tabs>
+          <w:tab w:val="num" w:pos="2880"/>
+        </w:tabs>
+        <w:ind w:left="2880" w:hanging="360"/>
+      </w:pPr>
+      <w:rPr>
+        <w:rFonts w:ascii="Wingdings" w:hAnsi="Wingdings" w:hint="default"/>
+        <w:sz w:val="20"/>
+      </w:rPr>
+    </w:lvl>
+    <w:lvl w:ilvl="4" w:tentative="1">
+      <w:start w:val="1"/>
+      <w:numFmt w:val="bullet"/>
+      <w:lvlText w:val=""/>
+      <w:lvlJc w:val="left"/>
+      <w:pPr>
+        <w:tabs>
+          <w:tab w:val="num" w:pos="3600"/>
+        </w:tabs>
+        <w:ind w:left="3600" w:hanging="360"/>
+      </w:pPr>
+      <w:rPr>
+        <w:rFonts w:ascii="Wingdings" w:hAnsi="Wingdings" w:hint="default"/>
+        <w:sz w:val="20"/>
+      </w:rPr>
+    </w:lvl>
+    <w:lvl w:ilvl="5" w:tentative="1">
+      <w:start w:val="1"/>
+      <w:numFmt w:val="bullet"/>
+      <w:lvlText w:val=""/>
+      <w:lvlJc w:val="left"/>
+      <w:pPr>
+        <w:tabs>
+          <w:tab w:val="num" w:pos="4320"/>
+        </w:tabs>
+        <w:ind w:left="4320" w:hanging="360"/>
+      </w:pPr>
+      <w:rPr>
+        <w:rFonts w:ascii="Wingdings" w:hAnsi="Wingdings" w:hint="default"/>
+        <w:sz w:val="20"/>
+      </w:rPr>
+    </w:lvl>
+    <w:lvl w:ilvl="6" w:tentative="1">
+      <w:start w:val="1"/>
+      <w:numFmt w:val="bullet"/>
+      <w:lvlText w:val=""/>
+      <w:lvlJc w:val="left"/>
+      <w:pPr>
+        <w:tabs>
+          <w:tab w:val="num" w:pos="5040"/>
+        </w:tabs>
+        <w:ind w:left="5040" w:hanging="360"/>
+      </w:pPr>
+      <w:rPr>
+        <w:rFonts w:ascii="Wingdings" w:hAnsi="Wingdings" w:hint="default"/>
+        <w:sz w:val="20"/>
+      </w:rPr>
+    </w:lvl>
+    <w:lvl w:ilvl="7" w:tentative="1">
+      <w:start w:val="1"/>
+      <w:numFmt w:val="bullet"/>
+      <w:lvlText w:val=""/>
+      <w:lvlJc w:val="left"/>
+      <w:pPr>
+        <w:tabs>
+          <w:tab w:val="num" w:pos="5760"/>
+        </w:tabs>
+        <w:ind w:left="5760" w:hanging="360"/>
+      </w:pPr>
+      <w:rPr>
+        <w:rFonts w:ascii="Wingdings" w:hAnsi="Wingdings" w:hint="default"/>
+        <w:sz w:val="20"/>
+      </w:rPr>
+    </w:lvl>
+    <w:lvl w:ilvl="8" w:tentative="1">
+      <w:start w:val="1"/>
+      <w:numFmt w:val="bullet"/>
+      <w:lvlText w:val=""/>
+      <w:lvlJc w:val="left"/>
+      <w:pPr>
+        <w:tabs>
+          <w:tab w:val="num" w:pos="6480"/>
+        </w:tabs>
+        <w:ind w:left="6480" w:hanging="360"/>
+      </w:pPr>
+      <w:rPr>
+        <w:rFonts w:ascii="Wingdings" w:hAnsi="Wingdings" w:hint="default"/>
+        <w:sz w:val="20"/>
+      </w:rPr>
+    </w:lvl>
+  </w:abstractNum>
+  <w:abstractNum w:abstractNumId="16" w15:restartNumberingAfterBreak="0">
     <w:nsid w:val="68A41F8F"/>
     <w:multiLevelType w:val="hybridMultilevel"/>
     <w:tmpl w:val="63D8E10A"/>
@@ -2147,7 +3485,7 @@
       </w:pPr>
     </w:lvl>
   </w:abstractNum>
-  <w:abstractNum w:abstractNumId="10" w15:restartNumberingAfterBreak="0">
+  <w:abstractNum w:abstractNumId="17" w15:restartNumberingAfterBreak="0">
     <w:nsid w:val="71187592"/>
     <w:multiLevelType w:val="multilevel"/>
     <w:tmpl w:val="4BAA3212"/>
@@ -2296,7 +3634,7 @@
       </w:rPr>
     </w:lvl>
   </w:abstractNum>
-  <w:abstractNum w:abstractNumId="11" w15:restartNumberingAfterBreak="0">
+  <w:abstractNum w:abstractNumId="18" w15:restartNumberingAfterBreak="0">
     <w:nsid w:val="78EB2FBB"/>
     <w:multiLevelType w:val="multilevel"/>
     <w:tmpl w:val="96F0E368"/>
@@ -2326,6 +3664,155 @@
       </w:pPr>
       <w:rPr>
         <w:rFonts w:ascii="Symbol" w:hAnsi="Symbol" w:hint="default"/>
+      </w:rPr>
+    </w:lvl>
+    <w:lvl w:ilvl="2" w:tentative="1">
+      <w:start w:val="1"/>
+      <w:numFmt w:val="bullet"/>
+      <w:lvlText w:val=""/>
+      <w:lvlJc w:val="left"/>
+      <w:pPr>
+        <w:tabs>
+          <w:tab w:val="num" w:pos="2160"/>
+        </w:tabs>
+        <w:ind w:left="2160" w:hanging="360"/>
+      </w:pPr>
+      <w:rPr>
+        <w:rFonts w:ascii="Wingdings" w:hAnsi="Wingdings" w:hint="default"/>
+        <w:sz w:val="20"/>
+      </w:rPr>
+    </w:lvl>
+    <w:lvl w:ilvl="3" w:tentative="1">
+      <w:start w:val="1"/>
+      <w:numFmt w:val="bullet"/>
+      <w:lvlText w:val=""/>
+      <w:lvlJc w:val="left"/>
+      <w:pPr>
+        <w:tabs>
+          <w:tab w:val="num" w:pos="2880"/>
+        </w:tabs>
+        <w:ind w:left="2880" w:hanging="360"/>
+      </w:pPr>
+      <w:rPr>
+        <w:rFonts w:ascii="Wingdings" w:hAnsi="Wingdings" w:hint="default"/>
+        <w:sz w:val="20"/>
+      </w:rPr>
+    </w:lvl>
+    <w:lvl w:ilvl="4" w:tentative="1">
+      <w:start w:val="1"/>
+      <w:numFmt w:val="bullet"/>
+      <w:lvlText w:val=""/>
+      <w:lvlJc w:val="left"/>
+      <w:pPr>
+        <w:tabs>
+          <w:tab w:val="num" w:pos="3600"/>
+        </w:tabs>
+        <w:ind w:left="3600" w:hanging="360"/>
+      </w:pPr>
+      <w:rPr>
+        <w:rFonts w:ascii="Wingdings" w:hAnsi="Wingdings" w:hint="default"/>
+        <w:sz w:val="20"/>
+      </w:rPr>
+    </w:lvl>
+    <w:lvl w:ilvl="5" w:tentative="1">
+      <w:start w:val="1"/>
+      <w:numFmt w:val="bullet"/>
+      <w:lvlText w:val=""/>
+      <w:lvlJc w:val="left"/>
+      <w:pPr>
+        <w:tabs>
+          <w:tab w:val="num" w:pos="4320"/>
+        </w:tabs>
+        <w:ind w:left="4320" w:hanging="360"/>
+      </w:pPr>
+      <w:rPr>
+        <w:rFonts w:ascii="Wingdings" w:hAnsi="Wingdings" w:hint="default"/>
+        <w:sz w:val="20"/>
+      </w:rPr>
+    </w:lvl>
+    <w:lvl w:ilvl="6" w:tentative="1">
+      <w:start w:val="1"/>
+      <w:numFmt w:val="bullet"/>
+      <w:lvlText w:val=""/>
+      <w:lvlJc w:val="left"/>
+      <w:pPr>
+        <w:tabs>
+          <w:tab w:val="num" w:pos="5040"/>
+        </w:tabs>
+        <w:ind w:left="5040" w:hanging="360"/>
+      </w:pPr>
+      <w:rPr>
+        <w:rFonts w:ascii="Wingdings" w:hAnsi="Wingdings" w:hint="default"/>
+        <w:sz w:val="20"/>
+      </w:rPr>
+    </w:lvl>
+    <w:lvl w:ilvl="7" w:tentative="1">
+      <w:start w:val="1"/>
+      <w:numFmt w:val="bullet"/>
+      <w:lvlText w:val=""/>
+      <w:lvlJc w:val="left"/>
+      <w:pPr>
+        <w:tabs>
+          <w:tab w:val="num" w:pos="5760"/>
+        </w:tabs>
+        <w:ind w:left="5760" w:hanging="360"/>
+      </w:pPr>
+      <w:rPr>
+        <w:rFonts w:ascii="Wingdings" w:hAnsi="Wingdings" w:hint="default"/>
+        <w:sz w:val="20"/>
+      </w:rPr>
+    </w:lvl>
+    <w:lvl w:ilvl="8" w:tentative="1">
+      <w:start w:val="1"/>
+      <w:numFmt w:val="bullet"/>
+      <w:lvlText w:val=""/>
+      <w:lvlJc w:val="left"/>
+      <w:pPr>
+        <w:tabs>
+          <w:tab w:val="num" w:pos="6480"/>
+        </w:tabs>
+        <w:ind w:left="6480" w:hanging="360"/>
+      </w:pPr>
+      <w:rPr>
+        <w:rFonts w:ascii="Wingdings" w:hAnsi="Wingdings" w:hint="default"/>
+        <w:sz w:val="20"/>
+      </w:rPr>
+    </w:lvl>
+  </w:abstractNum>
+  <w:abstractNum w:abstractNumId="19" w15:restartNumberingAfterBreak="0">
+    <w:nsid w:val="7B053AA2"/>
+    <w:multiLevelType w:val="multilevel"/>
+    <w:tmpl w:val="23E45FBA"/>
+    <w:lvl w:ilvl="0">
+      <w:start w:val="1"/>
+      <w:numFmt w:val="bullet"/>
+      <w:lvlText w:val=""/>
+      <w:lvlJc w:val="left"/>
+      <w:pPr>
+        <w:tabs>
+          <w:tab w:val="num" w:pos="720"/>
+        </w:tabs>
+        <w:ind w:left="720" w:hanging="360"/>
+      </w:pPr>
+      <w:rPr>
+        <w:rFonts w:ascii="Symbol" w:hAnsi="Symbol" w:hint="default"/>
+        <w:sz w:val="20"/>
+      </w:rPr>
+    </w:lvl>
+    <w:lvl w:ilvl="1" w:tentative="1">
+      <w:start w:val="1"/>
+      <w:numFmt w:val="bullet"/>
+      <w:lvlText w:val="o"/>
+      <w:lvlJc w:val="left"/>
+      <w:pPr>
+        <w:tabs>
+          <w:tab w:val="num" w:pos="1440"/>
+        </w:tabs>
+        <w:ind w:left="1440" w:hanging="360"/>
+      </w:pPr>
+      <w:rPr>
+        <w:rFonts w:ascii="Courier New" w:hAnsi="Courier New" w:hint="default"/>
+        <w:sz w:val="20"/>
       </w:rPr>
     </w:lvl>
     <w:lvl w:ilvl="2" w:tentative="1">
@@ -2445,13 +3932,13 @@
     <w:abstractNumId w:val="2"/>
   </w:num>
   <w:num w:numId="2" w16cid:durableId="458844466">
-    <w:abstractNumId w:val="10"/>
+    <w:abstractNumId w:val="17"/>
   </w:num>
   <w:num w:numId="3" w16cid:durableId="1264189684">
-    <w:abstractNumId w:val="8"/>
+    <w:abstractNumId w:val="14"/>
   </w:num>
   <w:num w:numId="4" w16cid:durableId="1291742061">
-    <w:abstractNumId w:val="5"/>
+    <w:abstractNumId w:val="9"/>
   </w:num>
   <w:num w:numId="5" w16cid:durableId="908004526">
     <w:abstractNumId w:val="1"/>
@@ -2460,79 +3947,58 @@
     <w:abstractNumId w:val="4"/>
   </w:num>
   <w:num w:numId="7" w16cid:durableId="915749743">
-    <w:abstractNumId w:val="7"/>
+    <w:abstractNumId w:val="13"/>
   </w:num>
   <w:num w:numId="8" w16cid:durableId="1045326028">
-    <w:abstractNumId w:val="9"/>
+    <w:abstractNumId w:val="16"/>
   </w:num>
   <w:num w:numId="9" w16cid:durableId="1521091220">
     <w:abstractNumId w:val="0"/>
   </w:num>
   <w:num w:numId="10" w16cid:durableId="1304195097">
-    <w:abstractNumId w:val="11"/>
+    <w:abstractNumId w:val="18"/>
   </w:num>
   <w:num w:numId="11" w16cid:durableId="809975389">
-    <w:abstractNumId w:val="6"/>
+    <w:abstractNumId w:val="10"/>
   </w:num>
   <w:num w:numId="12" w16cid:durableId="165898344">
     <w:abstractNumId w:val="2"/>
-    <w:lvlOverride w:ilvl="0"/>
-    <w:lvlOverride w:ilvl="1"/>
-    <w:lvlOverride w:ilvl="2"/>
-    <w:lvlOverride w:ilvl="3"/>
-    <w:lvlOverride w:ilvl="4"/>
-    <w:lvlOverride w:ilvl="5"/>
-    <w:lvlOverride w:ilvl="6"/>
-    <w:lvlOverride w:ilvl="7"/>
-    <w:lvlOverride w:ilvl="8"/>
   </w:num>
   <w:num w:numId="13" w16cid:durableId="1063529096">
     <w:abstractNumId w:val="4"/>
-    <w:lvlOverride w:ilvl="0"/>
-    <w:lvlOverride w:ilvl="1"/>
-    <w:lvlOverride w:ilvl="2"/>
-    <w:lvlOverride w:ilvl="3"/>
-    <w:lvlOverride w:ilvl="4"/>
-    <w:lvlOverride w:ilvl="5"/>
-    <w:lvlOverride w:ilvl="6"/>
-    <w:lvlOverride w:ilvl="7"/>
-    <w:lvlOverride w:ilvl="8"/>
   </w:num>
   <w:num w:numId="14" w16cid:durableId="1035037105">
-    <w:abstractNumId w:val="11"/>
-    <w:lvlOverride w:ilvl="0"/>
-    <w:lvlOverride w:ilvl="1"/>
-    <w:lvlOverride w:ilvl="2"/>
-    <w:lvlOverride w:ilvl="3"/>
-    <w:lvlOverride w:ilvl="4"/>
-    <w:lvlOverride w:ilvl="5"/>
-    <w:lvlOverride w:ilvl="6"/>
-    <w:lvlOverride w:ilvl="7"/>
-    <w:lvlOverride w:ilvl="8"/>
+    <w:abstractNumId w:val="18"/>
   </w:num>
   <w:num w:numId="15" w16cid:durableId="805047839">
-    <w:abstractNumId w:val="6"/>
-    <w:lvlOverride w:ilvl="0"/>
-    <w:lvlOverride w:ilvl="1"/>
-    <w:lvlOverride w:ilvl="2"/>
-    <w:lvlOverride w:ilvl="3"/>
-    <w:lvlOverride w:ilvl="4"/>
-    <w:lvlOverride w:ilvl="5"/>
-    <w:lvlOverride w:ilvl="6"/>
-    <w:lvlOverride w:ilvl="7"/>
-    <w:lvlOverride w:ilvl="8"/>
+    <w:abstractNumId w:val="10"/>
   </w:num>
   <w:num w:numId="16" w16cid:durableId="203753898">
     <w:abstractNumId w:val="3"/>
-    <w:lvlOverride w:ilvl="0"/>
-    <w:lvlOverride w:ilvl="1"/>
-    <w:lvlOverride w:ilvl="2"/>
-    <w:lvlOverride w:ilvl="3"/>
-    <w:lvlOverride w:ilvl="4"/>
-    <w:lvlOverride w:ilvl="5"/>
-    <w:lvlOverride w:ilvl="6"/>
-    <w:lvlOverride w:ilvl="7"/>
-    <w:lvlOverride w:ilvl="8"/>
+  </w:num>
+  <w:num w:numId="17" w16cid:durableId="1168670090">
+    <w:abstractNumId w:val="5"/>
+  </w:num>
+  <w:num w:numId="18" w16cid:durableId="1026179550">
+    <w:abstractNumId w:val="15"/>
+  </w:num>
+  <w:num w:numId="19" w16cid:durableId="174999242">
+    <w:abstractNumId w:val="8"/>
+  </w:num>
+  <w:num w:numId="20" w16cid:durableId="1839076603">
+    <w:abstractNumId w:val="19"/>
+  </w:num>
+  <w:num w:numId="21" w16cid:durableId="637105908">
+    <w:abstractNumId w:val="6"/>
+  </w:num>
+  <w:num w:numId="22" w16cid:durableId="841314817">
+    <w:abstractNumId w:val="12"/>
+  </w:num>
+  <w:num w:numId="23" w16cid:durableId="1429153423">
+    <w:abstractNumId w:val="11"/>
+  </w:num>
+  <w:num w:numId="24" w16cid:durableId="7368872">
+    <w:abstractNumId w:val="7"/>
   </w:num>
 </w:numbering>
 </file>
@@ -2937,7 +4403,7 @@
   <w:style w:type="paragraph" w:default="1" w:styleId="Normale">
     <w:name w:val="Normal"/>
     <w:qFormat/>
-    <w:rsid w:val="008E00A0"/>
+    <w:rsid w:val="00ED65F4"/>
   </w:style>
   <w:style w:type="paragraph" w:styleId="Titolo1">
     <w:name w:val="heading 1"/>

</xml_diff>